<commit_message>
feat(m6): first embedder fine-tune results + trainer progress reporting
- scripts/finetune_embedder.py: line-buffered stdout, ProgressCallback (step /
  loss / lr / pairs-per-s / ETA every N steps + JSONL events), one-line dev
  probe summaries, tqdm + raw metric dict off
- run nomic-mtg-v1 (experiment 19): held-out-tag probe ndcg@10 0.114->0.242,
  recall@100 0.164->0.327; NanoBEIR mean 0.514->0.495
- grid with tuned embedder (rows 20-23): raw/pass-through improve, hypothetical-
  text modes regress; best cell still base+hyde; pass-through != hypothesis test
- journal §5b/5c + paper §5.4 (Tables 3-4) written; throughput corrected (~49 pairs/s)

Co-Authored-By: Claude Fable 5.1 <noreply@anthropic.com>
</commit_message>
<xml_diff>
--- a/docs/thesis/paper-draft.docx
+++ b/docs/thesis/paper-draft.docx
@@ -26,7 +26,7 @@
         <w:t xml:space="preserve">Fall 2026 · CSCI 5953 · CSUSB</w:t>
       </w:r>
     </w:p>
-    <w:bookmarkStart w:id="52" w:name="paper-draft-working-document"/>
+    <w:bookmarkStart w:id="53" w:name="paper-draft-working-document"/>
     <w:p>
       <w:pPr>
         <w:pStyle w:val="Heading1"/>
@@ -1901,7 +1901,7 @@
     </w:p>
     <w:bookmarkEnd w:id="30"/>
     <w:bookmarkEnd w:id="31"/>
-    <w:bookmarkStart w:id="35" w:name="results"/>
+    <w:bookmarkStart w:id="36" w:name="results"/>
     <w:p>
       <w:pPr>
         <w:pStyle w:val="Heading2"/>
@@ -3722,16 +3722,880 @@
         <w:t xml:space="preserve">— name a canonical keyword explicitly; with the keywords filter off they scored zero, which is the user-explicit case selective strictness is meant to keep strict (Section 6.2). A rule that applies the keywords filter only when the rewriter judged the query purely structural (filters present, no hypothetical text) is the cheapest candidate and is queued as an ablation row.</w:t>
       </w:r>
     </w:p>
-    <w:p>
-      <w:pPr>
-        <w:pStyle w:val="BodyText"/>
-      </w:pPr>
-      <w:r>
-        <w:rPr>
-          <w:i/>
-          <w:iCs/>
-        </w:rPr>
-        <w:t xml:space="preserve">[TODO — tuned-embedder rows of the grid after M6 training; Scryfall comparator with result-parity and query-complexity measures; direct-tag-lookup ablation.]</w:t>
+    <w:bookmarkEnd w:id="34"/>
+    <w:bookmarkStart w:id="35" w:name="embedder-fine-tuning-on-oracle-tags"/>
+    <w:p>
+      <w:pPr>
+        <w:pStyle w:val="Heading3"/>
+      </w:pPr>
+      <w:r>
+        <w:t xml:space="preserve">5.4 Embedder fine-tuning on oracle tags</w:t>
+      </w:r>
+    </w:p>
+    <w:p>
+      <w:pPr>
+        <w:pStyle w:val="FirstParagraph"/>
+      </w:pPr>
+      <w:r>
+        <w:rPr>
+          <w:i/>
+          <w:iCs/>
+        </w:rPr>
+        <w:t xml:space="preserve">[DRAFTED — REVIEW. First run</w:t>
+      </w:r>
+      <w:r>
+        <w:rPr>
+          <w:i/>
+          <w:iCs/>
+        </w:rPr>
+        <w:t xml:space="preserve"> </w:t>
+      </w:r>
+      <w:r>
+        <w:rPr>
+          <w:rStyle w:val="VerbatimChar"/>
+          <w:i/>
+          <w:iCs/>
+        </w:rPr>
+        <w:t xml:space="preserve">nomic-mtg-v1</w:t>
+      </w:r>
+      <w:r>
+        <w:rPr>
+          <w:i/>
+          <w:iCs/>
+        </w:rPr>
+        <w:t xml:space="preserve">, 2026-09-18,</w:t>
+      </w:r>
+      <w:r>
+        <w:rPr>
+          <w:i/>
+          <w:iCs/>
+        </w:rPr>
+        <w:t xml:space="preserve"> </w:t>
+      </w:r>
+      <w:r>
+        <w:rPr>
+          <w:rStyle w:val="VerbatimChar"/>
+          <w:i/>
+          <w:iCs/>
+        </w:rPr>
+        <w:t xml:space="preserve">experiment_runs</w:t>
+      </w:r>
+      <w:r>
+        <w:rPr>
+          <w:i/>
+          <w:iCs/>
+        </w:rPr>
+        <w:t xml:space="preserve"> </w:t>
+      </w:r>
+      <w:r>
+        <w:rPr>
+          <w:i/>
+          <w:iCs/>
+        </w:rPr>
+        <w:t xml:space="preserve">id 19. Recipe per Section 6.3; run details in the 2026-09-18 journal §5b.]</w:t>
+      </w:r>
+    </w:p>
+    <w:p>
+      <w:pPr>
+        <w:pStyle w:val="BodyText"/>
+      </w:pPr>
+      <w:r>
+        <w:t xml:space="preserve">The base encoder was fine-tuned for one epoch on 207,062 (anchor, card) pairs derived from 2,729 oracle tags, with 482 tags (15%, stratified by pool size) withheld entirely. Anchors were tag labels, aliases, and descriptions; positives were reminder-augmented Oracle text; the loss was in-batch-negative InfoNCE with tag-disjoint batching so that no card sharing a tag with an anchor could be sampled as its negative. Training took 71 minutes on an M3 laptop GPU. The training loss fell from chance (ln 256 ≈ 4.2) to 1.46; the in-training probe flattened after roughly 600 of 809 steps, so one epoch is near the knee.</w:t>
+      </w:r>
+    </w:p>
+    <w:p>
+      <w:pPr>
+        <w:pStyle w:val="BodyText"/>
+      </w:pPr>
+      <w:r>
+        <w:rPr>
+          <w:b/>
+          <w:bCs/>
+        </w:rPr>
+        <w:t xml:space="preserve">Table 3 — Retrieval probes before and after fine-tuning (cosine, query = tag label).</w:t>
+      </w:r>
+    </w:p>
+    <w:tbl>
+      <w:tblPr>
+        <w:tblStyle w:val="Table"/>
+        <w:tblW w:type="pct" w:w="5000"/>
+        <w:tblLayout w:type="fixed"/>
+        <w:tblLook w:firstRow="1" w:lastRow="0" w:firstColumn="0" w:lastColumn="0" w:noHBand="0" w:noVBand="0" w:val="0020"/>
+      </w:tblPr>
+      <w:tblGrid>
+        <w:gridCol w:w="1584"/>
+        <w:gridCol w:w="1584"/>
+        <w:gridCol w:w="1584"/>
+        <w:gridCol w:w="1584"/>
+        <w:gridCol w:w="1584"/>
+      </w:tblGrid>
+      <w:tr>
+        <w:trPr>
+          <w:tblHeader w:val="on"/>
+        </w:trPr>
+        <w:tc>
+          <w:tcPr/>
+          <w:p>
+            <w:pPr>
+              <w:pStyle w:val="Compact"/>
+            </w:pPr>
+            <w:r>
+              <w:t xml:space="preserve">Probe</w:t>
+            </w:r>
+          </w:p>
+        </w:tc>
+        <w:tc>
+          <w:tcPr/>
+          <w:p>
+            <w:pPr>
+              <w:pStyle w:val="Compact"/>
+            </w:pPr>
+            <w:r>
+              <w:t xml:space="preserve">ndcg@10</w:t>
+            </w:r>
+          </w:p>
+        </w:tc>
+        <w:tc>
+          <w:tcPr/>
+          <w:p>
+            <w:pPr>
+              <w:pStyle w:val="Compact"/>
+            </w:pPr>
+            <w:r>
+              <w:t xml:space="preserve">mrr@10</w:t>
+            </w:r>
+          </w:p>
+        </w:tc>
+        <w:tc>
+          <w:tcPr/>
+          <w:p>
+            <w:pPr>
+              <w:pStyle w:val="Compact"/>
+            </w:pPr>
+            <w:r>
+              <w:t xml:space="preserve">map@10</w:t>
+            </w:r>
+          </w:p>
+        </w:tc>
+        <w:tc>
+          <w:tcPr/>
+          <w:p>
+            <w:pPr>
+              <w:pStyle w:val="Compact"/>
+            </w:pPr>
+            <w:r>
+              <w:t xml:space="preserve">recall@100</w:t>
+            </w:r>
+          </w:p>
+        </w:tc>
+      </w:tr>
+      <w:tr>
+        <w:tc>
+          <w:tcPr/>
+          <w:p>
+            <w:pPr>
+              <w:pStyle w:val="Compact"/>
+            </w:pPr>
+            <w:r>
+              <w:t xml:space="preserve">Training tags, 6.2k-card sub-corpus (in-distribution) — base</w:t>
+            </w:r>
+          </w:p>
+        </w:tc>
+        <w:tc>
+          <w:tcPr/>
+          <w:p>
+            <w:pPr>
+              <w:pStyle w:val="Compact"/>
+            </w:pPr>
+            <w:r>
+              <w:t xml:space="preserve">0.195</w:t>
+            </w:r>
+          </w:p>
+        </w:tc>
+        <w:tc>
+          <w:tcPr/>
+          <w:p>
+            <w:pPr>
+              <w:pStyle w:val="Compact"/>
+            </w:pPr>
+            <w:r>
+              <w:t xml:space="preserve">0.249</w:t>
+            </w:r>
+          </w:p>
+        </w:tc>
+        <w:tc>
+          <w:tcPr/>
+          <w:p>
+            <w:pPr>
+              <w:pStyle w:val="Compact"/>
+            </w:pPr>
+            <w:r>
+              <w:t xml:space="preserve">0.150</w:t>
+            </w:r>
+          </w:p>
+        </w:tc>
+        <w:tc>
+          <w:tcPr/>
+          <w:p>
+            <w:pPr>
+              <w:pStyle w:val="Compact"/>
+            </w:pPr>
+            <w:r>
+              <w:t xml:space="preserve">—</w:t>
+            </w:r>
+          </w:p>
+        </w:tc>
+      </w:tr>
+      <w:tr>
+        <w:tc>
+          <w:tcPr/>
+          <w:p>
+            <w:pPr>
+              <w:pStyle w:val="Compact"/>
+            </w:pPr>
+            <w:r>
+              <w:t xml:space="preserve">Training tags — tuned</w:t>
+            </w:r>
+          </w:p>
+        </w:tc>
+        <w:tc>
+          <w:tcPr/>
+          <w:p>
+            <w:pPr>
+              <w:pStyle w:val="Compact"/>
+            </w:pPr>
+            <w:r>
+              <w:t xml:space="preserve">0.536</w:t>
+            </w:r>
+          </w:p>
+        </w:tc>
+        <w:tc>
+          <w:tcPr/>
+          <w:p>
+            <w:pPr>
+              <w:pStyle w:val="Compact"/>
+            </w:pPr>
+            <w:r>
+              <w:t xml:space="preserve">0.600</w:t>
+            </w:r>
+          </w:p>
+        </w:tc>
+        <w:tc>
+          <w:tcPr/>
+          <w:p>
+            <w:pPr>
+              <w:pStyle w:val="Compact"/>
+            </w:pPr>
+            <w:r>
+              <w:t xml:space="preserve">0.467</w:t>
+            </w:r>
+          </w:p>
+        </w:tc>
+        <w:tc>
+          <w:tcPr/>
+          <w:p>
+            <w:pPr>
+              <w:pStyle w:val="Compact"/>
+            </w:pPr>
+            <w:r>
+              <w:t xml:space="preserve">—</w:t>
+            </w:r>
+          </w:p>
+        </w:tc>
+      </w:tr>
+      <w:tr>
+        <w:tc>
+          <w:tcPr/>
+          <w:p>
+            <w:pPr>
+              <w:pStyle w:val="Compact"/>
+            </w:pPr>
+            <w:r>
+              <w:rPr>
+                <w:b/>
+                <w:bCs/>
+              </w:rPr>
+              <w:t xml:space="preserve">Held-out tags, full 31k corpus — base</w:t>
+            </w:r>
+          </w:p>
+        </w:tc>
+        <w:tc>
+          <w:tcPr/>
+          <w:p>
+            <w:pPr>
+              <w:pStyle w:val="Compact"/>
+            </w:pPr>
+            <w:r>
+              <w:t xml:space="preserve">0.114</w:t>
+            </w:r>
+          </w:p>
+        </w:tc>
+        <w:tc>
+          <w:tcPr/>
+          <w:p>
+            <w:pPr>
+              <w:pStyle w:val="Compact"/>
+            </w:pPr>
+            <w:r>
+              <w:t xml:space="preserve">0.193</w:t>
+            </w:r>
+          </w:p>
+        </w:tc>
+        <w:tc>
+          <w:tcPr/>
+          <w:p>
+            <w:pPr>
+              <w:pStyle w:val="Compact"/>
+            </w:pPr>
+            <w:r>
+              <w:t xml:space="preserve">0.079</w:t>
+            </w:r>
+          </w:p>
+        </w:tc>
+        <w:tc>
+          <w:tcPr/>
+          <w:p>
+            <w:pPr>
+              <w:pStyle w:val="Compact"/>
+            </w:pPr>
+            <w:r>
+              <w:t xml:space="preserve">0.164</w:t>
+            </w:r>
+          </w:p>
+        </w:tc>
+      </w:tr>
+      <w:tr>
+        <w:tc>
+          <w:tcPr/>
+          <w:p>
+            <w:pPr>
+              <w:pStyle w:val="Compact"/>
+            </w:pPr>
+            <w:r>
+              <w:rPr>
+                <w:b/>
+                <w:bCs/>
+              </w:rPr>
+              <w:t xml:space="preserve">Held-out tags — tuned</w:t>
+            </w:r>
+          </w:p>
+        </w:tc>
+        <w:tc>
+          <w:tcPr/>
+          <w:p>
+            <w:pPr>
+              <w:pStyle w:val="Compact"/>
+            </w:pPr>
+            <w:r>
+              <w:rPr>
+                <w:b/>
+                <w:bCs/>
+              </w:rPr>
+              <w:t xml:space="preserve">0.242</w:t>
+            </w:r>
+          </w:p>
+        </w:tc>
+        <w:tc>
+          <w:tcPr/>
+          <w:p>
+            <w:pPr>
+              <w:pStyle w:val="Compact"/>
+            </w:pPr>
+            <w:r>
+              <w:rPr>
+                <w:b/>
+                <w:bCs/>
+              </w:rPr>
+              <w:t xml:space="preserve">0.325</w:t>
+            </w:r>
+          </w:p>
+        </w:tc>
+        <w:tc>
+          <w:tcPr/>
+          <w:p>
+            <w:pPr>
+              <w:pStyle w:val="Compact"/>
+            </w:pPr>
+            <w:r>
+              <w:rPr>
+                <w:b/>
+                <w:bCs/>
+              </w:rPr>
+              <w:t xml:space="preserve">0.187</w:t>
+            </w:r>
+          </w:p>
+        </w:tc>
+        <w:tc>
+          <w:tcPr/>
+          <w:p>
+            <w:pPr>
+              <w:pStyle w:val="Compact"/>
+            </w:pPr>
+            <w:r>
+              <w:rPr>
+                <w:b/>
+                <w:bCs/>
+              </w:rPr>
+              <w:t xml:space="preserve">0.327</w:t>
+            </w:r>
+          </w:p>
+        </w:tc>
+      </w:tr>
+    </w:tbl>
+    <w:p>
+      <w:pPr>
+        <w:pStyle w:val="BodyText"/>
+      </w:pPr>
+      <w:r>
+        <w:t xml:space="preserve">The in-distribution probe confirms the objective is doing what it should. The held-out probe is the result that matters for the argument in Section 6.4: on 482 functional tags the model never saw during training, queried by their label alone against the entire corpus, every metric roughly doubled. The encoder did not memorise a vocabulary list; it learned that a short functional phrase in player language maps to a region of rules text, and that mapping transferred to phrases it had not been shown. Absolute held-out scores are modest because many held-out tags are narrow (</w:t>
+      </w:r>
+      <w:r>
+        <w:rPr>
+          <w:rStyle w:val="VerbatimChar"/>
+        </w:rPr>
+        <w:t xml:space="preserve">bounceland</w:t>
+      </w:r>
+      <w:r>
+        <w:t xml:space="preserve">,</w:t>
+      </w:r>
+      <w:r>
+        <w:t xml:space="preserve"> </w:t>
+      </w:r>
+      <w:r>
+        <w:rPr>
+          <w:rStyle w:val="VerbatimChar"/>
+        </w:rPr>
+        <w:t xml:space="preserve">blood-artist-ability</w:t>
+      </w:r>
+      <w:r>
+        <w:t xml:space="preserve">) and compete with 31,000 distractors; the doubling of recall@100 is the cleaner read of the ranking shift.</w:t>
+      </w:r>
+    </w:p>
+    <w:p>
+      <w:pPr>
+        <w:pStyle w:val="BodyText"/>
+      </w:pPr>
+      <w:r>
+        <w:rPr>
+          <w:b/>
+          <w:bCs/>
+        </w:rPr>
+        <w:t xml:space="preserve">Forgetting probe.</w:t>
+      </w:r>
+      <w:r>
+        <w:t xml:space="preserve"> </w:t>
+      </w:r>
+      <w:r>
+        <w:t xml:space="preserve">NanoBEIR ndcg@10 on three general-domain subsets, base → tuned: SciFact 0.731 → 0.736, FiQA 0.485 → 0.441, NFCorpus 0.326 → 0.309; mean 0.514 → 0.495. The fine-tune costs two points of general retrieval on average and four on the most query-like subset — mild, uneven forgetting consistent with the unregularised runs reported by Murtaza et al. (2026) and ChEmbed (2025), and nowhere near the collapse Murtaza et al. observed with aggressive settings. For a domain-specialised deployment this is an acceptable trade; the embedding-anchor regulariser or base-weight interpolation (Section 2.5) is the planned ablation should a later recipe push the loss past a few points.</w:t>
+      </w:r>
+    </w:p>
+    <w:p>
+      <w:pPr>
+        <w:pStyle w:val="BodyText"/>
+      </w:pPr>
+      <w:r>
+        <w:rPr>
+          <w:b/>
+          <w:bCs/>
+        </w:rPr>
+        <w:t xml:space="preserve">Table 4 — The Section 3.4 grid with the tuned embedder (rows 20–23 vs 11–14; n = 26; keywords filter off).</w:t>
+      </w:r>
+    </w:p>
+    <w:tbl>
+      <w:tblPr>
+        <w:tblStyle w:val="Table"/>
+        <w:tblW w:type="pct" w:w="5000"/>
+        <w:tblLayout w:type="fixed"/>
+        <w:tblLook w:firstRow="1" w:lastRow="0" w:firstColumn="0" w:lastColumn="0" w:noHBand="0" w:noVBand="0" w:val="0020"/>
+      </w:tblPr>
+      <w:tblGrid>
+        <w:gridCol w:w="1980"/>
+        <w:gridCol w:w="1980"/>
+        <w:gridCol w:w="1980"/>
+        <w:gridCol w:w="1980"/>
+      </w:tblGrid>
+      <w:tr>
+        <w:trPr>
+          <w:tblHeader w:val="on"/>
+        </w:trPr>
+        <w:tc>
+          <w:tcPr/>
+          <w:p>
+            <w:pPr>
+              <w:pStyle w:val="Compact"/>
+            </w:pPr>
+            <w:r>
+              <w:t xml:space="preserve">Configuration</w:t>
+            </w:r>
+          </w:p>
+        </w:tc>
+        <w:tc>
+          <w:tcPr/>
+          <w:p>
+            <w:pPr>
+              <w:pStyle w:val="Compact"/>
+            </w:pPr>
+            <w:r>
+              <w:t xml:space="preserve">Query-side text</w:t>
+            </w:r>
+          </w:p>
+        </w:tc>
+        <w:tc>
+          <w:tcPr/>
+          <w:p>
+            <w:pPr>
+              <w:pStyle w:val="Compact"/>
+            </w:pPr>
+            <w:r>
+              <w:t xml:space="preserve">P@10 base → tuned</w:t>
+            </w:r>
+          </w:p>
+        </w:tc>
+        <w:tc>
+          <w:tcPr/>
+          <w:p>
+            <w:pPr>
+              <w:pStyle w:val="Compact"/>
+            </w:pPr>
+            <w:r>
+              <w:t xml:space="preserve">MRR base → tuned</w:t>
+            </w:r>
+          </w:p>
+        </w:tc>
+      </w:tr>
+      <w:tr>
+        <w:tc>
+          <w:tcPr/>
+          <w:p>
+            <w:pPr>
+              <w:pStyle w:val="Compact"/>
+            </w:pPr>
+            <w:r>
+              <w:t xml:space="preserve">Raw dense</w:t>
+            </w:r>
+          </w:p>
+        </w:tc>
+        <w:tc>
+          <w:tcPr/>
+          <w:p>
+            <w:pPr>
+              <w:pStyle w:val="Compact"/>
+            </w:pPr>
+            <w:r>
+              <w:t xml:space="preserve">user query, no filters</w:t>
+            </w:r>
+          </w:p>
+        </w:tc>
+        <w:tc>
+          <w:tcPr/>
+          <w:p>
+            <w:pPr>
+              <w:pStyle w:val="Compact"/>
+            </w:pPr>
+            <w:r>
+              <w:t xml:space="preserve">0.031 → 0.069</w:t>
+            </w:r>
+          </w:p>
+        </w:tc>
+        <w:tc>
+          <w:tcPr/>
+          <w:p>
+            <w:pPr>
+              <w:pStyle w:val="Compact"/>
+            </w:pPr>
+            <w:r>
+              <w:t xml:space="preserve">0.067 → 0.102</w:t>
+            </w:r>
+          </w:p>
+        </w:tc>
+      </w:tr>
+      <w:tr>
+        <w:tc>
+          <w:tcPr/>
+          <w:p>
+            <w:pPr>
+              <w:pStyle w:val="Compact"/>
+            </w:pPr>
+            <w:r>
+              <w:t xml:space="preserve">Pass-through</w:t>
+            </w:r>
+          </w:p>
+        </w:tc>
+        <w:tc>
+          <w:tcPr/>
+          <w:p>
+            <w:pPr>
+              <w:pStyle w:val="Compact"/>
+            </w:pPr>
+            <w:r>
+              <w:t xml:space="preserve">user query + HyDE filters</w:t>
+            </w:r>
+          </w:p>
+        </w:tc>
+        <w:tc>
+          <w:tcPr/>
+          <w:p>
+            <w:pPr>
+              <w:pStyle w:val="Compact"/>
+            </w:pPr>
+            <w:r>
+              <w:t xml:space="preserve">0.050 → 0.081</w:t>
+            </w:r>
+          </w:p>
+        </w:tc>
+        <w:tc>
+          <w:tcPr/>
+          <w:p>
+            <w:pPr>
+              <w:pStyle w:val="Compact"/>
+            </w:pPr>
+            <w:r>
+              <w:t xml:space="preserve">0.130 → 0.206</w:t>
+            </w:r>
+          </w:p>
+        </w:tc>
+      </w:tr>
+      <w:tr>
+        <w:tc>
+          <w:tcPr/>
+          <w:p>
+            <w:pPr>
+              <w:pStyle w:val="Compact"/>
+            </w:pPr>
+            <w:r>
+              <w:t xml:space="preserve">Full cascade (v1 prompt)</w:t>
+            </w:r>
+          </w:p>
+        </w:tc>
+        <w:tc>
+          <w:tcPr/>
+          <w:p>
+            <w:pPr>
+              <w:pStyle w:val="Compact"/>
+            </w:pPr>
+            <w:r>
+              <w:t xml:space="preserve">hypothetical rules text + filters</w:t>
+            </w:r>
+          </w:p>
+        </w:tc>
+        <w:tc>
+          <w:tcPr/>
+          <w:p>
+            <w:pPr>
+              <w:pStyle w:val="Compact"/>
+            </w:pPr>
+            <w:r>
+              <w:rPr>
+                <w:b/>
+                <w:bCs/>
+              </w:rPr>
+              <w:t xml:space="preserve">0.112</w:t>
+            </w:r>
+            <w:r>
+              <w:t xml:space="preserve"> </w:t>
+            </w:r>
+            <w:r>
+              <w:t xml:space="preserve">→ 0.089</w:t>
+            </w:r>
+          </w:p>
+        </w:tc>
+        <w:tc>
+          <w:tcPr/>
+          <w:p>
+            <w:pPr>
+              <w:pStyle w:val="Compact"/>
+            </w:pPr>
+            <w:r>
+              <w:rPr>
+                <w:b/>
+                <w:bCs/>
+              </w:rPr>
+              <w:t xml:space="preserve">0.294</w:t>
+            </w:r>
+            <w:r>
+              <w:t xml:space="preserve"> </w:t>
+            </w:r>
+            <w:r>
+              <w:t xml:space="preserve">→ 0.270</w:t>
+            </w:r>
+          </w:p>
+        </w:tc>
+      </w:tr>
+      <w:tr>
+        <w:tc>
+          <w:tcPr/>
+          <w:p>
+            <w:pPr>
+              <w:pStyle w:val="Compact"/>
+            </w:pPr>
+            <w:r>
+              <w:t xml:space="preserve">–SQL ablation</w:t>
+            </w:r>
+          </w:p>
+        </w:tc>
+        <w:tc>
+          <w:tcPr/>
+          <w:p>
+            <w:pPr>
+              <w:pStyle w:val="Compact"/>
+            </w:pPr>
+            <w:r>
+              <w:t xml:space="preserve">hypothetical rules text, no filters</w:t>
+            </w:r>
+          </w:p>
+        </w:tc>
+        <w:tc>
+          <w:tcPr/>
+          <w:p>
+            <w:pPr>
+              <w:pStyle w:val="Compact"/>
+            </w:pPr>
+            <w:r>
+              <w:t xml:space="preserve">0.085 → 0.077</w:t>
+            </w:r>
+          </w:p>
+        </w:tc>
+        <w:tc>
+          <w:tcPr/>
+          <w:p>
+            <w:pPr>
+              <w:pStyle w:val="Compact"/>
+            </w:pPr>
+            <w:r>
+              <w:t xml:space="preserve">0.269 → 0.196</w:t>
+            </w:r>
+          </w:p>
+        </w:tc>
+      </w:tr>
+    </w:tbl>
+    <w:p>
+      <w:pPr>
+        <w:pStyle w:val="BodyText"/>
+      </w:pPr>
+      <w:r>
+        <w:t xml:space="preserve">The tuned embedder improved every configuration that embeds the user’s own words and degraded every configuration that embeds hypothetical rules text. Both effects follow from the training data: anchors were short functional phrases, so the query-side representation moved toward short phrases and away from paragraph-length rules text used as a query. On the jargon category, pass-through with the tuned embedder (P@10 0.115) approaches the v1 cascade with the tuned embedder (0.131) without generating any hypothetical text, and beats it on latency by the full cost of Stage 1 for that text. The best single cell on this evaluation set, however, remains the v1 cascade on the</w:t>
+      </w:r>
+      <w:r>
+        <w:t xml:space="preserve"> </w:t>
+      </w:r>
+      <w:r>
+        <w:rPr>
+          <w:i/>
+          <w:iCs/>
+        </w:rPr>
+        <w:t xml:space="preserve">base</w:t>
+      </w:r>
+      <w:r>
+        <w:t xml:space="preserve"> </w:t>
+      </w:r>
+      <w:r>
+        <w:t xml:space="preserve">embedder (0.112 / 0.294).</w:t>
+      </w:r>
+    </w:p>
+    <w:p>
+      <w:pPr>
+        <w:pStyle w:val="BodyText"/>
+      </w:pPr>
+      <w:r>
+        <w:t xml:space="preserve">Two observations qualify the pass-through result as a test of the Section 6.3 hypothesis. First, pass-through embeds raw user phrasing, whereas the hypothesis has the rewriter normalise that phrasing toward tag vocabulary before the embedder sees it; the cell that tests the hypothesis is the v2 prompt combined with the tuned embedder, which is future work at the time of writing. Second, the training anchors expose each concept through a handful of strings —</w:t>
+      </w:r>
+      <w:r>
+        <w:t xml:space="preserve"> </w:t>
+      </w:r>
+      <w:r>
+        <w:rPr>
+          <w:rStyle w:val="VerbatimChar"/>
+        </w:rPr>
+        <w:t xml:space="preserve">sweeper</w:t>
+      </w:r>
+      <w:r>
+        <w:t xml:space="preserve"> </w:t>
+      </w:r>
+      <w:r>
+        <w:t xml:space="preserve">was trained with the aliases</w:t>
+      </w:r>
+      <w:r>
+        <w:t xml:space="preserve"> </w:t>
+      </w:r>
+      <w:r>
+        <w:rPr>
+          <w:i/>
+          <w:iCs/>
+        </w:rPr>
+        <w:t xml:space="preserve">wipe</w:t>
+      </w:r>
+      <w:r>
+        <w:t xml:space="preserve">,</w:t>
+      </w:r>
+      <w:r>
+        <w:t xml:space="preserve"> </w:t>
+      </w:r>
+      <w:r>
+        <w:rPr>
+          <w:i/>
+          <w:iCs/>
+        </w:rPr>
+        <w:t xml:space="preserve">boardwipe</w:t>
+      </w:r>
+      <w:r>
+        <w:t xml:space="preserve">,</w:t>
+      </w:r>
+      <w:r>
+        <w:t xml:space="preserve"> </w:t>
+      </w:r>
+      <w:r>
+        <w:rPr>
+          <w:i/>
+          <w:iCs/>
+        </w:rPr>
+        <w:t xml:space="preserve">mass removal</w:t>
+      </w:r>
+      <w:r>
+        <w:t xml:space="preserve">, and</w:t>
+      </w:r>
+      <w:r>
+        <w:t xml:space="preserve"> </w:t>
+      </w:r>
+      <w:r>
+        <w:rPr>
+          <w:i/>
+          <w:iCs/>
+        </w:rPr>
+        <w:t xml:space="preserve">wrath of god</w:t>
+      </w:r>
+      <w:r>
+        <w:t xml:space="preserve"> </w:t>
+      </w:r>
+      <w:r>
+        <w:t xml:space="preserve">— and the eval query</w:t>
+      </w:r>
+      <w:r>
+        <w:t xml:space="preserve"> </w:t>
+      </w:r>
+      <w:r>
+        <w:rPr>
+          <w:i/>
+          <w:iCs/>
+        </w:rPr>
+        <w:t xml:space="preserve">“board wipes”</w:t>
+      </w:r>
+      <w:r>
+        <w:t xml:space="preserve"> </w:t>
+      </w:r>
+      <w:r>
+        <w:t xml:space="preserve">still scored zero through pass-through while scoring 0.20 through hypothetical text. Single-string exposure per synonym is not enough to cover user phrasing; the synthetic-query anchor source (Section 6.3) is designed to close that gap. Fragmented queries remain at zero in every cell of the grid, tuned or not.</w:t>
+      </w:r>
+    </w:p>
+    <w:p>
+      <w:pPr>
+        <w:pStyle w:val="BodyText"/>
+      </w:pPr>
+      <w:r>
+        <w:rPr>
+          <w:i/>
+          <w:iCs/>
+        </w:rPr>
+        <w:t xml:space="preserve">[TODO — v2-prompt × tuned-embedder cell (the hypothesis test); tag-label oracle upper bound; mixed-anchor training run to recover the hypothetical-text mode; Scryfall comparator with result-parity and query-complexity measures; direct-tag-lookup ablation.]</w:t>
       </w:r>
     </w:p>
     <w:p>
@@ -3741,9 +4605,9 @@
         </w:pict>
       </w:r>
     </w:p>
-    <w:bookmarkEnd w:id="34"/>
     <w:bookmarkEnd w:id="35"/>
-    <w:bookmarkStart w:id="42" w:name="discussion"/>
+    <w:bookmarkEnd w:id="36"/>
+    <w:bookmarkStart w:id="43" w:name="discussion"/>
     <w:p>
       <w:pPr>
         <w:pStyle w:val="Heading2"/>
@@ -3752,7 +4616,7 @@
         <w:t xml:space="preserve">6. Discussion</w:t>
       </w:r>
     </w:p>
-    <w:bookmarkStart w:id="36" w:name="Xce591a7134eaebe21be78c40822d47fa68684e3"/>
+    <w:bookmarkStart w:id="37" w:name="Xce591a7134eaebe21be78c40822d47fa68684e3"/>
     <w:p>
       <w:pPr>
         <w:pStyle w:val="Heading3"/>
@@ -3877,8 +4741,8 @@
         <w:t xml:space="preserve">are semantically equivalent. The reminder-text corpus augmentation partially addresses the corpus side but does not resolve the query-side asymmetry.</w:t>
       </w:r>
     </w:p>
-    <w:bookmarkEnd w:id="36"/>
-    <w:bookmarkStart w:id="37" w:name="the-selective-strictness-design-decision"/>
+    <w:bookmarkEnd w:id="37"/>
+    <w:bookmarkStart w:id="38" w:name="the-selective-strictness-design-decision"/>
     <w:p>
       <w:pPr>
         <w:pStyle w:val="Heading3"/>
@@ -3923,8 +4787,8 @@
         <w:t xml:space="preserve">Selective strictness offers the best tradeoff for this cascade. It preserves the recall benefit of pre-filtering on genuinely-constrained queries while limiting the blast radius of the model’s inference errors. It also requires distinguishing user-explicit from model-inferred in the pipeline, which is a small structural addition to the HyDE output contract.</w:t>
       </w:r>
     </w:p>
-    <w:bookmarkEnd w:id="37"/>
-    <w:bookmarkStart w:id="38" w:name="the-path-toward-fine-tuning"/>
+    <w:bookmarkEnd w:id="38"/>
+    <w:bookmarkStart w:id="39" w:name="the-path-toward-fine-tuning"/>
     <w:p>
       <w:pPr>
         <w:pStyle w:val="Heading3"/>
@@ -4138,8 +5002,8 @@
         <w:t xml:space="preserve">The order of operations is: tag ingestion first (done); the base-embedder control run through the full cascade second, so every fine-tuning claim has a before-number; embedder fine-tuning third; the v2 prompt fourth; HyDE LoRA only if measurements demand it.</w:t>
       </w:r>
     </w:p>
-    <w:bookmarkEnd w:id="38"/>
-    <w:bookmarkStart w:id="39" w:name="Xc99c7a51214e20f050a67b5431e6bbe9542439f"/>
+    <w:bookmarkEnd w:id="39"/>
+    <w:bookmarkStart w:id="40" w:name="Xc99c7a51214e20f050a67b5431e6bbe9542439f"/>
     <w:p>
       <w:pPr>
         <w:pStyle w:val="Heading3"/>
@@ -4214,8 +5078,8 @@
         <w:t xml:space="preserve">or merely memorised a vocabulary list. The accessibility claim (Section 1.1) and the generalisation claim reinforce each other — parity with expert Scryfall on tagged concepts, plus coverage beyond them.</w:t>
       </w:r>
     </w:p>
-    <w:bookmarkEnd w:id="39"/>
-    <w:bookmarkStart w:id="40" w:name="X0a7ec6647493993060fb580e195ef7c4d3d4e81"/>
+    <w:bookmarkEnd w:id="40"/>
+    <w:bookmarkStart w:id="41" w:name="X0a7ec6647493993060fb580e195ef7c4d3d4e81"/>
     <w:p>
       <w:pPr>
         <w:pStyle w:val="Heading3"/>
@@ -4282,8 +5146,8 @@
         <w:t xml:space="preserve">field can be modified in place before being passed to the search orchestrator without any pipeline change. The pattern reinforces the accessibility framing — non-experts get LLM-driven filter proposals, experts can override and refine.</w:t>
       </w:r>
     </w:p>
-    <w:bookmarkEnd w:id="40"/>
-    <w:bookmarkStart w:id="41" w:name="limitations"/>
+    <w:bookmarkEnd w:id="41"/>
+    <w:bookmarkStart w:id="42" w:name="limitations"/>
     <w:p>
       <w:pPr>
         <w:pStyle w:val="Heading3"/>
@@ -4541,9 +5405,9 @@
         </w:pict>
       </w:r>
     </w:p>
-    <w:bookmarkEnd w:id="41"/>
     <w:bookmarkEnd w:id="42"/>
-    <w:bookmarkStart w:id="45" w:name="conclusion-and-future-work"/>
+    <w:bookmarkEnd w:id="43"/>
+    <w:bookmarkStart w:id="46" w:name="conclusion-and-future-work"/>
     <w:p>
       <w:pPr>
         <w:pStyle w:val="Heading2"/>
@@ -4552,7 +5416,7 @@
         <w:t xml:space="preserve">7. Conclusion and Future Work</w:t>
       </w:r>
     </w:p>
-    <w:bookmarkStart w:id="43" w:name="conclusion"/>
+    <w:bookmarkStart w:id="44" w:name="conclusion"/>
     <w:p>
       <w:pPr>
         <w:pStyle w:val="Heading3"/>
@@ -4581,8 +5445,8 @@
         <w:t xml:space="preserve">This work presents a three-stage retrieval cascade for natural-language semantic search over a bounded consumer catalog, using MTG as the test bed. The cascade combines HyDE-style query rewriting, structured SQL pre-filtering, and dense vector search inside the pre-filtered candidate set. Development surfaced concrete failure modes of the base approach — jargon knowledge gaps, over-narrowing on keyword filters, compositional attention drift — most of which are resolved by moving to a larger base model but persist as evidence that domain-specific fine-tuning is the natural next intervention. The methodological framing (outcome comparison against a domain-standard tool rather than diff against an internal baseline) and the accessibility contribution (bringing expert-level search results to non-expert users) are the paper’s core arguments.</w:t>
       </w:r>
     </w:p>
-    <w:bookmarkEnd w:id="43"/>
-    <w:bookmarkStart w:id="44" w:name="future-work"/>
+    <w:bookmarkEnd w:id="44"/>
+    <w:bookmarkStart w:id="45" w:name="future-work"/>
     <w:p>
       <w:pPr>
         <w:pStyle w:val="Heading3"/>
@@ -4728,9 +5592,9 @@
         </w:pict>
       </w:r>
     </w:p>
-    <w:bookmarkEnd w:id="44"/>
     <w:bookmarkEnd w:id="45"/>
-    <w:bookmarkStart w:id="46" w:name="references"/>
+    <w:bookmarkEnd w:id="46"/>
+    <w:bookmarkStart w:id="47" w:name="references"/>
     <w:p>
       <w:pPr>
         <w:pStyle w:val="Heading2"/>
@@ -5035,8 +5899,8 @@
         </w:pict>
       </w:r>
     </w:p>
-    <w:bookmarkEnd w:id="46"/>
-    <w:bookmarkStart w:id="51" w:name="appendices"/>
+    <w:bookmarkEnd w:id="47"/>
+    <w:bookmarkStart w:id="52" w:name="appendices"/>
     <w:p>
       <w:pPr>
         <w:pStyle w:val="Heading2"/>
@@ -5045,7 +5909,7 @@
         <w:t xml:space="preserve">Appendices</w:t>
       </w:r>
     </w:p>
-    <w:bookmarkStart w:id="47" w:name="appendix-a-hyde-prompt-v1"/>
+    <w:bookmarkStart w:id="48" w:name="appendix-a-hyde-prompt-v1"/>
     <w:p>
       <w:pPr>
         <w:pStyle w:val="Heading3"/>
@@ -5095,8 +5959,8 @@
         <w:t xml:space="preserve">verbatim in the appendix. Full system prompt with schema, rules, few-shot examples.]</w:t>
       </w:r>
     </w:p>
-    <w:bookmarkEnd w:id="47"/>
-    <w:bookmarkStart w:id="48" w:name="appendix-b-evaluation-set"/>
+    <w:bookmarkEnd w:id="48"/>
+    <w:bookmarkStart w:id="49" w:name="appendix-b-evaluation-set"/>
     <w:p>
       <w:pPr>
         <w:pStyle w:val="Heading3"/>
@@ -5146,8 +6010,8 @@
         <w:t xml:space="preserve">— the 26 queries with tri-state relevance judgments.]</w:t>
       </w:r>
     </w:p>
-    <w:bookmarkEnd w:id="48"/>
-    <w:bookmarkStart w:id="49" w:name="appendix-c-per-query-results"/>
+    <w:bookmarkEnd w:id="49"/>
+    <w:bookmarkStart w:id="50" w:name="appendix-c-per-query-results"/>
     <w:p>
       <w:pPr>
         <w:pStyle w:val="Heading3"/>
@@ -5168,8 +6032,8 @@
         <w:t xml:space="preserve">[TODO — populated after M5 measurements land. Full recall@10 and MRR per (query, configuration) pair.]</w:t>
       </w:r>
     </w:p>
-    <w:bookmarkEnd w:id="49"/>
-    <w:bookmarkStart w:id="50" w:name="appendix-d-failure-mode-test-series"/>
+    <w:bookmarkEnd w:id="50"/>
+    <w:bookmarkStart w:id="51" w:name="appendix-d-failure-mode-test-series"/>
     <w:p>
       <w:pPr>
         <w:pStyle w:val="Heading3"/>
@@ -5190,9 +6054,9 @@
         <w:t xml:space="preserve">[The 10 diagnostic test queries used to characterize the base HyDE model’s failure modes (Section 5.1), with full HyDE output for each and side-by-side comparison against the larger model (Section 5.2).]</w:t>
       </w:r>
     </w:p>
-    <w:bookmarkEnd w:id="50"/>
     <w:bookmarkEnd w:id="51"/>
     <w:bookmarkEnd w:id="52"/>
+    <w:bookmarkEnd w:id="53"/>
     <w:sectPr>
       <w:footnotePr>
         <w:numRestart w:val="eachSect"/>

</xml_diff>

<commit_message>
feat(eval): tag-label oracle + annotation-hole correction
- data/eval/tag_label_oracle_v1.yaml, configs/oracle_tag_label{,_nosql}.yaml,
  Searcher.search(embed_text=), evaluate.py label_oracle support
- rows 26-29: oracle loses on judged P@10 (0.073 tuned) but 95% of its top-10
  are tag-pool members (base 35%, control 56%); held-out 'burn' 10/10
- journal 5d + 5e correction, paper 5.4: eval judgments have BEIR-style holes;
  judge them (eval v2) before deciding the v2-prompt comparison

Co-Authored-By: Claude Fable 5.1 <noreply@anthropic.com>
</commit_message>
<xml_diff>
--- a/docs/thesis/paper-draft.docx
+++ b/docs/thesis/paper-draft.docx
@@ -4592,10 +4592,333 @@
       </w:pPr>
       <w:r>
         <w:rPr>
-          <w:i/>
-          <w:iCs/>
-        </w:rPr>
-        <w:t xml:space="preserve">[TODO — v2-prompt × tuned-embedder cell (the hypothesis test); tag-label oracle upper bound; mixed-anchor training run to recover the hypothetical-text mode; Scryfall comparator with result-parity and query-complexity measures; direct-tag-lookup ablation.]</w:t>
+          <w:b/>
+          <w:bCs/>
+        </w:rPr>
+        <w:t xml:space="preserve">The tag-label oracle.</w:t>
+      </w:r>
+      <w:r>
+        <w:t xml:space="preserve"> </w:t>
+      </w:r>
+      <w:r>
+        <w:rPr>
+          <w:i/>
+          <w:iCs/>
+        </w:rPr>
+        <w:t xml:space="preserve">[DRAFTED — REVIEW; rows 26–29, journal §5d]</w:t>
+      </w:r>
+      <w:r>
+        <w:t xml:space="preserve"> </w:t>
+      </w:r>
+      <w:r>
+        <w:t xml:space="preserve">Before building a rewriter that emits concepts in tag vocabulary, its ceiling was measured directly: for each evaluation query a human selected the tag a flawless rewriter would emit, the harness embedded that tag’s label in place of the user’s words, and results were scored against the same judgments. The chosen tags cover 93–100% of each jargon query’s relevant set, so the judgments are reachable through them. The oracle nonetheless scored</w:t>
+      </w:r>
+      <w:r>
+        <w:t xml:space="preserve"> </w:t>
+      </w:r>
+      <w:r>
+        <w:rPr>
+          <w:b/>
+          <w:bCs/>
+        </w:rPr>
+        <w:t xml:space="preserve">0.073 P@10 / 0.153 MRR</w:t>
+      </w:r>
+      <w:r>
+        <w:t xml:space="preserve"> </w:t>
+      </w:r>
+      <w:r>
+        <w:t xml:space="preserve">with the tuned embedder and filters (0.065 / 0.185 with the base), below both the pass-through row and the v1 control. Per-query precision falls monotonically with the tag’s pool size:</w:t>
+      </w:r>
+      <w:r>
+        <w:t xml:space="preserve"> </w:t>
+      </w:r>
+      <w:r>
+        <w:rPr>
+          <w:rStyle w:val="VerbatimChar"/>
+        </w:rPr>
+        <w:t xml:space="preserve">extra-turn</w:t>
+      </w:r>
+      <w:r>
+        <w:t xml:space="preserve"> </w:t>
+      </w:r>
+      <w:r>
+        <w:t xml:space="preserve">(53 cards) 0.60,</w:t>
+      </w:r>
+      <w:r>
+        <w:t xml:space="preserve"> </w:t>
+      </w:r>
+      <w:r>
+        <w:rPr>
+          <w:rStyle w:val="VerbatimChar"/>
+        </w:rPr>
+        <w:t xml:space="preserve">fetchland</w:t>
+      </w:r>
+      <w:r>
+        <w:t xml:space="preserve"> </w:t>
+      </w:r>
+      <w:r>
+        <w:t xml:space="preserve">(53) 0.40,</w:t>
+      </w:r>
+      <w:r>
+        <w:t xml:space="preserve"> </w:t>
+      </w:r>
+      <w:r>
+        <w:rPr>
+          <w:rStyle w:val="VerbatimChar"/>
+        </w:rPr>
+        <w:t xml:space="preserve">wheel</w:t>
+      </w:r>
+      <w:r>
+        <w:t xml:space="preserve"> </w:t>
+      </w:r>
+      <w:r>
+        <w:t xml:space="preserve">(137) 0.20,</w:t>
+      </w:r>
+      <w:r>
+        <w:t xml:space="preserve"> </w:t>
+      </w:r>
+      <w:r>
+        <w:rPr>
+          <w:rStyle w:val="VerbatimChar"/>
+        </w:rPr>
+        <w:t xml:space="preserve">sweeper</w:t>
+      </w:r>
+      <w:r>
+        <w:t xml:space="preserve"> </w:t>
+      </w:r>
+      <w:r>
+        <w:t xml:space="preserve">(871) 0.10, and every tag above roughly 1,000 cards —</w:t>
+      </w:r>
+      <w:r>
+        <w:t xml:space="preserve"> </w:t>
+      </w:r>
+      <w:r>
+        <w:rPr>
+          <w:rStyle w:val="VerbatimChar"/>
+        </w:rPr>
+        <w:t xml:space="preserve">removal</w:t>
+      </w:r>
+      <w:r>
+        <w:t xml:space="preserve">,</w:t>
+      </w:r>
+      <w:r>
+        <w:t xml:space="preserve"> </w:t>
+      </w:r>
+      <w:r>
+        <w:rPr>
+          <w:rStyle w:val="VerbatimChar"/>
+        </w:rPr>
+        <w:t xml:space="preserve">ramp</w:t>
+      </w:r>
+      <w:r>
+        <w:t xml:space="preserve">,</w:t>
+      </w:r>
+      <w:r>
+        <w:t xml:space="preserve"> </w:t>
+      </w:r>
+      <w:r>
+        <w:rPr>
+          <w:rStyle w:val="VerbatimChar"/>
+        </w:rPr>
+        <w:t xml:space="preserve">recursion</w:t>
+      </w:r>
+      <w:r>
+        <w:t xml:space="preserve">,</w:t>
+      </w:r>
+      <w:r>
+        <w:t xml:space="preserve"> </w:t>
+      </w:r>
+      <w:r>
+        <w:rPr>
+          <w:rStyle w:val="VerbatimChar"/>
+        </w:rPr>
+        <w:t xml:space="preserve">draw</w:t>
+      </w:r>
+      <w:r>
+        <w:t xml:space="preserve"> </w:t>
+      </w:r>
+      <w:r>
+        <w:t xml:space="preserve">— 0.00.</w:t>
+      </w:r>
+    </w:p>
+    <w:p>
+      <w:pPr>
+        <w:pStyle w:val="BodyText"/>
+      </w:pPr>
+      <w:r>
+        <w:t xml:space="preserve">The explanation is that a tag names a</w:t>
+      </w:r>
+      <w:r>
+        <w:t xml:space="preserve"> </w:t>
+      </w:r>
+      <w:r>
+        <w:rPr>
+          <w:i/>
+          <w:iCs/>
+        </w:rPr>
+        <w:t xml:space="preserve">category</w:t>
+      </w:r>
+      <w:r>
+        <w:t xml:space="preserve"> </w:t>
+      </w:r>
+      <w:r>
+        <w:t xml:space="preserve">while relevance judgments name its</w:t>
+      </w:r>
+      <w:r>
+        <w:t xml:space="preserve"> </w:t>
+      </w:r>
+      <w:r>
+        <w:rPr>
+          <w:i/>
+          <w:iCs/>
+        </w:rPr>
+        <w:t xml:space="preserve">archetypes</w:t>
+      </w:r>
+      <w:r>
+        <w:t xml:space="preserve">.</w:t>
+      </w:r>
+      <w:r>
+        <w:t xml:space="preserve"> </w:t>
+      </w:r>
+      <w:r>
+        <w:t xml:space="preserve">“Ramp”</w:t>
+      </w:r>
+      <w:r>
+        <w:t xml:space="preserve"> </w:t>
+      </w:r>
+      <w:r>
+        <w:t xml:space="preserve">covers 2,136 tagged cards; the evaluation set judges 28 of them relevant, the canonical ramp spells a player means by the word. The label embeds to the centre of the pool and retrieves ten arbitrary members; the hypothetical text</w:t>
+      </w:r>
+      <w:r>
+        <w:t xml:space="preserve"> </w:t>
+      </w:r>
+      <w:r>
+        <w:t xml:space="preserve">“search your library for a basic land card and put it onto the battlefield”</w:t>
+      </w:r>
+      <w:r>
+        <w:t xml:space="preserve"> </w:t>
+      </w:r>
+      <w:r>
+        <w:t xml:space="preserve">is more specific than the category and lands on the archetypes. This is the held-out probe’s blind spot made visible: there, the whole pool counts as relevant, so category-level retrieval scores well; against human judgments it is too coarse. On judged precision alone the strong form of the Section 6.3 hypothesis — rewriter emits a tag, embedder does the rest — would look unsupported; the correction below shows that reading is an artefact of the judgments. What survives is the weaker and more useful form: the tuned embedder handles user phrasing directly (pass-through MRR 0.130 → 0.206), and the rewriter’s job shrinks to filters plus a</w:t>
+      </w:r>
+      <w:r>
+        <w:t xml:space="preserve"> </w:t>
+      </w:r>
+      <w:r>
+        <w:rPr>
+          <w:i/>
+          <w:iCs/>
+        </w:rPr>
+        <w:t xml:space="preserve">short</w:t>
+      </w:r>
+      <w:r>
+        <w:t xml:space="preserve"> </w:t>
+      </w:r>
+      <w:r>
+        <w:t xml:space="preserve">hypothetical clause rather than a paragraph, which is measurable in output tokens. The hypothetical-text regression in Table 4 is a training-data effect, addressable by adding rules-text-shaped anchors, not evidence against the rewriter.</w:t>
+      </w:r>
+    </w:p>
+    <w:p>
+      <w:pPr>
+        <w:pStyle w:val="BodyText"/>
+      </w:pPr>
+      <w:r>
+        <w:rPr>
+          <w:b/>
+          <w:bCs/>
+        </w:rPr>
+        <w:t xml:space="preserve">Correction: the oracle’s misses are annotation holes.</w:t>
+      </w:r>
+      <w:r>
+        <w:t xml:space="preserve"> </w:t>
+      </w:r>
+      <w:r>
+        <w:rPr>
+          <w:i/>
+          <w:iCs/>
+        </w:rPr>
+        <w:t xml:space="preserve">[DRAFTED — REVIEW; journal §5e]</w:t>
+      </w:r>
+      <w:r>
+        <w:t xml:space="preserve"> </w:t>
+      </w:r>
+      <w:r>
+        <w:t xml:space="preserve">Scoring the same oracle runs against tag membership rather than the relevance judgments reverses the reading above. With the tuned embedder, 95% of the oracle’s top-10 results are members of the intended tag’s pool, against 35% for the base embedder and 56% for the v1 control;</w:t>
+      </w:r>
+      <w:r>
+        <w:t xml:space="preserve"> </w:t>
+      </w:r>
+      <w:r>
+        <w:rPr>
+          <w:rStyle w:val="VerbatimChar"/>
+        </w:rPr>
+        <w:t xml:space="preserve">ramp</w:t>
+      </w:r>
+      <w:r>
+        <w:t xml:space="preserve">,</w:t>
+      </w:r>
+      <w:r>
+        <w:t xml:space="preserve"> </w:t>
+      </w:r>
+      <w:r>
+        <w:rPr>
+          <w:rStyle w:val="VerbatimChar"/>
+        </w:rPr>
+        <w:t xml:space="preserve">recursion</w:t>
+      </w:r>
+      <w:r>
+        <w:t xml:space="preserve">,</w:t>
+      </w:r>
+      <w:r>
+        <w:t xml:space="preserve"> </w:t>
+      </w:r>
+      <w:r>
+        <w:rPr>
+          <w:rStyle w:val="VerbatimChar"/>
+        </w:rPr>
+        <w:t xml:space="preserve">flicker</w:t>
+      </w:r>
+      <w:r>
+        <w:t xml:space="preserve">, and</w:t>
+      </w:r>
+      <w:r>
+        <w:t xml:space="preserve"> </w:t>
+      </w:r>
+      <w:r>
+        <w:rPr>
+          <w:rStyle w:val="VerbatimChar"/>
+        </w:rPr>
+        <w:t xml:space="preserve">tutor</w:t>
+      </w:r>
+      <w:r>
+        <w:t xml:space="preserve"> </w:t>
+      </w:r>
+      <w:r>
+        <w:t xml:space="preserve">each go from 0-1 of 10 to 10 of 10, and</w:t>
+      </w:r>
+      <w:r>
+        <w:t xml:space="preserve"> </w:t>
+      </w:r>
+      <w:r>
+        <w:rPr>
+          <w:rStyle w:val="VerbatimChar"/>
+        </w:rPr>
+        <w:t xml:space="preserve">burn</w:t>
+      </w:r>
+      <w:r>
+        <w:t xml:space="preserve">, a tag withheld from training, also scores 10 of 10. The encoder learned the categories. The evaluation set judges roughly thirty archetypes per query out of pools of one to six thousand legitimate members and counts every unjudged member as a miss, the annotation-hole effect Thakur et al. (2021, §6) document for dense retrievers. Because the judgments were assembled from lexical Scryfall lookups, they favour cards that the hypothetical-text mode also favours. Neither metric alone settles the comparison: judged precision favours the control by construction and pool membership favours the oracle by construction (20 of 21 mapped tags were seen in training). The defensible claims are that the tuned embedder retrieves category members far more reliably than the base, that a bare label returns arbitrary rather than best-known members (a within-category ranking problem), and that the evaluation set needs its holes judged before the v2 comparison can be decided.</w:t>
+      </w:r>
+    </w:p>
+    <w:p>
+      <w:pPr>
+        <w:pStyle w:val="BodyText"/>
+      </w:pPr>
+      <w:r>
+        <w:rPr>
+          <w:i/>
+          <w:iCs/>
+        </w:rPr>
+        <w:t xml:space="preserve">[TODO — eval v2: pool top-10 across all logged rows, judge the holes, freeze; pairs_v2 with doc-like anchors and synthetic queries, retrain, re-run grid; hyde_v2 with a one-sentence hypothetical and trimmed rules (measure tokens/latency); Scryfall comparator; direct-tag-lookup ablation (expected to fail on broad tags for the same reason — the argument for embedding over lookup).]</w:t>
       </w:r>
     </w:p>
     <w:p>

</xml_diff>

<commit_message>
feat(eval): set-retrieval probe + goal reframe (complete retrieval, not top-10 relevance)
- scripts/probes/set_retrieval_probe.py: P@100, R-precision, depth-to-90% vs tag pools
- result: label/tuned R-prec 0.73, rawquery/tuned 0.60, v1 control 0.27; ordering
  inverts vs P@10-on-archetypes; held-out 'burn' 0.92
- journal 5f, paper 5.5 (Mitchell's prose + Table 5); stopping-rule design item

Co-Authored-By: Claude Fable 5.1 <noreply@anthropic.com>
</commit_message>
<xml_diff>
--- a/docs/thesis/paper-draft.docx
+++ b/docs/thesis/paper-draft.docx
@@ -26,7 +26,7 @@
         <w:t xml:space="preserve">Fall 2026 · CSCI 5953 · CSUSB</w:t>
       </w:r>
     </w:p>
-    <w:bookmarkStart w:id="53" w:name="paper-draft-working-document"/>
+    <w:bookmarkStart w:id="54" w:name="paper-draft-working-document"/>
     <w:p>
       <w:pPr>
         <w:pStyle w:val="Heading1"/>
@@ -1901,7 +1901,7 @@
     </w:p>
     <w:bookmarkEnd w:id="30"/>
     <w:bookmarkEnd w:id="31"/>
-    <w:bookmarkStart w:id="36" w:name="results"/>
+    <w:bookmarkStart w:id="37" w:name="results"/>
     <w:p>
       <w:pPr>
         <w:pStyle w:val="Heading2"/>
@@ -4909,6 +4909,601 @@
         <w:t xml:space="preserve">, a tag withheld from training, also scores 10 of 10. The encoder learned the categories. The evaluation set judges roughly thirty archetypes per query out of pools of one to six thousand legitimate members and counts every unjudged member as a miss, the annotation-hole effect Thakur et al. (2021, §6) document for dense retrievers. Because the judgments were assembled from lexical Scryfall lookups, they favour cards that the hypothetical-text mode also favours. Neither metric alone settles the comparison: judged precision favours the control by construction and pool membership favours the oracle by construction (20 of 21 mapped tags were seen in training). The defensible claims are that the tuned embedder retrieves category members far more reliably than the base, that a bare label returns arbitrary rather than best-known members (a within-category ranking problem), and that the evaluation set needs its holes judged before the v2 comparison can be decided.</w:t>
       </w:r>
     </w:p>
+    <w:bookmarkEnd w:id="35"/>
+    <w:bookmarkStart w:id="36" w:name="X57a013bd56a5e9949f92f262e20d275eec46405"/>
+    <w:p>
+      <w:pPr>
+        <w:pStyle w:val="Heading3"/>
+      </w:pPr>
+      <w:r>
+        <w:t xml:space="preserve">5.5 Set retrieval: the measure that matches the goal</w:t>
+      </w:r>
+    </w:p>
+    <w:p>
+      <w:pPr>
+        <w:pStyle w:val="FirstParagraph"/>
+      </w:pPr>
+      <w:r>
+        <w:rPr>
+          <w:i/>
+          <w:iCs/>
+        </w:rPr>
+        <w:t xml:space="preserve">[YOUR PROSE, lightly edited — 2026-09-19]</w:t>
+      </w:r>
+    </w:p>
+    <w:p>
+      <w:pPr>
+        <w:pStyle w:val="BodyText"/>
+      </w:pPr>
+      <w:r>
+        <w:t xml:space="preserve">Relevance ranking is not actually the problem this system is trying to solve, and it is solvable separately. Scryfall gives the ability to sort results by EDHREC rank, which is a relevance marker based on popularity: cards that show up high in EDHREC sorting are the cards used most commonly and will naturally be the cards people are looking for. Scryfall filtering by tag with other basic attribute filtering does not give relevance-ranked results; it gives the set of results, good or bad. The metric that matters is therefore measured against that baseline. To restate the stance: we are not trying to produce a system that outperforms Scryfall’s own capabilities. A stack that both produces the matching results and surfaces the most relevant automatically would be great, but it is beyond this scope. The goal is a system that provides every single card that could be a match, in descending order. Results are limited to a top</w:t>
+      </w:r>
+      <w:r>
+        <w:t xml:space="preserve"> </w:t>
+      </w:r>
+      <w:r>
+        <w:rPr>
+          <w:i/>
+          <w:iCs/>
+        </w:rPr>
+        <w:t xml:space="preserve">n</w:t>
+      </w:r>
+      <w:r>
+        <w:t xml:space="preserve"> </w:t>
+      </w:r>
+      <w:r>
+        <w:t xml:space="preserve">for evaluation, but in real use it would be all results split into</w:t>
+      </w:r>
+      <w:r>
+        <w:t xml:space="preserve"> </w:t>
+      </w:r>
+      <w:r>
+        <w:rPr>
+          <w:i/>
+          <w:iCs/>
+        </w:rPr>
+        <w:t xml:space="preserve">m</w:t>
+      </w:r>
+      <w:r>
+        <w:t xml:space="preserve"> </w:t>
+      </w:r>
+      <w:r>
+        <w:t xml:space="preserve">pages of</w:t>
+      </w:r>
+      <w:r>
+        <w:t xml:space="preserve"> </w:t>
+      </w:r>
+      <w:r>
+        <w:rPr>
+          <w:i/>
+          <w:iCs/>
+        </w:rPr>
+        <w:t xml:space="preserve">n</w:t>
+      </w:r>
+      <w:r>
+        <w:t xml:space="preserve"> </w:t>
+      </w:r>
+      <w:r>
+        <w:t xml:space="preserve">cards. Sorting by relevance then becomes no different from Scryfall’s, assuming popularity sorting is a function available to both systems.</w:t>
+      </w:r>
+    </w:p>
+    <w:p>
+      <w:pPr>
+        <w:pStyle w:val="BodyText"/>
+      </w:pPr>
+      <w:r>
+        <w:rPr>
+          <w:i/>
+          <w:iCs/>
+        </w:rPr>
+        <w:t xml:space="preserve">[DRAFTED — REVIEW; journal §5f,</w:t>
+      </w:r>
+      <w:r>
+        <w:rPr>
+          <w:i/>
+          <w:iCs/>
+        </w:rPr>
+        <w:t xml:space="preserve"> </w:t>
+      </w:r>
+      <w:r>
+        <w:rPr>
+          <w:rStyle w:val="VerbatimChar"/>
+          <w:i/>
+          <w:iCs/>
+        </w:rPr>
+        <w:t xml:space="preserve">scripts/probes/set_retrieval_probe.py</w:t>
+      </w:r>
+      <w:r>
+        <w:rPr>
+          <w:i/>
+          <w:iCs/>
+        </w:rPr>
+        <w:t xml:space="preserve">]</w:t>
+      </w:r>
+    </w:p>
+    <w:p>
+      <w:pPr>
+        <w:pStyle w:val="BodyText"/>
+      </w:pPr>
+      <w:r>
+        <w:t xml:space="preserve">Under that goal the appropriate measures are set-retrieval measures against the full target set rather than precision over ten hand-picked archetypes: R-precision (precision at a depth equal to the size of the target set), P@100, and the depth a user must page to in order to have seen 90% of the set. Table 5 reports them for the 21 evaluation queries with a functional tag, using the tag’s full pool as the target and no filters.</w:t>
+      </w:r>
+    </w:p>
+    <w:p>
+      <w:pPr>
+        <w:pStyle w:val="BodyText"/>
+      </w:pPr>
+      <w:r>
+        <w:rPr>
+          <w:b/>
+          <w:bCs/>
+        </w:rPr>
+        <w:t xml:space="preserve">Table 5 — Set retrieval against tag pools (mean over 21 queries; depth as a multiple of pool size, median).</w:t>
+      </w:r>
+    </w:p>
+    <w:tbl>
+      <w:tblPr>
+        <w:tblStyle w:val="Table"/>
+        <w:tblW w:type="auto" w:w="0"/>
+        <w:tblLook w:firstRow="1" w:lastRow="0" w:firstColumn="0" w:lastColumn="0" w:noHBand="0" w:noVBand="0" w:val="0020"/>
+      </w:tblPr>
+      <w:tblGrid>
+        <w:gridCol w:w="1584"/>
+        <w:gridCol w:w="1584"/>
+        <w:gridCol w:w="1584"/>
+        <w:gridCol w:w="1584"/>
+        <w:gridCol w:w="1584"/>
+      </w:tblGrid>
+      <w:tr>
+        <w:trPr>
+          <w:tblHeader w:val="on"/>
+        </w:trPr>
+        <w:tc>
+          <w:tcPr/>
+          <w:p>
+            <w:pPr>
+              <w:pStyle w:val="Compact"/>
+            </w:pPr>
+            <w:r>
+              <w:t xml:space="preserve">Query-side text</w:t>
+            </w:r>
+          </w:p>
+        </w:tc>
+        <w:tc>
+          <w:tcPr/>
+          <w:p>
+            <w:pPr>
+              <w:pStyle w:val="Compact"/>
+            </w:pPr>
+            <w:r>
+              <w:t xml:space="preserve">Embedder</w:t>
+            </w:r>
+          </w:p>
+        </w:tc>
+        <w:tc>
+          <w:tcPr/>
+          <w:p>
+            <w:pPr>
+              <w:pStyle w:val="Compact"/>
+            </w:pPr>
+            <w:r>
+              <w:t xml:space="preserve">P@100</w:t>
+            </w:r>
+          </w:p>
+        </w:tc>
+        <w:tc>
+          <w:tcPr/>
+          <w:p>
+            <w:pPr>
+              <w:pStyle w:val="Compact"/>
+            </w:pPr>
+            <w:r>
+              <w:t xml:space="preserve">R-precision</w:t>
+            </w:r>
+          </w:p>
+        </w:tc>
+        <w:tc>
+          <w:tcPr/>
+          <w:p>
+            <w:pPr>
+              <w:pStyle w:val="Compact"/>
+            </w:pPr>
+            <w:r>
+              <w:t xml:space="preserve">Depth to 90%</w:t>
+            </w:r>
+          </w:p>
+        </w:tc>
+      </w:tr>
+      <w:tr>
+        <w:tc>
+          <w:tcPr/>
+          <w:p>
+            <w:pPr>
+              <w:pStyle w:val="Compact"/>
+            </w:pPr>
+            <w:r>
+              <w:t xml:space="preserve">Tag label</w:t>
+            </w:r>
+          </w:p>
+        </w:tc>
+        <w:tc>
+          <w:tcPr/>
+          <w:p>
+            <w:pPr>
+              <w:pStyle w:val="Compact"/>
+            </w:pPr>
+            <w:r>
+              <w:t xml:space="preserve">tuned</w:t>
+            </w:r>
+          </w:p>
+        </w:tc>
+        <w:tc>
+          <w:tcPr/>
+          <w:p>
+            <w:pPr>
+              <w:pStyle w:val="Compact"/>
+            </w:pPr>
+            <w:r>
+              <w:rPr>
+                <w:b/>
+                <w:bCs/>
+              </w:rPr>
+              <w:t xml:space="preserve">0.82</w:t>
+            </w:r>
+          </w:p>
+        </w:tc>
+        <w:tc>
+          <w:tcPr/>
+          <w:p>
+            <w:pPr>
+              <w:pStyle w:val="Compact"/>
+            </w:pPr>
+            <w:r>
+              <w:rPr>
+                <w:b/>
+                <w:bCs/>
+              </w:rPr>
+              <w:t xml:space="preserve">0.73</w:t>
+            </w:r>
+          </w:p>
+        </w:tc>
+        <w:tc>
+          <w:tcPr/>
+          <w:p>
+            <w:pPr>
+              <w:pStyle w:val="Compact"/>
+            </w:pPr>
+            <w:r>
+              <w:rPr>
+                <w:b/>
+                <w:bCs/>
+              </w:rPr>
+              <w:t xml:space="preserve">1.8×</w:t>
+            </w:r>
+          </w:p>
+        </w:tc>
+      </w:tr>
+      <w:tr>
+        <w:tc>
+          <w:tcPr/>
+          <w:p>
+            <w:pPr>
+              <w:pStyle w:val="Compact"/>
+            </w:pPr>
+            <w:r>
+              <w:t xml:space="preserve">User’s raw query</w:t>
+            </w:r>
+          </w:p>
+        </w:tc>
+        <w:tc>
+          <w:tcPr/>
+          <w:p>
+            <w:pPr>
+              <w:pStyle w:val="Compact"/>
+            </w:pPr>
+            <w:r>
+              <w:t xml:space="preserve">tuned</w:t>
+            </w:r>
+          </w:p>
+        </w:tc>
+        <w:tc>
+          <w:tcPr/>
+          <w:p>
+            <w:pPr>
+              <w:pStyle w:val="Compact"/>
+            </w:pPr>
+            <w:r>
+              <w:t xml:space="preserve">0.74</w:t>
+            </w:r>
+          </w:p>
+        </w:tc>
+        <w:tc>
+          <w:tcPr/>
+          <w:p>
+            <w:pPr>
+              <w:pStyle w:val="Compact"/>
+            </w:pPr>
+            <w:r>
+              <w:t xml:space="preserve">0.60</w:t>
+            </w:r>
+          </w:p>
+        </w:tc>
+        <w:tc>
+          <w:tcPr/>
+          <w:p>
+            <w:pPr>
+              <w:pStyle w:val="Compact"/>
+            </w:pPr>
+            <w:r>
+              <w:t xml:space="preserve">3.4×</w:t>
+            </w:r>
+          </w:p>
+        </w:tc>
+      </w:tr>
+      <w:tr>
+        <w:tc>
+          <w:tcPr/>
+          <w:p>
+            <w:pPr>
+              <w:pStyle w:val="Compact"/>
+            </w:pPr>
+            <w:r>
+              <w:t xml:space="preserve">Hypothetical text (v1 prompt)</w:t>
+            </w:r>
+          </w:p>
+        </w:tc>
+        <w:tc>
+          <w:tcPr/>
+          <w:p>
+            <w:pPr>
+              <w:pStyle w:val="Compact"/>
+            </w:pPr>
+            <w:r>
+              <w:t xml:space="preserve">tuned</w:t>
+            </w:r>
+          </w:p>
+        </w:tc>
+        <w:tc>
+          <w:tcPr/>
+          <w:p>
+            <w:pPr>
+              <w:pStyle w:val="Compact"/>
+            </w:pPr>
+            <w:r>
+              <w:t xml:space="preserve">0.57</w:t>
+            </w:r>
+          </w:p>
+        </w:tc>
+        <w:tc>
+          <w:tcPr/>
+          <w:p>
+            <w:pPr>
+              <w:pStyle w:val="Compact"/>
+            </w:pPr>
+            <w:r>
+              <w:t xml:space="preserve">0.46</w:t>
+            </w:r>
+          </w:p>
+        </w:tc>
+        <w:tc>
+          <w:tcPr/>
+          <w:p>
+            <w:pPr>
+              <w:pStyle w:val="Compact"/>
+            </w:pPr>
+            <w:r>
+              <w:t xml:space="preserve">3.8×</w:t>
+            </w:r>
+          </w:p>
+        </w:tc>
+      </w:tr>
+      <w:tr>
+        <w:tc>
+          <w:tcPr/>
+          <w:p>
+            <w:pPr>
+              <w:pStyle w:val="Compact"/>
+            </w:pPr>
+            <w:r>
+              <w:t xml:space="preserve">Hypothetical text (v1 prompt)</w:t>
+            </w:r>
+          </w:p>
+        </w:tc>
+        <w:tc>
+          <w:tcPr/>
+          <w:p>
+            <w:pPr>
+              <w:pStyle w:val="Compact"/>
+            </w:pPr>
+            <w:r>
+              <w:t xml:space="preserve">base</w:t>
+            </w:r>
+          </w:p>
+        </w:tc>
+        <w:tc>
+          <w:tcPr/>
+          <w:p>
+            <w:pPr>
+              <w:pStyle w:val="Compact"/>
+            </w:pPr>
+            <w:r>
+              <w:t xml:space="preserve">0.47</w:t>
+            </w:r>
+          </w:p>
+        </w:tc>
+        <w:tc>
+          <w:tcPr/>
+          <w:p>
+            <w:pPr>
+              <w:pStyle w:val="Compact"/>
+            </w:pPr>
+            <w:r>
+              <w:t xml:space="preserve">0.27</w:t>
+            </w:r>
+          </w:p>
+        </w:tc>
+        <w:tc>
+          <w:tcPr/>
+          <w:p>
+            <w:pPr>
+              <w:pStyle w:val="Compact"/>
+            </w:pPr>
+            <w:r>
+              <w:t xml:space="preserve">13.2×</w:t>
+            </w:r>
+          </w:p>
+        </w:tc>
+      </w:tr>
+      <w:tr>
+        <w:tc>
+          <w:tcPr/>
+          <w:p>
+            <w:pPr>
+              <w:pStyle w:val="Compact"/>
+            </w:pPr>
+            <w:r>
+              <w:t xml:space="preserve">User’s raw query</w:t>
+            </w:r>
+          </w:p>
+        </w:tc>
+        <w:tc>
+          <w:tcPr/>
+          <w:p>
+            <w:pPr>
+              <w:pStyle w:val="Compact"/>
+            </w:pPr>
+            <w:r>
+              <w:t xml:space="preserve">base</w:t>
+            </w:r>
+          </w:p>
+        </w:tc>
+        <w:tc>
+          <w:tcPr/>
+          <w:p>
+            <w:pPr>
+              <w:pStyle w:val="Compact"/>
+            </w:pPr>
+            <w:r>
+              <w:t xml:space="preserve">0.31</w:t>
+            </w:r>
+          </w:p>
+        </w:tc>
+        <w:tc>
+          <w:tcPr/>
+          <w:p>
+            <w:pPr>
+              <w:pStyle w:val="Compact"/>
+            </w:pPr>
+            <w:r>
+              <w:t xml:space="preserve">0.21</w:t>
+            </w:r>
+          </w:p>
+        </w:tc>
+        <w:tc>
+          <w:tcPr/>
+          <w:p>
+            <w:pPr>
+              <w:pStyle w:val="Compact"/>
+            </w:pPr>
+            <w:r>
+              <w:t xml:space="preserve">13.5×</w:t>
+            </w:r>
+          </w:p>
+        </w:tc>
+      </w:tr>
+      <w:tr>
+        <w:tc>
+          <w:tcPr/>
+          <w:p>
+            <w:pPr>
+              <w:pStyle w:val="Compact"/>
+            </w:pPr>
+            <w:r>
+              <w:t xml:space="preserve">Tag label</w:t>
+            </w:r>
+          </w:p>
+        </w:tc>
+        <w:tc>
+          <w:tcPr/>
+          <w:p>
+            <w:pPr>
+              <w:pStyle w:val="Compact"/>
+            </w:pPr>
+            <w:r>
+              <w:t xml:space="preserve">base</w:t>
+            </w:r>
+          </w:p>
+        </w:tc>
+        <w:tc>
+          <w:tcPr/>
+          <w:p>
+            <w:pPr>
+              <w:pStyle w:val="Compact"/>
+            </w:pPr>
+            <w:r>
+              <w:t xml:space="preserve">0.29</w:t>
+            </w:r>
+          </w:p>
+        </w:tc>
+        <w:tc>
+          <w:tcPr/>
+          <w:p>
+            <w:pPr>
+              <w:pStyle w:val="Compact"/>
+            </w:pPr>
+            <w:r>
+              <w:t xml:space="preserve">0.19</w:t>
+            </w:r>
+          </w:p>
+        </w:tc>
+        <w:tc>
+          <w:tcPr/>
+          <w:p>
+            <w:pPr>
+              <w:pStyle w:val="Compact"/>
+            </w:pPr>
+            <w:r>
+              <w:t xml:space="preserve">16.4×</w:t>
+            </w:r>
+          </w:p>
+        </w:tc>
+      </w:tr>
+    </w:tbl>
+    <w:p>
+      <w:pPr>
+        <w:pStyle w:val="BodyText"/>
+      </w:pPr>
+      <w:r>
+        <w:t xml:space="preserve">The ordering of systems inverts relative to Table 4. The tuned embedder given the user’s own words (0.60) outperforms hypothetical rules text on either embedder, and given tag vocabulary (0.73) it outperforms both; to see 90% of all tutor effects a user pages about 1,000 results instead of 12,000.</w:t>
+      </w:r>
+      <w:r>
+        <w:t xml:space="preserve"> </w:t>
+      </w:r>
+      <w:r>
+        <w:rPr>
+          <w:rStyle w:val="VerbatimChar"/>
+        </w:rPr>
+        <w:t xml:space="preserve">burn</w:t>
+      </w:r>
+      <w:r>
+        <w:t xml:space="preserve">, a tag withheld from training, reaches 0.92. This supports the Section 6.3 hypothesis in its original form: once the encoder understands the domain’s functional vocabulary, the rewriter’s job reduces to filter extraction and concept normalisation. Three caveats apply. Twenty of the 21 targets are tags seen in training, so the held-out results (Table 3, and</w:t>
+      </w:r>
+      <w:r>
+        <w:t xml:space="preserve"> </w:t>
+      </w:r>
+      <w:r>
+        <w:rPr>
+          <w:rStyle w:val="VerbatimChar"/>
+        </w:rPr>
+        <w:t xml:space="preserve">burn</w:t>
+      </w:r>
+      <w:r>
+        <w:t xml:space="preserve"> </w:t>
+      </w:r>
+      <w:r>
+        <w:t xml:space="preserve">here) carry the generalisation claim, and the expert-query Scryfall comparator remains the independent check. A ranking is not a set: Scryfall’s results end, whereas a dense ranking continues through the whole corpus, so a stopping rule (similarity threshold, score gap, or plain paging with the score shown) is a required design element, and at 1.8× pool depth a naive cutoff either truncates the set or pads it. Finally, tag pools are community-curated and incomplete, so untagged true matches in the top ranks are counted as errors here; the human review in the results dashboard measures that directly.</w:t>
+      </w:r>
+    </w:p>
     <w:p>
       <w:pPr>
         <w:pStyle w:val="BodyText"/>
@@ -4928,9 +5523,9 @@
         </w:pict>
       </w:r>
     </w:p>
-    <w:bookmarkEnd w:id="35"/>
     <w:bookmarkEnd w:id="36"/>
-    <w:bookmarkStart w:id="43" w:name="discussion"/>
+    <w:bookmarkEnd w:id="37"/>
+    <w:bookmarkStart w:id="44" w:name="discussion"/>
     <w:p>
       <w:pPr>
         <w:pStyle w:val="Heading2"/>
@@ -4939,7 +5534,7 @@
         <w:t xml:space="preserve">6. Discussion</w:t>
       </w:r>
     </w:p>
-    <w:bookmarkStart w:id="37" w:name="Xce591a7134eaebe21be78c40822d47fa68684e3"/>
+    <w:bookmarkStart w:id="38" w:name="Xce591a7134eaebe21be78c40822d47fa68684e3"/>
     <w:p>
       <w:pPr>
         <w:pStyle w:val="Heading3"/>
@@ -5064,8 +5659,8 @@
         <w:t xml:space="preserve">are semantically equivalent. The reminder-text corpus augmentation partially addresses the corpus side but does not resolve the query-side asymmetry.</w:t>
       </w:r>
     </w:p>
-    <w:bookmarkEnd w:id="37"/>
-    <w:bookmarkStart w:id="38" w:name="the-selective-strictness-design-decision"/>
+    <w:bookmarkEnd w:id="38"/>
+    <w:bookmarkStart w:id="39" w:name="the-selective-strictness-design-decision"/>
     <w:p>
       <w:pPr>
         <w:pStyle w:val="Heading3"/>
@@ -5110,8 +5705,8 @@
         <w:t xml:space="preserve">Selective strictness offers the best tradeoff for this cascade. It preserves the recall benefit of pre-filtering on genuinely-constrained queries while limiting the blast radius of the model’s inference errors. It also requires distinguishing user-explicit from model-inferred in the pipeline, which is a small structural addition to the HyDE output contract.</w:t>
       </w:r>
     </w:p>
-    <w:bookmarkEnd w:id="38"/>
-    <w:bookmarkStart w:id="39" w:name="the-path-toward-fine-tuning"/>
+    <w:bookmarkEnd w:id="39"/>
+    <w:bookmarkStart w:id="40" w:name="the-path-toward-fine-tuning"/>
     <w:p>
       <w:pPr>
         <w:pStyle w:val="Heading3"/>
@@ -5325,8 +5920,8 @@
         <w:t xml:space="preserve">The order of operations is: tag ingestion first (done); the base-embedder control run through the full cascade second, so every fine-tuning claim has a before-number; embedder fine-tuning third; the v2 prompt fourth; HyDE LoRA only if measurements demand it.</w:t>
       </w:r>
     </w:p>
-    <w:bookmarkEnd w:id="39"/>
-    <w:bookmarkStart w:id="40" w:name="Xc99c7a51214e20f050a67b5431e6bbe9542439f"/>
+    <w:bookmarkEnd w:id="40"/>
+    <w:bookmarkStart w:id="41" w:name="Xc99c7a51214e20f050a67b5431e6bbe9542439f"/>
     <w:p>
       <w:pPr>
         <w:pStyle w:val="Heading3"/>
@@ -5401,8 +5996,8 @@
         <w:t xml:space="preserve">or merely memorised a vocabulary list. The accessibility claim (Section 1.1) and the generalisation claim reinforce each other — parity with expert Scryfall on tagged concepts, plus coverage beyond them.</w:t>
       </w:r>
     </w:p>
-    <w:bookmarkEnd w:id="40"/>
-    <w:bookmarkStart w:id="41" w:name="X0a7ec6647493993060fb580e195ef7c4d3d4e81"/>
+    <w:bookmarkEnd w:id="41"/>
+    <w:bookmarkStart w:id="42" w:name="X0a7ec6647493993060fb580e195ef7c4d3d4e81"/>
     <w:p>
       <w:pPr>
         <w:pStyle w:val="Heading3"/>
@@ -5469,8 +6064,8 @@
         <w:t xml:space="preserve">field can be modified in place before being passed to the search orchestrator without any pipeline change. The pattern reinforces the accessibility framing — non-experts get LLM-driven filter proposals, experts can override and refine.</w:t>
       </w:r>
     </w:p>
-    <w:bookmarkEnd w:id="41"/>
-    <w:bookmarkStart w:id="42" w:name="limitations"/>
+    <w:bookmarkEnd w:id="42"/>
+    <w:bookmarkStart w:id="43" w:name="limitations"/>
     <w:p>
       <w:pPr>
         <w:pStyle w:val="Heading3"/>
@@ -5728,9 +6323,9 @@
         </w:pict>
       </w:r>
     </w:p>
-    <w:bookmarkEnd w:id="42"/>
     <w:bookmarkEnd w:id="43"/>
-    <w:bookmarkStart w:id="46" w:name="conclusion-and-future-work"/>
+    <w:bookmarkEnd w:id="44"/>
+    <w:bookmarkStart w:id="47" w:name="conclusion-and-future-work"/>
     <w:p>
       <w:pPr>
         <w:pStyle w:val="Heading2"/>
@@ -5739,7 +6334,7 @@
         <w:t xml:space="preserve">7. Conclusion and Future Work</w:t>
       </w:r>
     </w:p>
-    <w:bookmarkStart w:id="44" w:name="conclusion"/>
+    <w:bookmarkStart w:id="45" w:name="conclusion"/>
     <w:p>
       <w:pPr>
         <w:pStyle w:val="Heading3"/>
@@ -5768,8 +6363,8 @@
         <w:t xml:space="preserve">This work presents a three-stage retrieval cascade for natural-language semantic search over a bounded consumer catalog, using MTG as the test bed. The cascade combines HyDE-style query rewriting, structured SQL pre-filtering, and dense vector search inside the pre-filtered candidate set. Development surfaced concrete failure modes of the base approach — jargon knowledge gaps, over-narrowing on keyword filters, compositional attention drift — most of which are resolved by moving to a larger base model but persist as evidence that domain-specific fine-tuning is the natural next intervention. The methodological framing (outcome comparison against a domain-standard tool rather than diff against an internal baseline) and the accessibility contribution (bringing expert-level search results to non-expert users) are the paper’s core arguments.</w:t>
       </w:r>
     </w:p>
-    <w:bookmarkEnd w:id="44"/>
-    <w:bookmarkStart w:id="45" w:name="future-work"/>
+    <w:bookmarkEnd w:id="45"/>
+    <w:bookmarkStart w:id="46" w:name="future-work"/>
     <w:p>
       <w:pPr>
         <w:pStyle w:val="Heading3"/>
@@ -5915,9 +6510,9 @@
         </w:pict>
       </w:r>
     </w:p>
-    <w:bookmarkEnd w:id="45"/>
     <w:bookmarkEnd w:id="46"/>
-    <w:bookmarkStart w:id="47" w:name="references"/>
+    <w:bookmarkEnd w:id="47"/>
+    <w:bookmarkStart w:id="48" w:name="references"/>
     <w:p>
       <w:pPr>
         <w:pStyle w:val="Heading2"/>
@@ -6222,8 +6817,8 @@
         </w:pict>
       </w:r>
     </w:p>
-    <w:bookmarkEnd w:id="47"/>
-    <w:bookmarkStart w:id="52" w:name="appendices"/>
+    <w:bookmarkEnd w:id="48"/>
+    <w:bookmarkStart w:id="53" w:name="appendices"/>
     <w:p>
       <w:pPr>
         <w:pStyle w:val="Heading2"/>
@@ -6232,7 +6827,7 @@
         <w:t xml:space="preserve">Appendices</w:t>
       </w:r>
     </w:p>
-    <w:bookmarkStart w:id="48" w:name="appendix-a-hyde-prompt-v1"/>
+    <w:bookmarkStart w:id="49" w:name="appendix-a-hyde-prompt-v1"/>
     <w:p>
       <w:pPr>
         <w:pStyle w:val="Heading3"/>
@@ -6282,8 +6877,8 @@
         <w:t xml:space="preserve">verbatim in the appendix. Full system prompt with schema, rules, few-shot examples.]</w:t>
       </w:r>
     </w:p>
-    <w:bookmarkEnd w:id="48"/>
-    <w:bookmarkStart w:id="49" w:name="appendix-b-evaluation-set"/>
+    <w:bookmarkEnd w:id="49"/>
+    <w:bookmarkStart w:id="50" w:name="appendix-b-evaluation-set"/>
     <w:p>
       <w:pPr>
         <w:pStyle w:val="Heading3"/>
@@ -6333,8 +6928,8 @@
         <w:t xml:space="preserve">— the 26 queries with tri-state relevance judgments.]</w:t>
       </w:r>
     </w:p>
-    <w:bookmarkEnd w:id="49"/>
-    <w:bookmarkStart w:id="50" w:name="appendix-c-per-query-results"/>
+    <w:bookmarkEnd w:id="50"/>
+    <w:bookmarkStart w:id="51" w:name="appendix-c-per-query-results"/>
     <w:p>
       <w:pPr>
         <w:pStyle w:val="Heading3"/>
@@ -6355,8 +6950,8 @@
         <w:t xml:space="preserve">[TODO — populated after M5 measurements land. Full recall@10 and MRR per (query, configuration) pair.]</w:t>
       </w:r>
     </w:p>
-    <w:bookmarkEnd w:id="50"/>
-    <w:bookmarkStart w:id="51" w:name="appendix-d-failure-mode-test-series"/>
+    <w:bookmarkEnd w:id="51"/>
+    <w:bookmarkStart w:id="52" w:name="appendix-d-failure-mode-test-series"/>
     <w:p>
       <w:pPr>
         <w:pStyle w:val="Heading3"/>
@@ -6377,9 +6972,9 @@
         <w:t xml:space="preserve">[The 10 diagnostic test queries used to characterize the base HyDE model’s failure modes (Section 5.1), with full HyDE output for each and side-by-side comparison against the larger model (Section 5.2).]</w:t>
       </w:r>
     </w:p>
-    <w:bookmarkEnd w:id="51"/>
     <w:bookmarkEnd w:id="52"/>
     <w:bookmarkEnd w:id="53"/>
+    <w:bookmarkEnd w:id="54"/>
     <w:sectPr>
       <w:footnotePr>
         <w:numRestart w:val="eachSect"/>

</xml_diff>

<commit_message>
feat(eval): set-retrieval metrics inside the Stage 2 candidate set
- src/eval/metrics.py: SetMetrics (R-precision full + reachable, P@100, R@500,
  depth-to-90%, reachable) + aggregate; tests
- src/search.py: Searcher.rank_prepared — full ranking of the candidate set
- scripts/evaluate.py: retrieval.set_metrics scores each mapped query against its
  tag pool; all configs enabled
- rows 38-39 (base), 42-46 (tuned) logged; reachable=0.68 on every filtered row
  quantifies Stage 2 over-narrowing; passthrough/tuned R-prec(reachable) 0.64,
  depth90 1.2x; journal 5g, paper Table 6

Co-Authored-By: Claude Fable 5.1 <noreply@anthropic.com>
</commit_message>
<xml_diff>
--- a/docs/thesis/paper-draft.docx
+++ b/docs/thesis/paper-draft.docx
@@ -5502,6 +5502,521 @@
       </w:r>
       <w:r>
         <w:t xml:space="preserve">here) carry the generalisation claim, and the expert-query Scryfall comparator remains the independent check. A dense ranking has no natural end, but this needs no stopping rule: only queries with no structural component rank the full corpus (11 of the 26 evaluation queries; the other 15 are pre-filtered to between 3 and 17,428 candidates), the vector search scores every candidate regardless of how many are returned, and the interface pages the full ranked set with the match score visible so users decide how far into the tail to look. Depth-to-90% is therefore a ranking-quality measure, and Table 5, run without filters, is pessimistic for the filtered majority. Finally, tag pools are community-curated and incomplete, so untagged true matches in the top ranks are counted as errors here; the human review in the results dashboard measures that directly.</w:t>
+      </w:r>
+    </w:p>
+    <w:p>
+      <w:pPr>
+        <w:pStyle w:val="BodyText"/>
+      </w:pPr>
+      <w:r>
+        <w:rPr>
+          <w:b/>
+          <w:bCs/>
+        </w:rPr>
+        <w:t xml:space="preserve">Table 6 — Set retrieval inside the cascade (Stage 2 filters applied; tuned embedder unless noted; n = 21).</w:t>
+      </w:r>
+    </w:p>
+    <w:tbl>
+      <w:tblPr>
+        <w:tblStyle w:val="Table"/>
+        <w:tblW w:type="pct" w:w="5000"/>
+        <w:tblLayout w:type="fixed"/>
+        <w:tblLook w:firstRow="1" w:lastRow="0" w:firstColumn="0" w:lastColumn="0" w:noHBand="0" w:noVBand="0" w:val="0020"/>
+      </w:tblPr>
+      <w:tblGrid>
+        <w:gridCol w:w="1320"/>
+        <w:gridCol w:w="1320"/>
+        <w:gridCol w:w="1320"/>
+        <w:gridCol w:w="1320"/>
+        <w:gridCol w:w="1320"/>
+        <w:gridCol w:w="1320"/>
+      </w:tblGrid>
+      <w:tr>
+        <w:trPr>
+          <w:tblHeader w:val="on"/>
+        </w:trPr>
+        <w:tc>
+          <w:tcPr/>
+          <w:p>
+            <w:pPr>
+              <w:pStyle w:val="Compact"/>
+            </w:pPr>
+            <w:r>
+              <w:t xml:space="preserve">Configuration</w:t>
+            </w:r>
+          </w:p>
+        </w:tc>
+        <w:tc>
+          <w:tcPr/>
+          <w:p>
+            <w:pPr>
+              <w:pStyle w:val="Compact"/>
+            </w:pPr>
+            <w:r>
+              <w:t xml:space="preserve">R-prec (full pool)</w:t>
+            </w:r>
+          </w:p>
+        </w:tc>
+        <w:tc>
+          <w:tcPr/>
+          <w:p>
+            <w:pPr>
+              <w:pStyle w:val="Compact"/>
+            </w:pPr>
+            <w:r>
+              <w:t xml:space="preserve">R-prec (reachable)</w:t>
+            </w:r>
+          </w:p>
+        </w:tc>
+        <w:tc>
+          <w:tcPr/>
+          <w:p>
+            <w:pPr>
+              <w:pStyle w:val="Compact"/>
+            </w:pPr>
+            <w:r>
+              <w:t xml:space="preserve">P@100</w:t>
+            </w:r>
+          </w:p>
+        </w:tc>
+        <w:tc>
+          <w:tcPr/>
+          <w:p>
+            <w:pPr>
+              <w:pStyle w:val="Compact"/>
+            </w:pPr>
+            <w:r>
+              <w:t xml:space="preserve">Reachable</w:t>
+            </w:r>
+          </w:p>
+        </w:tc>
+        <w:tc>
+          <w:tcPr/>
+          <w:p>
+            <w:pPr>
+              <w:pStyle w:val="Compact"/>
+            </w:pPr>
+            <w:r>
+              <w:t xml:space="preserve">Depth to 90%</w:t>
+            </w:r>
+          </w:p>
+        </w:tc>
+      </w:tr>
+      <w:tr>
+        <w:tc>
+          <w:tcPr/>
+          <w:p>
+            <w:pPr>
+              <w:pStyle w:val="Compact"/>
+            </w:pPr>
+            <w:r>
+              <w:t xml:space="preserve">v1 cascade, base embedder (control)</w:t>
+            </w:r>
+          </w:p>
+        </w:tc>
+        <w:tc>
+          <w:tcPr/>
+          <w:p>
+            <w:pPr>
+              <w:pStyle w:val="Compact"/>
+            </w:pPr>
+            <w:r>
+              <w:t xml:space="preserve">0.215</w:t>
+            </w:r>
+          </w:p>
+        </w:tc>
+        <w:tc>
+          <w:tcPr/>
+          <w:p>
+            <w:pPr>
+              <w:pStyle w:val="Compact"/>
+            </w:pPr>
+            <w:r>
+              <w:t xml:space="preserve">—</w:t>
+            </w:r>
+          </w:p>
+        </w:tc>
+        <w:tc>
+          <w:tcPr/>
+          <w:p>
+            <w:pPr>
+              <w:pStyle w:val="Compact"/>
+            </w:pPr>
+            <w:r>
+              <w:t xml:space="preserve">0.444</w:t>
+            </w:r>
+          </w:p>
+        </w:tc>
+        <w:tc>
+          <w:tcPr/>
+          <w:p>
+            <w:pPr>
+              <w:pStyle w:val="Compact"/>
+            </w:pPr>
+            <w:r>
+              <w:t xml:space="preserve">0.68</w:t>
+            </w:r>
+          </w:p>
+        </w:tc>
+        <w:tc>
+          <w:tcPr/>
+          <w:p>
+            <w:pPr>
+              <w:pStyle w:val="Compact"/>
+            </w:pPr>
+            <w:r>
+              <w:t xml:space="preserve">8.4×</w:t>
+            </w:r>
+          </w:p>
+        </w:tc>
+      </w:tr>
+      <w:tr>
+        <w:tc>
+          <w:tcPr/>
+          <w:p>
+            <w:pPr>
+              <w:pStyle w:val="Compact"/>
+            </w:pPr>
+            <w:r>
+              <w:t xml:space="preserve">v1 cascade, tuned</w:t>
+            </w:r>
+          </w:p>
+        </w:tc>
+        <w:tc>
+          <w:tcPr/>
+          <w:p>
+            <w:pPr>
+              <w:pStyle w:val="Compact"/>
+            </w:pPr>
+            <w:r>
+              <w:t xml:space="preserve">0.326</w:t>
+            </w:r>
+          </w:p>
+        </w:tc>
+        <w:tc>
+          <w:tcPr/>
+          <w:p>
+            <w:pPr>
+              <w:pStyle w:val="Compact"/>
+            </w:pPr>
+            <w:r>
+              <w:t xml:space="preserve">0.517</w:t>
+            </w:r>
+          </w:p>
+        </w:tc>
+        <w:tc>
+          <w:tcPr/>
+          <w:p>
+            <w:pPr>
+              <w:pStyle w:val="Compact"/>
+            </w:pPr>
+            <w:r>
+              <w:t xml:space="preserve">0.572</w:t>
+            </w:r>
+          </w:p>
+        </w:tc>
+        <w:tc>
+          <w:tcPr/>
+          <w:p>
+            <w:pPr>
+              <w:pStyle w:val="Compact"/>
+            </w:pPr>
+            <w:r>
+              <w:t xml:space="preserve">0.68</w:t>
+            </w:r>
+          </w:p>
+        </w:tc>
+        <w:tc>
+          <w:tcPr/>
+          <w:p>
+            <w:pPr>
+              <w:pStyle w:val="Compact"/>
+            </w:pPr>
+            <w:r>
+              <w:t xml:space="preserve">3.0×</w:t>
+            </w:r>
+          </w:p>
+        </w:tc>
+      </w:tr>
+      <w:tr>
+        <w:tc>
+          <w:tcPr/>
+          <w:p>
+            <w:pPr>
+              <w:pStyle w:val="Compact"/>
+            </w:pPr>
+            <w:r>
+              <w:t xml:space="preserve">Raw query, no filters, tuned</w:t>
+            </w:r>
+          </w:p>
+        </w:tc>
+        <w:tc>
+          <w:tcPr/>
+          <w:p>
+            <w:pPr>
+              <w:pStyle w:val="Compact"/>
+            </w:pPr>
+            <w:r>
+              <w:t xml:space="preserve">0.598</w:t>
+            </w:r>
+          </w:p>
+        </w:tc>
+        <w:tc>
+          <w:tcPr/>
+          <w:p>
+            <w:pPr>
+              <w:pStyle w:val="Compact"/>
+            </w:pPr>
+            <w:r>
+              <w:t xml:space="preserve">0.598</w:t>
+            </w:r>
+          </w:p>
+        </w:tc>
+        <w:tc>
+          <w:tcPr/>
+          <w:p>
+            <w:pPr>
+              <w:pStyle w:val="Compact"/>
+            </w:pPr>
+            <w:r>
+              <w:t xml:space="preserve">0.736</w:t>
+            </w:r>
+          </w:p>
+        </w:tc>
+        <w:tc>
+          <w:tcPr/>
+          <w:p>
+            <w:pPr>
+              <w:pStyle w:val="Compact"/>
+            </w:pPr>
+            <w:r>
+              <w:t xml:space="preserve">1.00</w:t>
+            </w:r>
+          </w:p>
+        </w:tc>
+        <w:tc>
+          <w:tcPr/>
+          <w:p>
+            <w:pPr>
+              <w:pStyle w:val="Compact"/>
+            </w:pPr>
+            <w:r>
+              <w:t xml:space="preserve">3.4×</w:t>
+            </w:r>
+          </w:p>
+        </w:tc>
+      </w:tr>
+      <w:tr>
+        <w:tc>
+          <w:tcPr/>
+          <w:p>
+            <w:pPr>
+              <w:pStyle w:val="Compact"/>
+            </w:pPr>
+            <w:r>
+              <w:t xml:space="preserve">Pass-through (filters + raw query), tuned</w:t>
+            </w:r>
+          </w:p>
+        </w:tc>
+        <w:tc>
+          <w:tcPr/>
+          <w:p>
+            <w:pPr>
+              <w:pStyle w:val="Compact"/>
+            </w:pPr>
+            <w:r>
+              <w:t xml:space="preserve">0.456</w:t>
+            </w:r>
+          </w:p>
+        </w:tc>
+        <w:tc>
+          <w:tcPr/>
+          <w:p>
+            <w:pPr>
+              <w:pStyle w:val="Compact"/>
+            </w:pPr>
+            <w:r>
+              <w:rPr>
+                <w:b/>
+                <w:bCs/>
+              </w:rPr>
+              <w:t xml:space="preserve">0.641</w:t>
+            </w:r>
+          </w:p>
+        </w:tc>
+        <w:tc>
+          <w:tcPr/>
+          <w:p>
+            <w:pPr>
+              <w:pStyle w:val="Compact"/>
+            </w:pPr>
+            <w:r>
+              <w:t xml:space="preserve">0.713</w:t>
+            </w:r>
+          </w:p>
+        </w:tc>
+        <w:tc>
+          <w:tcPr/>
+          <w:p>
+            <w:pPr>
+              <w:pStyle w:val="Compact"/>
+            </w:pPr>
+            <w:r>
+              <w:t xml:space="preserve">0.68</w:t>
+            </w:r>
+          </w:p>
+        </w:tc>
+        <w:tc>
+          <w:tcPr/>
+          <w:p>
+            <w:pPr>
+              <w:pStyle w:val="Compact"/>
+            </w:pPr>
+            <w:r>
+              <w:rPr>
+                <w:b/>
+                <w:bCs/>
+              </w:rPr>
+              <w:t xml:space="preserve">1.2×</w:t>
+            </w:r>
+          </w:p>
+        </w:tc>
+      </w:tr>
+      <w:tr>
+        <w:tc>
+          <w:tcPr/>
+          <w:p>
+            <w:pPr>
+              <w:pStyle w:val="Compact"/>
+            </w:pPr>
+            <w:r>
+              <w:t xml:space="preserve">Tag-label oracle + filters, tuned</w:t>
+            </w:r>
+          </w:p>
+        </w:tc>
+        <w:tc>
+          <w:tcPr/>
+          <w:p>
+            <w:pPr>
+              <w:pStyle w:val="Compact"/>
+            </w:pPr>
+            <w:r>
+              <w:t xml:space="preserve">0.536</w:t>
+            </w:r>
+          </w:p>
+        </w:tc>
+        <w:tc>
+          <w:tcPr/>
+          <w:p>
+            <w:pPr>
+              <w:pStyle w:val="Compact"/>
+            </w:pPr>
+            <w:r>
+              <w:rPr>
+                <w:b/>
+                <w:bCs/>
+              </w:rPr>
+              <w:t xml:space="preserve">0.728</w:t>
+            </w:r>
+          </w:p>
+        </w:tc>
+        <w:tc>
+          <w:tcPr/>
+          <w:p>
+            <w:pPr>
+              <w:pStyle w:val="Compact"/>
+            </w:pPr>
+            <w:r>
+              <w:t xml:space="preserve">0.765</w:t>
+            </w:r>
+          </w:p>
+        </w:tc>
+        <w:tc>
+          <w:tcPr/>
+          <w:p>
+            <w:pPr>
+              <w:pStyle w:val="Compact"/>
+            </w:pPr>
+            <w:r>
+              <w:t xml:space="preserve">0.68</w:t>
+            </w:r>
+          </w:p>
+        </w:tc>
+        <w:tc>
+          <w:tcPr/>
+          <w:p>
+            <w:pPr>
+              <w:pStyle w:val="Compact"/>
+            </w:pPr>
+            <w:r>
+              <w:rPr>
+                <w:b/>
+                <w:bCs/>
+              </w:rPr>
+              <w:t xml:space="preserve">1.1×</w:t>
+            </w:r>
+          </w:p>
+        </w:tc>
+      </w:tr>
+    </w:tbl>
+    <w:p>
+      <w:pPr>
+        <w:pStyle w:val="BodyText"/>
+      </w:pPr>
+      <w:r>
+        <w:rPr>
+          <w:i/>
+          <w:iCs/>
+        </w:rPr>
+        <w:t xml:space="preserve">[DRAFTED — REVIEW; journal §5g]</w:t>
+      </w:r>
+      <w:r>
+        <w:t xml:space="preserve"> </w:t>
+      </w:r>
+      <w:r>
+        <w:t xml:space="preserve">Measured inside the cascade, the pre-filter shows both of its faces at once. On every filtered configuration only 68% of each tag pool survives Stage 2 (</w:t>
+      </w:r>
+      <w:r>
+        <w:t xml:space="preserve">“reachable”</w:t>
+      </w:r>
+      <w:r>
+        <w:t xml:space="preserve">). Part of that is correct narrowing the user asked for —</w:t>
+      </w:r>
+      <w:r>
+        <w:t xml:space="preserve"> </w:t>
+      </w:r>
+      <w:r>
+        <w:t xml:space="preserve">“instants that draw cards”</w:t>
+      </w:r>
+      <w:r>
+        <w:t xml:space="preserve"> </w:t>
+      </w:r>
+      <w:r>
+        <w:t xml:space="preserve">should exclude non-instants, and the tag pool is then the wrong target — but part is inferred narrowing the user did not ask for:</w:t>
+      </w:r>
+      <w:r>
+        <w:t xml:space="preserve"> </w:t>
+      </w:r>
+      <w:r>
+        <w:t xml:space="preserve">“ramp spells”</w:t>
+      </w:r>
+      <w:r>
+        <w:t xml:space="preserve"> </w:t>
+      </w:r>
+      <w:r>
+        <w:t xml:space="preserve">receives a types filter of instant/sorcery and loses 1,784 ramp permanents;</w:t>
+      </w:r>
+      <w:r>
+        <w:t xml:space="preserve"> </w:t>
+      </w:r>
+      <w:r>
+        <w:t xml:space="preserve">“burn spell that deals 3 damage”</w:t>
+      </w:r>
+      <w:r>
+        <w:t xml:space="preserve"> </w:t>
+      </w:r>
+      <w:r>
+        <w:t xml:space="preserve">receives a mana-value filter of exactly 1. Within what Stage 2 admits, however, the tuned embedder ranks well: R-precision over the reachable set reaches 0.64 for the user’s own words and 0.73 for tag vocabulary, and a user reaches 90% of the admitted set within 1.1–1.2× its size, against 3.4× with no filter at all. The pre-filter improves ranking inside the set while reducing coverage of it; the two effects are reported separately because a single number would hide the trade. Both fixes belong to the rewriter: filters should be derived only from constraints the user typed (selective strictness, Section 6.2), and the evaluation target for filtered queries should be the tag pool intersected with the user-explicit constraint.</w:t>
       </w:r>
     </w:p>
     <w:p>

</xml_diff>

<commit_message>
feat(m4): hyde_v2 prompt — concept normalisation + explicit-only filters
- prompts/hyde_v2.yaml: 3-field contract (filters from typed words only,
  concepts in deckbuilder vocabulary, one-sentence hypothetical fallback);
  8 rules / 8 examples / 1,414 request tokens (v1: 11 / 7 / 2,079)
- src/query_rewriter.py: concepts + completion_tokens fields; stop sequences;
  first-JSON-object decode; code-fence stripping
- src/search.py: Stage1Mode.CONCEPTS; canonical-keyword guard
- scripts/evaluate.py: retrieval.prompt, Stage 1 token/latency logging
- scripts/probes/prompt_size.py; configs/cascade_v2_*
- rows 51-53: v2 concepts + SQL R-prec 0.558 (v1 passthrough 0.456, v1 hyde
  0.326), reachable 0.68 -> 0.81; journal 5h, paper 5.6 (Table 7)

Co-Authored-By: Claude Fable 5.1 <noreply@anthropic.com>
</commit_message>
<xml_diff>
--- a/docs/thesis/paper-draft.docx
+++ b/docs/thesis/paper-draft.docx
@@ -26,7 +26,7 @@
         <w:t xml:space="preserve">Fall 2026 · CSCI 5953 · CSUSB</w:t>
       </w:r>
     </w:p>
-    <w:bookmarkStart w:id="54" w:name="paper-draft-working-document"/>
+    <w:bookmarkStart w:id="55" w:name="paper-draft-working-document"/>
     <w:p>
       <w:pPr>
         <w:pStyle w:val="Heading1"/>
@@ -1901,7 +1901,7 @@
     </w:p>
     <w:bookmarkEnd w:id="30"/>
     <w:bookmarkEnd w:id="31"/>
-    <w:bookmarkStart w:id="37" w:name="results"/>
+    <w:bookmarkStart w:id="38" w:name="results"/>
     <w:p>
       <w:pPr>
         <w:pStyle w:val="Heading2"/>
@@ -6019,16 +6019,728 @@
         <w:t xml:space="preserve">receives a mana-value filter of exactly 1. Within what Stage 2 admits, however, the tuned embedder ranks well: R-precision over the reachable set reaches 0.64 for the user’s own words and 0.73 for tag vocabulary, and a user reaches 90% of the admitted set within 1.1–1.2× its size, against 3.4× with no filter at all. The pre-filter improves ranking inside the set while reducing coverage of it; the two effects are reported separately because a single number would hide the trade. Both fixes belong to the rewriter: filters should be derived only from constraints the user typed (selective strictness, Section 6.2), and the evaluation target for filtered queries should be the tag pool intersected with the user-explicit constraint.</w:t>
       </w:r>
     </w:p>
+    <w:bookmarkEnd w:id="36"/>
+    <w:bookmarkStart w:id="37" w:name="Xd7629fe6536373a19901c6cdb835a73e2902452"/>
+    <w:p>
+      <w:pPr>
+        <w:pStyle w:val="Heading3"/>
+      </w:pPr>
+      <w:r>
+        <w:t xml:space="preserve">5.6 The v2 rewriter: concept normalisation with explicit-only filters</w:t>
+      </w:r>
+    </w:p>
+    <w:p>
+      <w:pPr>
+        <w:pStyle w:val="FirstParagraph"/>
+      </w:pPr>
+      <w:r>
+        <w:rPr>
+          <w:i/>
+          <w:iCs/>
+        </w:rPr>
+        <w:t xml:space="preserve">[DRAFTED — REVIEW; journal §5h, rows 51–53]</w:t>
+      </w:r>
+    </w:p>
     <w:p>
       <w:pPr>
         <w:pStyle w:val="BodyText"/>
       </w:pPr>
       <w:r>
-        <w:rPr>
-          <w:i/>
-          <w:iCs/>
-        </w:rPr>
-        <w:t xml:space="preserve">[TODO — eval v2: pool top-10 across all logged rows, judge the holes, freeze; pairs_v2 with doc-like anchors and synthetic queries, retrain, re-run grid; hyde_v2 with a one-sentence hypothetical and trimmed rules (measure tokens/latency); Scryfall comparator; direct-tag-lookup ablation (expected to fail on broad tags for the same reason — the argument for embedding over lookup).]</w:t>
+        <w:t xml:space="preserve">The second prompt version implements the Section 6.3 hypothesis directly. The rewriter emits (a) filters derived only from attributes the user literally typed, (b) one to three concept phrases in deckbuilder vocabulary with the community’s standard term preferred (</w:t>
+      </w:r>
+      <w:r>
+        <w:t xml:space="preserve">“board wipe”</w:t>
+      </w:r>
+      <w:r>
+        <w:t xml:space="preserve"> </w:t>
+      </w:r>
+      <w:r>
+        <w:t xml:space="preserve">→</w:t>
+      </w:r>
+      <w:r>
+        <w:t xml:space="preserve"> </w:t>
+      </w:r>
+      <w:r>
+        <w:t xml:space="preserve">“sweeper”</w:t>
+      </w:r>
+      <w:r>
+        <w:t xml:space="preserve">), and (c) a one-sentence hypothetical only when no concept phrase captures the intent. Stage 3 embeds the concept phrases. Measured with the Llama 3.1 tokenizer, the v2 request is 1,414 tokens against 2,079 for v1 (−32%), with 8 rules against 11; the example count did not fall (8 vs 7) because the 8B model needed one demonstration per failure shape that a rule alone did not correct.</w:t>
+      </w:r>
+    </w:p>
+    <w:p>
+      <w:pPr>
+        <w:pStyle w:val="BodyText"/>
+      </w:pPr>
+      <w:r>
+        <w:rPr>
+          <w:b/>
+          <w:bCs/>
+        </w:rPr>
+        <w:t xml:space="preserve">Table 7 — v1 vs v2 on the tuned embedder, filters applied (n = 21 tag-mapped queries).</w:t>
+      </w:r>
+    </w:p>
+    <w:tbl>
+      <w:tblPr>
+        <w:tblStyle w:val="Table"/>
+        <w:tblW w:type="pct" w:w="5000"/>
+        <w:tblLayout w:type="fixed"/>
+        <w:tblLook w:firstRow="1" w:lastRow="0" w:firstColumn="0" w:lastColumn="0" w:noHBand="0" w:noVBand="0" w:val="0020"/>
+      </w:tblPr>
+      <w:tblGrid>
+        <w:gridCol w:w="990"/>
+        <w:gridCol w:w="990"/>
+        <w:gridCol w:w="990"/>
+        <w:gridCol w:w="990"/>
+        <w:gridCol w:w="990"/>
+        <w:gridCol w:w="990"/>
+        <w:gridCol w:w="990"/>
+        <w:gridCol w:w="990"/>
+      </w:tblGrid>
+      <w:tr>
+        <w:trPr>
+          <w:tblHeader w:val="on"/>
+        </w:trPr>
+        <w:tc>
+          <w:tcPr/>
+          <w:p>
+            <w:pPr>
+              <w:pStyle w:val="Compact"/>
+            </w:pPr>
+            <w:r>
+              <w:t xml:space="preserve">Rewriter</w:t>
+            </w:r>
+          </w:p>
+        </w:tc>
+        <w:tc>
+          <w:tcPr/>
+          <w:p>
+            <w:pPr>
+              <w:pStyle w:val="Compact"/>
+            </w:pPr>
+            <w:r>
+              <w:t xml:space="preserve">Query-side text</w:t>
+            </w:r>
+          </w:p>
+        </w:tc>
+        <w:tc>
+          <w:tcPr/>
+          <w:p>
+            <w:pPr>
+              <w:pStyle w:val="Compact"/>
+            </w:pPr>
+            <w:r>
+              <w:t xml:space="preserve">R-prec (full)</w:t>
+            </w:r>
+          </w:p>
+        </w:tc>
+        <w:tc>
+          <w:tcPr/>
+          <w:p>
+            <w:pPr>
+              <w:pStyle w:val="Compact"/>
+            </w:pPr>
+            <w:r>
+              <w:t xml:space="preserve">R-prec (reachable)</w:t>
+            </w:r>
+          </w:p>
+        </w:tc>
+        <w:tc>
+          <w:tcPr/>
+          <w:p>
+            <w:pPr>
+              <w:pStyle w:val="Compact"/>
+            </w:pPr>
+            <w:r>
+              <w:t xml:space="preserve">Reachable</w:t>
+            </w:r>
+          </w:p>
+        </w:tc>
+        <w:tc>
+          <w:tcPr/>
+          <w:p>
+            <w:pPr>
+              <w:pStyle w:val="Compact"/>
+            </w:pPr>
+            <w:r>
+              <w:t xml:space="preserve">P@10</w:t>
+            </w:r>
+          </w:p>
+        </w:tc>
+        <w:tc>
+          <w:tcPr/>
+          <w:p>
+            <w:pPr>
+              <w:pStyle w:val="Compact"/>
+            </w:pPr>
+            <w:r>
+              <w:t xml:space="preserve">MRR</w:t>
+            </w:r>
+          </w:p>
+        </w:tc>
+        <w:tc>
+          <w:tcPr/>
+          <w:p>
+            <w:pPr>
+              <w:pStyle w:val="Compact"/>
+            </w:pPr>
+            <w:r>
+              <w:t xml:space="preserve">Stage 1 latency</w:t>
+            </w:r>
+          </w:p>
+        </w:tc>
+      </w:tr>
+      <w:tr>
+        <w:tc>
+          <w:tcPr/>
+          <w:p>
+            <w:pPr>
+              <w:pStyle w:val="Compact"/>
+            </w:pPr>
+            <w:r>
+              <w:t xml:space="preserve">v1</w:t>
+            </w:r>
+          </w:p>
+        </w:tc>
+        <w:tc>
+          <w:tcPr/>
+          <w:p>
+            <w:pPr>
+              <w:pStyle w:val="Compact"/>
+            </w:pPr>
+            <w:r>
+              <w:t xml:space="preserve">hypothetical paragraph</w:t>
+            </w:r>
+          </w:p>
+        </w:tc>
+        <w:tc>
+          <w:tcPr/>
+          <w:p>
+            <w:pPr>
+              <w:pStyle w:val="Compact"/>
+            </w:pPr>
+            <w:r>
+              <w:t xml:space="preserve">0.326</w:t>
+            </w:r>
+          </w:p>
+        </w:tc>
+        <w:tc>
+          <w:tcPr/>
+          <w:p>
+            <w:pPr>
+              <w:pStyle w:val="Compact"/>
+            </w:pPr>
+            <w:r>
+              <w:t xml:space="preserve">0.517</w:t>
+            </w:r>
+          </w:p>
+        </w:tc>
+        <w:tc>
+          <w:tcPr/>
+          <w:p>
+            <w:pPr>
+              <w:pStyle w:val="Compact"/>
+            </w:pPr>
+            <w:r>
+              <w:t xml:space="preserve">0.68</w:t>
+            </w:r>
+          </w:p>
+        </w:tc>
+        <w:tc>
+          <w:tcPr/>
+          <w:p>
+            <w:pPr>
+              <w:pStyle w:val="Compact"/>
+            </w:pPr>
+            <w:r>
+              <w:t xml:space="preserve">0.088</w:t>
+            </w:r>
+          </w:p>
+        </w:tc>
+        <w:tc>
+          <w:tcPr/>
+          <w:p>
+            <w:pPr>
+              <w:pStyle w:val="Compact"/>
+            </w:pPr>
+            <w:r>
+              <w:t xml:space="preserve">0.270</w:t>
+            </w:r>
+          </w:p>
+        </w:tc>
+        <w:tc>
+          <w:tcPr/>
+          <w:p>
+            <w:pPr>
+              <w:pStyle w:val="Compact"/>
+            </w:pPr>
+            <w:r>
+              <w:t xml:space="preserve">1.19 s</w:t>
+            </w:r>
+          </w:p>
+        </w:tc>
+      </w:tr>
+      <w:tr>
+        <w:tc>
+          <w:tcPr/>
+          <w:p>
+            <w:pPr>
+              <w:pStyle w:val="Compact"/>
+            </w:pPr>
+            <w:r>
+              <w:t xml:space="preserve">v1</w:t>
+            </w:r>
+          </w:p>
+        </w:tc>
+        <w:tc>
+          <w:tcPr/>
+          <w:p>
+            <w:pPr>
+              <w:pStyle w:val="Compact"/>
+            </w:pPr>
+            <w:r>
+              <w:t xml:space="preserve">user’s raw query</w:t>
+            </w:r>
+          </w:p>
+        </w:tc>
+        <w:tc>
+          <w:tcPr/>
+          <w:p>
+            <w:pPr>
+              <w:pStyle w:val="Compact"/>
+            </w:pPr>
+            <w:r>
+              <w:t xml:space="preserve">0.456</w:t>
+            </w:r>
+          </w:p>
+        </w:tc>
+        <w:tc>
+          <w:tcPr/>
+          <w:p>
+            <w:pPr>
+              <w:pStyle w:val="Compact"/>
+            </w:pPr>
+            <w:r>
+              <w:t xml:space="preserve">0.641</w:t>
+            </w:r>
+          </w:p>
+        </w:tc>
+        <w:tc>
+          <w:tcPr/>
+          <w:p>
+            <w:pPr>
+              <w:pStyle w:val="Compact"/>
+            </w:pPr>
+            <w:r>
+              <w:t xml:space="preserve">0.68</w:t>
+            </w:r>
+          </w:p>
+        </w:tc>
+        <w:tc>
+          <w:tcPr/>
+          <w:p>
+            <w:pPr>
+              <w:pStyle w:val="Compact"/>
+            </w:pPr>
+            <w:r>
+              <w:t xml:space="preserve">0.081</w:t>
+            </w:r>
+          </w:p>
+        </w:tc>
+        <w:tc>
+          <w:tcPr/>
+          <w:p>
+            <w:pPr>
+              <w:pStyle w:val="Compact"/>
+            </w:pPr>
+            <w:r>
+              <w:t xml:space="preserve">0.206</w:t>
+            </w:r>
+          </w:p>
+        </w:tc>
+        <w:tc>
+          <w:tcPr/>
+          <w:p>
+            <w:pPr>
+              <w:pStyle w:val="Compact"/>
+            </w:pPr>
+            <w:r>
+              <w:t xml:space="preserve">1.06 s</w:t>
+            </w:r>
+          </w:p>
+        </w:tc>
+      </w:tr>
+      <w:tr>
+        <w:tc>
+          <w:tcPr/>
+          <w:p>
+            <w:pPr>
+              <w:pStyle w:val="Compact"/>
+            </w:pPr>
+            <w:r>
+              <w:rPr>
+                <w:b/>
+                <w:bCs/>
+              </w:rPr>
+              <w:t xml:space="preserve">v2</w:t>
+            </w:r>
+          </w:p>
+        </w:tc>
+        <w:tc>
+          <w:tcPr/>
+          <w:p>
+            <w:pPr>
+              <w:pStyle w:val="Compact"/>
+            </w:pPr>
+            <w:r>
+              <w:rPr>
+                <w:b/>
+                <w:bCs/>
+              </w:rPr>
+              <w:t xml:space="preserve">concept phrases</w:t>
+            </w:r>
+          </w:p>
+        </w:tc>
+        <w:tc>
+          <w:tcPr/>
+          <w:p>
+            <w:pPr>
+              <w:pStyle w:val="Compact"/>
+            </w:pPr>
+            <w:r>
+              <w:rPr>
+                <w:b/>
+                <w:bCs/>
+              </w:rPr>
+              <w:t xml:space="preserve">0.558</w:t>
+            </w:r>
+          </w:p>
+        </w:tc>
+        <w:tc>
+          <w:tcPr/>
+          <w:p>
+            <w:pPr>
+              <w:pStyle w:val="Compact"/>
+            </w:pPr>
+            <w:r>
+              <w:rPr>
+                <w:b/>
+                <w:bCs/>
+              </w:rPr>
+              <w:t xml:space="preserve">0.693</w:t>
+            </w:r>
+          </w:p>
+        </w:tc>
+        <w:tc>
+          <w:tcPr/>
+          <w:p>
+            <w:pPr>
+              <w:pStyle w:val="Compact"/>
+            </w:pPr>
+            <w:r>
+              <w:rPr>
+                <w:b/>
+                <w:bCs/>
+              </w:rPr>
+              <w:t xml:space="preserve">0.81</w:t>
+            </w:r>
+          </w:p>
+        </w:tc>
+        <w:tc>
+          <w:tcPr/>
+          <w:p>
+            <w:pPr>
+              <w:pStyle w:val="Compact"/>
+            </w:pPr>
+            <w:r>
+              <w:t xml:space="preserve">0.096</w:t>
+            </w:r>
+          </w:p>
+        </w:tc>
+        <w:tc>
+          <w:tcPr/>
+          <w:p>
+            <w:pPr>
+              <w:pStyle w:val="Compact"/>
+            </w:pPr>
+            <w:r>
+              <w:t xml:space="preserve">0.234</w:t>
+            </w:r>
+          </w:p>
+        </w:tc>
+        <w:tc>
+          <w:tcPr/>
+          <w:p>
+            <w:pPr>
+              <w:pStyle w:val="Compact"/>
+            </w:pPr>
+            <w:r>
+              <w:t xml:space="preserve">1.38 s</w:t>
+            </w:r>
+          </w:p>
+        </w:tc>
+      </w:tr>
+      <w:tr>
+        <w:tc>
+          <w:tcPr/>
+          <w:p>
+            <w:pPr>
+              <w:pStyle w:val="Compact"/>
+            </w:pPr>
+            <w:r>
+              <w:t xml:space="preserve">v2</w:t>
+            </w:r>
+          </w:p>
+        </w:tc>
+        <w:tc>
+          <w:tcPr/>
+          <w:p>
+            <w:pPr>
+              <w:pStyle w:val="Compact"/>
+            </w:pPr>
+            <w:r>
+              <w:t xml:space="preserve">one-sentence hypothetical</w:t>
+            </w:r>
+          </w:p>
+        </w:tc>
+        <w:tc>
+          <w:tcPr/>
+          <w:p>
+            <w:pPr>
+              <w:pStyle w:val="Compact"/>
+            </w:pPr>
+            <w:r>
+              <w:t xml:space="preserve">0.533</w:t>
+            </w:r>
+          </w:p>
+        </w:tc>
+        <w:tc>
+          <w:tcPr/>
+          <w:p>
+            <w:pPr>
+              <w:pStyle w:val="Compact"/>
+            </w:pPr>
+            <w:r>
+              <w:t xml:space="preserve">0.625</w:t>
+            </w:r>
+          </w:p>
+        </w:tc>
+        <w:tc>
+          <w:tcPr/>
+          <w:p>
+            <w:pPr>
+              <w:pStyle w:val="Compact"/>
+            </w:pPr>
+            <w:r>
+              <w:t xml:space="preserve">0.81</w:t>
+            </w:r>
+          </w:p>
+        </w:tc>
+        <w:tc>
+          <w:tcPr/>
+          <w:p>
+            <w:pPr>
+              <w:pStyle w:val="Compact"/>
+            </w:pPr>
+            <w:r>
+              <w:t xml:space="preserve">0.085</w:t>
+            </w:r>
+          </w:p>
+        </w:tc>
+        <w:tc>
+          <w:tcPr/>
+          <w:p>
+            <w:pPr>
+              <w:pStyle w:val="Compact"/>
+            </w:pPr>
+            <w:r>
+              <w:t xml:space="preserve">0.153</w:t>
+            </w:r>
+          </w:p>
+        </w:tc>
+        <w:tc>
+          <w:tcPr/>
+          <w:p>
+            <w:pPr>
+              <w:pStyle w:val="Compact"/>
+            </w:pPr>
+            <w:r>
+              <w:t xml:space="preserve">1.39 s</w:t>
+            </w:r>
+          </w:p>
+        </w:tc>
+      </w:tr>
+      <w:tr>
+        <w:tc>
+          <w:tcPr/>
+          <w:p>
+            <w:pPr>
+              <w:pStyle w:val="Compact"/>
+            </w:pPr>
+            <w:r>
+              <w:t xml:space="preserve">—</w:t>
+            </w:r>
+          </w:p>
+        </w:tc>
+        <w:tc>
+          <w:tcPr/>
+          <w:p>
+            <w:pPr>
+              <w:pStyle w:val="Compact"/>
+            </w:pPr>
+            <w:r>
+              <w:t xml:space="preserve">tag-label oracle (ceiling)</w:t>
+            </w:r>
+          </w:p>
+        </w:tc>
+        <w:tc>
+          <w:tcPr/>
+          <w:p>
+            <w:pPr>
+              <w:pStyle w:val="Compact"/>
+            </w:pPr>
+            <w:r>
+              <w:t xml:space="preserve">0.536</w:t>
+            </w:r>
+          </w:p>
+        </w:tc>
+        <w:tc>
+          <w:tcPr/>
+          <w:p>
+            <w:pPr>
+              <w:pStyle w:val="Compact"/>
+            </w:pPr>
+            <w:r>
+              <w:t xml:space="preserve">0.728</w:t>
+            </w:r>
+          </w:p>
+        </w:tc>
+        <w:tc>
+          <w:tcPr/>
+          <w:p>
+            <w:pPr>
+              <w:pStyle w:val="Compact"/>
+            </w:pPr>
+            <w:r>
+              <w:t xml:space="preserve">0.68</w:t>
+            </w:r>
+          </w:p>
+        </w:tc>
+        <w:tc>
+          <w:tcPr/>
+          <w:p>
+            <w:pPr>
+              <w:pStyle w:val="Compact"/>
+            </w:pPr>
+            <w:r>
+              <w:t xml:space="preserve">0.073</w:t>
+            </w:r>
+          </w:p>
+        </w:tc>
+        <w:tc>
+          <w:tcPr/>
+          <w:p>
+            <w:pPr>
+              <w:pStyle w:val="Compact"/>
+            </w:pPr>
+            <w:r>
+              <w:t xml:space="preserve">0.153</w:t>
+            </w:r>
+          </w:p>
+        </w:tc>
+        <w:tc>
+          <w:tcPr/>
+          <w:p>
+            <w:pPr>
+              <w:pStyle w:val="Compact"/>
+            </w:pPr>
+            <w:r>
+              <w:t xml:space="preserve">—</w:t>
+            </w:r>
+          </w:p>
+        </w:tc>
+      </w:tr>
+    </w:tbl>
+    <w:p>
+      <w:pPr>
+        <w:pStyle w:val="BodyText"/>
+      </w:pPr>
+      <w:r>
+        <w:t xml:space="preserve">Explicit-only filtering raised coverage from 68% to 81% of each target set —</w:t>
+      </w:r>
+      <w:r>
+        <w:t xml:space="preserve"> </w:t>
+      </w:r>
+      <w:r>
+        <w:t xml:space="preserve">“ramp spells”</w:t>
+      </w:r>
+      <w:r>
+        <w:t xml:space="preserve">,</w:t>
+      </w:r>
+      <w:r>
+        <w:t xml:space="preserve"> </w:t>
+      </w:r>
+      <w:r>
+        <w:t xml:space="preserve">“mana dorks”</w:t>
+      </w:r>
+      <w:r>
+        <w:t xml:space="preserve">,</w:t>
+      </w:r>
+      <w:r>
+        <w:t xml:space="preserve"> </w:t>
+      </w:r>
+      <w:r>
+        <w:t xml:space="preserve">“board wipes”</w:t>
+      </w:r>
+      <w:r>
+        <w:t xml:space="preserve">, and</w:t>
+      </w:r>
+      <w:r>
+        <w:t xml:space="preserve"> </w:t>
+      </w:r>
+      <w:r>
+        <w:t xml:space="preserve">“burn spell”</w:t>
+      </w:r>
+      <w:r>
+        <w:t xml:space="preserve"> </w:t>
+      </w:r>
+      <w:r>
+        <w:t xml:space="preserve">no longer receive an inferred type or cost — and concept phrases outrank both the paragraph-length and the one-sentence hypothetical on the same filters. The v2 cascade is the strongest real configuration measured, and on full-pool R-precision it exceeds the hand-mapped oracle because it over-narrows less. Archetype precision is flat, as expected once ranking-by-popularity is treated as a separate sort. Two residual failures are knowledge-gap cases the 27B comparison predicted:</w:t>
+      </w:r>
+      <w:r>
+        <w:t xml:space="preserve"> </w:t>
+      </w:r>
+      <w:r>
+        <w:t xml:space="preserve">“destroy target artifact”</w:t>
+      </w:r>
+      <w:r>
+        <w:t xml:space="preserve"> </w:t>
+      </w:r>
+      <w:r>
+        <w:t xml:space="preserve">still receives an inferred instant filter, and</w:t>
+      </w:r>
+      <w:r>
+        <w:t xml:space="preserve"> </w:t>
+      </w:r>
+      <w:r>
+        <w:t xml:space="preserve">“red pingers”</w:t>
+      </w:r>
+      <w:r>
+        <w:t xml:space="preserve"> </w:t>
+      </w:r>
+      <w:r>
+        <w:t xml:space="preserve">receives an invented Flying keyword. Latency did not fall with the shorter prompt: the inference server caches the shared prompt prefix, so per-query cost is dominated by output tokens (about 62), which v2’s three-field JSON did not reduce; trimming null fields from the output is the obvious next step, and the simplification claim is stated here in request tokens and rule count rather than wall-clock time.</w:t>
+      </w:r>
+    </w:p>
+    <w:p>
+      <w:pPr>
+        <w:pStyle w:val="BodyText"/>
+      </w:pPr>
+      <w:r>
+        <w:rPr>
+          <w:i/>
+          <w:iCs/>
+        </w:rPr>
+        <w:t xml:space="preserve">[TODO — v2 on the base embedder (completes the 2×2); omit-null output rule and re-measure latency; eval v2: pool top-10 across all logged rows, judge the holes, freeze; pairs_v2 with doc-like anchors and synthetic queries, retrain, re-run grid; hyde_v2 with a one-sentence hypothetical and trimmed rules (measure tokens/latency); Scryfall comparator; direct-tag-lookup ablation (expected to fail on broad tags for the same reason — the argument for embedding over lookup).]</w:t>
       </w:r>
     </w:p>
     <w:p>
@@ -6038,9 +6750,9 @@
         </w:pict>
       </w:r>
     </w:p>
-    <w:bookmarkEnd w:id="36"/>
     <w:bookmarkEnd w:id="37"/>
-    <w:bookmarkStart w:id="44" w:name="discussion"/>
+    <w:bookmarkEnd w:id="38"/>
+    <w:bookmarkStart w:id="45" w:name="discussion"/>
     <w:p>
       <w:pPr>
         <w:pStyle w:val="Heading2"/>
@@ -6049,7 +6761,7 @@
         <w:t xml:space="preserve">6. Discussion</w:t>
       </w:r>
     </w:p>
-    <w:bookmarkStart w:id="38" w:name="Xce591a7134eaebe21be78c40822d47fa68684e3"/>
+    <w:bookmarkStart w:id="39" w:name="Xce591a7134eaebe21be78c40822d47fa68684e3"/>
     <w:p>
       <w:pPr>
         <w:pStyle w:val="Heading3"/>
@@ -6174,8 +6886,8 @@
         <w:t xml:space="preserve">are semantically equivalent. The reminder-text corpus augmentation partially addresses the corpus side but does not resolve the query-side asymmetry.</w:t>
       </w:r>
     </w:p>
-    <w:bookmarkEnd w:id="38"/>
-    <w:bookmarkStart w:id="39" w:name="the-selective-strictness-design-decision"/>
+    <w:bookmarkEnd w:id="39"/>
+    <w:bookmarkStart w:id="40" w:name="the-selective-strictness-design-decision"/>
     <w:p>
       <w:pPr>
         <w:pStyle w:val="Heading3"/>
@@ -6220,8 +6932,8 @@
         <w:t xml:space="preserve">Selective strictness offers the best tradeoff for this cascade. It preserves the recall benefit of pre-filtering on genuinely-constrained queries while limiting the blast radius of the model’s inference errors. It also requires distinguishing user-explicit from model-inferred in the pipeline, which is a small structural addition to the HyDE output contract.</w:t>
       </w:r>
     </w:p>
-    <w:bookmarkEnd w:id="39"/>
-    <w:bookmarkStart w:id="40" w:name="the-path-toward-fine-tuning"/>
+    <w:bookmarkEnd w:id="40"/>
+    <w:bookmarkStart w:id="41" w:name="the-path-toward-fine-tuning"/>
     <w:p>
       <w:pPr>
         <w:pStyle w:val="Heading3"/>
@@ -6435,8 +7147,8 @@
         <w:t xml:space="preserve">The order of operations is: tag ingestion first (done); the base-embedder control run through the full cascade second, so every fine-tuning claim has a before-number; embedder fine-tuning third; the v2 prompt fourth; HyDE LoRA only if measurements demand it.</w:t>
       </w:r>
     </w:p>
-    <w:bookmarkEnd w:id="40"/>
-    <w:bookmarkStart w:id="41" w:name="Xc99c7a51214e20f050a67b5431e6bbe9542439f"/>
+    <w:bookmarkEnd w:id="41"/>
+    <w:bookmarkStart w:id="42" w:name="Xc99c7a51214e20f050a67b5431e6bbe9542439f"/>
     <w:p>
       <w:pPr>
         <w:pStyle w:val="Heading3"/>
@@ -6511,8 +7223,8 @@
         <w:t xml:space="preserve">or merely memorised a vocabulary list. The accessibility claim (Section 1.1) and the generalisation claim reinforce each other — parity with expert Scryfall on tagged concepts, plus coverage beyond them.</w:t>
       </w:r>
     </w:p>
-    <w:bookmarkEnd w:id="41"/>
-    <w:bookmarkStart w:id="42" w:name="X0a7ec6647493993060fb580e195ef7c4d3d4e81"/>
+    <w:bookmarkEnd w:id="42"/>
+    <w:bookmarkStart w:id="43" w:name="X0a7ec6647493993060fb580e195ef7c4d3d4e81"/>
     <w:p>
       <w:pPr>
         <w:pStyle w:val="Heading3"/>
@@ -6579,8 +7291,8 @@
         <w:t xml:space="preserve">field can be modified in place before being passed to the search orchestrator without any pipeline change. The pattern reinforces the accessibility framing — non-experts get LLM-driven filter proposals, experts can override and refine.</w:t>
       </w:r>
     </w:p>
-    <w:bookmarkEnd w:id="42"/>
-    <w:bookmarkStart w:id="43" w:name="limitations"/>
+    <w:bookmarkEnd w:id="43"/>
+    <w:bookmarkStart w:id="44" w:name="limitations"/>
     <w:p>
       <w:pPr>
         <w:pStyle w:val="Heading3"/>
@@ -6838,9 +7550,9 @@
         </w:pict>
       </w:r>
     </w:p>
-    <w:bookmarkEnd w:id="43"/>
     <w:bookmarkEnd w:id="44"/>
-    <w:bookmarkStart w:id="47" w:name="conclusion-and-future-work"/>
+    <w:bookmarkEnd w:id="45"/>
+    <w:bookmarkStart w:id="48" w:name="conclusion-and-future-work"/>
     <w:p>
       <w:pPr>
         <w:pStyle w:val="Heading2"/>
@@ -6849,7 +7561,7 @@
         <w:t xml:space="preserve">7. Conclusion and Future Work</w:t>
       </w:r>
     </w:p>
-    <w:bookmarkStart w:id="45" w:name="conclusion"/>
+    <w:bookmarkStart w:id="46" w:name="conclusion"/>
     <w:p>
       <w:pPr>
         <w:pStyle w:val="Heading3"/>
@@ -6878,8 +7590,8 @@
         <w:t xml:space="preserve">This work presents a three-stage retrieval cascade for natural-language semantic search over a bounded consumer catalog, using MTG as the test bed. The cascade combines HyDE-style query rewriting, structured SQL pre-filtering, and dense vector search inside the pre-filtered candidate set. Development surfaced concrete failure modes of the base approach — jargon knowledge gaps, over-narrowing on keyword filters, compositional attention drift — most of which are resolved by moving to a larger base model but persist as evidence that domain-specific fine-tuning is the natural next intervention. The methodological framing (outcome comparison against a domain-standard tool rather than diff against an internal baseline) and the accessibility contribution (bringing expert-level search results to non-expert users) are the paper’s core arguments.</w:t>
       </w:r>
     </w:p>
-    <w:bookmarkEnd w:id="45"/>
-    <w:bookmarkStart w:id="46" w:name="future-work"/>
+    <w:bookmarkEnd w:id="46"/>
+    <w:bookmarkStart w:id="47" w:name="future-work"/>
     <w:p>
       <w:pPr>
         <w:pStyle w:val="Heading3"/>
@@ -7025,9 +7737,9 @@
         </w:pict>
       </w:r>
     </w:p>
-    <w:bookmarkEnd w:id="46"/>
     <w:bookmarkEnd w:id="47"/>
-    <w:bookmarkStart w:id="48" w:name="references"/>
+    <w:bookmarkEnd w:id="48"/>
+    <w:bookmarkStart w:id="49" w:name="references"/>
     <w:p>
       <w:pPr>
         <w:pStyle w:val="Heading2"/>
@@ -7332,8 +8044,8 @@
         </w:pict>
       </w:r>
     </w:p>
-    <w:bookmarkEnd w:id="48"/>
-    <w:bookmarkStart w:id="53" w:name="appendices"/>
+    <w:bookmarkEnd w:id="49"/>
+    <w:bookmarkStart w:id="54" w:name="appendices"/>
     <w:p>
       <w:pPr>
         <w:pStyle w:val="Heading2"/>
@@ -7342,7 +8054,7 @@
         <w:t xml:space="preserve">Appendices</w:t>
       </w:r>
     </w:p>
-    <w:bookmarkStart w:id="49" w:name="appendix-a-hyde-prompt-v1"/>
+    <w:bookmarkStart w:id="50" w:name="appendix-a-hyde-prompt-v1"/>
     <w:p>
       <w:pPr>
         <w:pStyle w:val="Heading3"/>
@@ -7392,8 +8104,8 @@
         <w:t xml:space="preserve">verbatim in the appendix. Full system prompt with schema, rules, few-shot examples.]</w:t>
       </w:r>
     </w:p>
-    <w:bookmarkEnd w:id="49"/>
-    <w:bookmarkStart w:id="50" w:name="appendix-b-evaluation-set"/>
+    <w:bookmarkEnd w:id="50"/>
+    <w:bookmarkStart w:id="51" w:name="appendix-b-evaluation-set"/>
     <w:p>
       <w:pPr>
         <w:pStyle w:val="Heading3"/>
@@ -7443,8 +8155,8 @@
         <w:t xml:space="preserve">— the 26 queries with tri-state relevance judgments.]</w:t>
       </w:r>
     </w:p>
-    <w:bookmarkEnd w:id="50"/>
-    <w:bookmarkStart w:id="51" w:name="appendix-c-per-query-results"/>
+    <w:bookmarkEnd w:id="51"/>
+    <w:bookmarkStart w:id="52" w:name="appendix-c-per-query-results"/>
     <w:p>
       <w:pPr>
         <w:pStyle w:val="Heading3"/>
@@ -7465,8 +8177,8 @@
         <w:t xml:space="preserve">[TODO — populated after M5 measurements land. Full recall@10 and MRR per (query, configuration) pair.]</w:t>
       </w:r>
     </w:p>
-    <w:bookmarkEnd w:id="51"/>
-    <w:bookmarkStart w:id="52" w:name="appendix-d-failure-mode-test-series"/>
+    <w:bookmarkEnd w:id="52"/>
+    <w:bookmarkStart w:id="53" w:name="appendix-d-failure-mode-test-series"/>
     <w:p>
       <w:pPr>
         <w:pStyle w:val="Heading3"/>
@@ -7487,9 +8199,9 @@
         <w:t xml:space="preserve">[The 10 diagnostic test queries used to characterize the base HyDE model’s failure modes (Section 5.1), with full HyDE output for each and side-by-side comparison against the larger model (Section 5.2).]</w:t>
       </w:r>
     </w:p>
-    <w:bookmarkEnd w:id="52"/>
     <w:bookmarkEnd w:id="53"/>
     <w:bookmarkEnd w:id="54"/>
+    <w:bookmarkEnd w:id="55"/>
     <w:sectPr>
       <w:footnotePr>
         <w:numRestart w:val="eachSect"/>

</xml_diff>

<commit_message>
feat: versioned card_embeddings (migration 0004), v2 omit-nulls, 2x2 completed, dashboard model selector
- 0004_card_embeddings.sql: vectors per (face, embedding_version); base + tuned coexist
- embed.py upserts per version; Searcher(embedding_model=) pins any version
- dashboard: embedder selector, EDHREC sort, load-more paging (was silently
  returning nothing: pinned base while DB held tuned)
- hyde_v2: omit unset fields -> Stage 1 1,384 -> 772 ms, 62 -> 28 out tokens;
  colors [] is no constraint unless op=exactly (zeroed a query)
- rows 56-61: v2 on base 0.163 vs tuned 0.510 R-prec — fine-tuning is what makes
  the lighter rewriter viable; journal 5i, paper Table 8

Co-Authored-By: Claude Fable 5.1 <noreply@anthropic.com>
</commit_message>
<xml_diff>
--- a/docs/thesis/paper-draft.docx
+++ b/docs/thesis/paper-draft.docx
@@ -6737,10 +6737,190 @@
       </w:pPr>
       <w:r>
         <w:rPr>
-          <w:i/>
-          <w:iCs/>
-        </w:rPr>
-        <w:t xml:space="preserve">[TODO — v2 on the base embedder (completes the 2×2); omit-null output rule and re-measure latency; eval v2: pool top-10 across all logged rows, judge the holes, freeze; pairs_v2 with doc-like anchors and synthetic queries, retrain, re-run grid; hyde_v2 with a one-sentence hypothetical and trimmed rules (measure tokens/latency); Scryfall comparator; direct-tag-lookup ablation (expected to fail on broad tags for the same reason — the argument for embedding over lookup).]</w:t>
+          <w:b/>
+          <w:bCs/>
+        </w:rPr>
+        <w:t xml:space="preserve">Table 8 — Rewriter × embedder (R-precision against tag pools, filters applied, n = 21).</w:t>
+      </w:r>
+    </w:p>
+    <w:tbl>
+      <w:tblPr>
+        <w:tblStyle w:val="Table"/>
+        <w:tblW w:type="pct" w:w="5000"/>
+        <w:tblLayout w:type="fixed"/>
+        <w:tblLook w:firstRow="1" w:lastRow="0" w:firstColumn="0" w:lastColumn="0" w:noHBand="0" w:noVBand="0" w:val="0020"/>
+      </w:tblPr>
+      <w:tblGrid>
+        <w:gridCol w:w="2640"/>
+        <w:gridCol w:w="2640"/>
+        <w:gridCol w:w="2640"/>
+      </w:tblGrid>
+      <w:tr>
+        <w:trPr>
+          <w:tblHeader w:val="on"/>
+        </w:trPr>
+        <w:tc>
+          <w:tcPr/>
+          <w:p>
+            <w:pPr>
+              <w:pStyle w:val="Compact"/>
+            </w:pPr>
+          </w:p>
+        </w:tc>
+        <w:tc>
+          <w:tcPr/>
+          <w:p>
+            <w:pPr>
+              <w:pStyle w:val="Compact"/>
+            </w:pPr>
+            <w:r>
+              <w:t xml:space="preserve">Base embedder</w:t>
+            </w:r>
+          </w:p>
+        </w:tc>
+        <w:tc>
+          <w:tcPr/>
+          <w:p>
+            <w:pPr>
+              <w:pStyle w:val="Compact"/>
+            </w:pPr>
+            <w:r>
+              <w:t xml:space="preserve">Tuned embedder</w:t>
+            </w:r>
+          </w:p>
+        </w:tc>
+      </w:tr>
+      <w:tr>
+        <w:tc>
+          <w:tcPr/>
+          <w:p>
+            <w:pPr>
+              <w:pStyle w:val="Compact"/>
+            </w:pPr>
+            <w:r>
+              <w:t xml:space="preserve">v1 rewriter (hypothetical paragraph)</w:t>
+            </w:r>
+          </w:p>
+        </w:tc>
+        <w:tc>
+          <w:tcPr/>
+          <w:p>
+            <w:pPr>
+              <w:pStyle w:val="Compact"/>
+            </w:pPr>
+            <w:r>
+              <w:t xml:space="preserve">0.215</w:t>
+            </w:r>
+          </w:p>
+        </w:tc>
+        <w:tc>
+          <w:tcPr/>
+          <w:p>
+            <w:pPr>
+              <w:pStyle w:val="Compact"/>
+            </w:pPr>
+            <w:r>
+              <w:t xml:space="preserve">0.326</w:t>
+            </w:r>
+          </w:p>
+        </w:tc>
+      </w:tr>
+      <w:tr>
+        <w:tc>
+          <w:tcPr/>
+          <w:p>
+            <w:pPr>
+              <w:pStyle w:val="Compact"/>
+            </w:pPr>
+            <w:r>
+              <w:t xml:space="preserve">v2 rewriter (concept phrases, explicit-only filters)</w:t>
+            </w:r>
+          </w:p>
+        </w:tc>
+        <w:tc>
+          <w:tcPr/>
+          <w:p>
+            <w:pPr>
+              <w:pStyle w:val="Compact"/>
+            </w:pPr>
+            <w:r>
+              <w:t xml:space="preserve">0.163</w:t>
+            </w:r>
+          </w:p>
+        </w:tc>
+        <w:tc>
+          <w:tcPr/>
+          <w:p>
+            <w:pPr>
+              <w:pStyle w:val="Compact"/>
+            </w:pPr>
+            <w:r>
+              <w:rPr>
+                <w:b/>
+                <w:bCs/>
+              </w:rPr>
+              <w:t xml:space="preserve">0.510</w:t>
+            </w:r>
+          </w:p>
+        </w:tc>
+      </w:tr>
+    </w:tbl>
+    <w:p>
+      <w:pPr>
+        <w:pStyle w:val="BodyText"/>
+      </w:pPr>
+      <w:r>
+        <w:rPr>
+          <w:i/>
+          <w:iCs/>
+        </w:rPr>
+        <w:t xml:space="preserve">[DRAFTED — REVIEW; journal §5i]</w:t>
+      </w:r>
+      <w:r>
+        <w:t xml:space="preserve"> </w:t>
+      </w:r>
+      <w:r>
+        <w:t xml:space="preserve">The two interventions are not independent. On the base encoder the lighter v2 rewriter is</w:t>
+      </w:r>
+      <w:r>
+        <w:t xml:space="preserve"> </w:t>
+      </w:r>
+      <w:r>
+        <w:rPr>
+          <w:i/>
+          <w:iCs/>
+        </w:rPr>
+        <w:t xml:space="preserve">worse</w:t>
+      </w:r>
+      <w:r>
+        <w:t xml:space="preserve"> </w:t>
+      </w:r>
+      <w:r>
+        <w:t xml:space="preserve">than v1: a bare concept phrase such as</w:t>
+      </w:r>
+      <w:r>
+        <w:t xml:space="preserve"> </w:t>
+      </w:r>
+      <w:r>
+        <w:t xml:space="preserve">“ramp”</w:t>
+      </w:r>
+      <w:r>
+        <w:t xml:space="preserve"> </w:t>
+      </w:r>
+      <w:r>
+        <w:t xml:space="preserve">carries no signal for an encoder that never learned the domain’s vocabulary, whereas a paragraph of hypothetical rules text at least overlaps lexically with card text. On the tuned encoder the same rewriter is the strongest configuration measured. Fine-tuning the encoder is what makes the simpler, cheaper rewriter viable; neither half delivers the result alone. With a final output rule that omits unset fields, the v2 rewriter produces about 28 output tokens per query and runs in 0.77 s on the same 8B model, against 1.19 s for v1 — the simplification claim now holds in wall-clock terms as well as in request size, at a cost of a few queries whose filters shifted under the changed prompt (R-precision 0.558 → 0.510 on the tuned encoder across that change).</w:t>
+      </w:r>
+    </w:p>
+    <w:p>
+      <w:pPr>
+        <w:pStyle w:val="BodyText"/>
+      </w:pPr>
+      <w:r>
+        <w:rPr>
+          <w:i/>
+          <w:iCs/>
+        </w:rPr>
+        <w:t xml:space="preserve">[TODO — eval v2: pool top-10 across all logged rows, judge the holes, freeze; pairs_v2 with doc-like anchors and synthetic queries, retrain, re-run grid; hyde_v2 with a one-sentence hypothetical and trimmed rules (measure tokens/latency); Scryfall comparator; direct-tag-lookup ablation (expected to fail on broad tags for the same reason — the argument for embedding over lookup).]</w:t>
       </w:r>
     </w:p>
     <w:p>

</xml_diff>

<commit_message>
feat(m5): Scryfall comparator — expert-query result parity + query complexity
- data/eval/scryfall_expert_queries_v1.yaml: 26 queries x {expert (otag), no_tag}
  (Claude-drafted, Mitchell reviews); result sets cached locally (gitignored,
  ~2 MB) with a committed manifest of queries/counts/fetch dates
- scripts/scryfall_comparator.py: fetch (1 req/s, paged) + compare
  (R-prec / Jaccard / depth90 vs Scryfall set, Scryfall set vs judgments,
  syntactic complexity proxy) -> experiment_runs kind scryfall_comparator
- evaluate.py stores ranking_top (2000 ids) for every query with set_metrics
- rows 72-79: v2+tuned+kw parity 0.565 / Jaccard 0.49 / depth90 0.95x;
  control 0.343; expert sets 11% precision vs judgments; 3.8 words vs 20/59 chars
- journal 5j, paper 5.7 (Tables 9-10), CLAUDE.md quick ref

Co-Authored-By: Claude Fable 5.1 <noreply@anthropic.com>
</commit_message>
<xml_diff>
--- a/docs/thesis/paper-draft.docx
+++ b/docs/thesis/paper-draft.docx
@@ -26,7 +26,7 @@
         <w:t xml:space="preserve">Fall 2026 · CSCI 5953 · CSUSB</w:t>
       </w:r>
     </w:p>
-    <w:bookmarkStart w:id="55" w:name="paper-draft-working-document"/>
+    <w:bookmarkStart w:id="56" w:name="paper-draft-working-document"/>
     <w:p>
       <w:pPr>
         <w:pStyle w:val="Heading1"/>
@@ -1901,7 +1901,7 @@
     </w:p>
     <w:bookmarkEnd w:id="30"/>
     <w:bookmarkEnd w:id="31"/>
-    <w:bookmarkStart w:id="38" w:name="results"/>
+    <w:bookmarkStart w:id="39" w:name="results"/>
     <w:p>
       <w:pPr>
         <w:pStyle w:val="Heading2"/>
@@ -6911,6 +6911,721 @@
         <w:t xml:space="preserve">carries no signal for an encoder that never learned the domain’s vocabulary, whereas a paragraph of hypothetical rules text at least overlaps lexically with card text. On the tuned encoder the same rewriter is the strongest configuration measured. Fine-tuning the encoder is what makes the simpler, cheaper rewriter viable; neither half delivers the result alone. With a final output rule that omits unset fields, the v2 rewriter produces about 28 output tokens per query and runs in 0.77 s on the same 8B model, against 1.19 s for v1 — the simplification claim now holds in wall-clock terms as well as in request size, at a cost of a few queries whose filters shifted under the changed prompt (R-precision 0.558 → 0.510 on the tuned encoder across that change).</w:t>
       </w:r>
     </w:p>
+    <w:bookmarkEnd w:id="37"/>
+    <w:bookmarkStart w:id="38" w:name="Xc93ff6dc18d1f6f4df9418022c4e5c4e958e024"/>
+    <w:p>
+      <w:pPr>
+        <w:pStyle w:val="Heading3"/>
+      </w:pPr>
+      <w:r>
+        <w:t xml:space="preserve">5.7 Comparison against expert Scryfall queries</w:t>
+      </w:r>
+    </w:p>
+    <w:p>
+      <w:pPr>
+        <w:pStyle w:val="FirstParagraph"/>
+      </w:pPr>
+      <w:r>
+        <w:rPr>
+          <w:i/>
+          <w:iCs/>
+        </w:rPr>
+        <w:t xml:space="preserve">[DRAFTED — REVIEW; journal §5j, rows 72–79. Expert queries in</w:t>
+      </w:r>
+      <w:r>
+        <w:rPr>
+          <w:i/>
+          <w:iCs/>
+        </w:rPr>
+        <w:t xml:space="preserve"> </w:t>
+      </w:r>
+      <w:r>
+        <w:rPr>
+          <w:rStyle w:val="VerbatimChar"/>
+          <w:i/>
+          <w:iCs/>
+        </w:rPr>
+        <w:t xml:space="preserve">data/eval/scryfall_expert_queries_v1.yaml</w:t>
+      </w:r>
+      <w:r>
+        <w:rPr>
+          <w:i/>
+          <w:iCs/>
+        </w:rPr>
+        <w:t xml:space="preserve"> </w:t>
+      </w:r>
+      <w:r>
+        <w:rPr>
+          <w:i/>
+          <w:iCs/>
+        </w:rPr>
+        <w:t xml:space="preserve">are LLM-drafted and reviewed by the author; result sets fetched 2026-09-22.]</w:t>
+      </w:r>
+    </w:p>
+    <w:p>
+      <w:pPr>
+        <w:pStyle w:val="BodyText"/>
+      </w:pPr>
+      <w:r>
+        <w:t xml:space="preserve">For each evaluation query an expert Scryfall search was written in two forms: with the community oracle tags (</w:t>
+      </w:r>
+      <w:r>
+        <w:rPr>
+          <w:rStyle w:val="VerbatimChar"/>
+        </w:rPr>
+        <w:t xml:space="preserve">otag:</w:t>
+      </w:r>
+      <w:r>
+        <w:t xml:space="preserve">) an expert would use today, and without them, from Oracle text and attributes alone. Each was run through Scryfall’s search API (all pages, one request per second) and the result set restricted to the corpus. The cascade’s full ranking was then scored against that set: R-precision (the fraction of the first |S| results that are in S), Jaccard overlap at depth |S|, and the depth needed to see 90% of S.</w:t>
+      </w:r>
+    </w:p>
+    <w:p>
+      <w:pPr>
+        <w:pStyle w:val="BodyText"/>
+      </w:pPr>
+      <w:r>
+        <w:rPr>
+          <w:b/>
+          <w:bCs/>
+        </w:rPr>
+        <w:t xml:space="preserve">Table 9 — Result parity with the expert’s Scryfall result set (n = 26).</w:t>
+      </w:r>
+    </w:p>
+    <w:tbl>
+      <w:tblPr>
+        <w:tblStyle w:val="Table"/>
+        <w:tblW w:type="pct" w:w="5000"/>
+        <w:tblLayout w:type="fixed"/>
+        <w:tblLook w:firstRow="1" w:lastRow="0" w:firstColumn="0" w:lastColumn="0" w:noHBand="0" w:noVBand="0" w:val="0020"/>
+      </w:tblPr>
+      <w:tblGrid>
+        <w:gridCol w:w="1584"/>
+        <w:gridCol w:w="1584"/>
+        <w:gridCol w:w="1584"/>
+        <w:gridCol w:w="1584"/>
+        <w:gridCol w:w="1584"/>
+      </w:tblGrid>
+      <w:tr>
+        <w:trPr>
+          <w:tblHeader w:val="on"/>
+        </w:trPr>
+        <w:tc>
+          <w:tcPr/>
+          <w:p>
+            <w:pPr>
+              <w:pStyle w:val="Compact"/>
+            </w:pPr>
+            <w:r>
+              <w:t xml:space="preserve">Cascade configuration</w:t>
+            </w:r>
+          </w:p>
+        </w:tc>
+        <w:tc>
+          <w:tcPr/>
+          <w:p>
+            <w:pPr>
+              <w:pStyle w:val="Compact"/>
+            </w:pPr>
+            <w:r>
+              <w:t xml:space="preserve">vs expert (tags) R-prec</w:t>
+            </w:r>
+          </w:p>
+        </w:tc>
+        <w:tc>
+          <w:tcPr/>
+          <w:p>
+            <w:pPr>
+              <w:pStyle w:val="Compact"/>
+            </w:pPr>
+            <w:r>
+              <w:t xml:space="preserve">Jaccard</w:t>
+            </w:r>
+          </w:p>
+        </w:tc>
+        <w:tc>
+          <w:tcPr/>
+          <w:p>
+            <w:pPr>
+              <w:pStyle w:val="Compact"/>
+            </w:pPr>
+            <w:r>
+              <w:t xml:space="preserve">Depth to 90%</w:t>
+            </w:r>
+          </w:p>
+        </w:tc>
+        <w:tc>
+          <w:tcPr/>
+          <w:p>
+            <w:pPr>
+              <w:pStyle w:val="Compact"/>
+            </w:pPr>
+            <w:r>
+              <w:t xml:space="preserve">vs expert (no tags) R-prec</w:t>
+            </w:r>
+          </w:p>
+        </w:tc>
+      </w:tr>
+      <w:tr>
+        <w:tc>
+          <w:tcPr/>
+          <w:p>
+            <w:pPr>
+              <w:pStyle w:val="Compact"/>
+            </w:pPr>
+            <w:r>
+              <w:t xml:space="preserve">v1 rewriter, base encoder (control)</w:t>
+            </w:r>
+          </w:p>
+        </w:tc>
+        <w:tc>
+          <w:tcPr/>
+          <w:p>
+            <w:pPr>
+              <w:pStyle w:val="Compact"/>
+            </w:pPr>
+            <w:r>
+              <w:t xml:space="preserve">0.343</w:t>
+            </w:r>
+          </w:p>
+        </w:tc>
+        <w:tc>
+          <w:tcPr/>
+          <w:p>
+            <w:pPr>
+              <w:pStyle w:val="Compact"/>
+            </w:pPr>
+            <w:r>
+              <w:t xml:space="preserve">0.273</w:t>
+            </w:r>
+          </w:p>
+        </w:tc>
+        <w:tc>
+          <w:tcPr/>
+          <w:p>
+            <w:pPr>
+              <w:pStyle w:val="Compact"/>
+            </w:pPr>
+            <w:r>
+              <w:t xml:space="preserve">1.32×</w:t>
+            </w:r>
+          </w:p>
+        </w:tc>
+        <w:tc>
+          <w:tcPr/>
+          <w:p>
+            <w:pPr>
+              <w:pStyle w:val="Compact"/>
+            </w:pPr>
+            <w:r>
+              <w:t xml:space="preserve">0.351</w:t>
+            </w:r>
+          </w:p>
+        </w:tc>
+      </w:tr>
+      <w:tr>
+        <w:tc>
+          <w:tcPr/>
+          <w:p>
+            <w:pPr>
+              <w:pStyle w:val="Compact"/>
+            </w:pPr>
+            <w:r>
+              <w:t xml:space="preserve">v2 rewriter, tuned encoder</w:t>
+            </w:r>
+          </w:p>
+        </w:tc>
+        <w:tc>
+          <w:tcPr/>
+          <w:p>
+            <w:pPr>
+              <w:pStyle w:val="Compact"/>
+            </w:pPr>
+            <w:r>
+              <w:t xml:space="preserve">0.523</w:t>
+            </w:r>
+          </w:p>
+        </w:tc>
+        <w:tc>
+          <w:tcPr/>
+          <w:p>
+            <w:pPr>
+              <w:pStyle w:val="Compact"/>
+            </w:pPr>
+            <w:r>
+              <w:t xml:space="preserve">0.446</w:t>
+            </w:r>
+          </w:p>
+        </w:tc>
+        <w:tc>
+          <w:tcPr/>
+          <w:p>
+            <w:pPr>
+              <w:pStyle w:val="Compact"/>
+            </w:pPr>
+            <w:r>
+              <w:t xml:space="preserve">0.98×</w:t>
+            </w:r>
+          </w:p>
+        </w:tc>
+        <w:tc>
+          <w:tcPr/>
+          <w:p>
+            <w:pPr>
+              <w:pStyle w:val="Compact"/>
+            </w:pPr>
+            <w:r>
+              <w:t xml:space="preserve">0.391</w:t>
+            </w:r>
+          </w:p>
+        </w:tc>
+      </w:tr>
+      <w:tr>
+        <w:tc>
+          <w:tcPr/>
+          <w:p>
+            <w:pPr>
+              <w:pStyle w:val="Compact"/>
+            </w:pPr>
+            <w:r>
+              <w:t xml:space="preserve">v2 rewriter, tuned encoder, keyword filter on</w:t>
+            </w:r>
+          </w:p>
+        </w:tc>
+        <w:tc>
+          <w:tcPr/>
+          <w:p>
+            <w:pPr>
+              <w:pStyle w:val="Compact"/>
+            </w:pPr>
+            <w:r>
+              <w:rPr>
+                <w:b/>
+                <w:bCs/>
+              </w:rPr>
+              <w:t xml:space="preserve">0.565</w:t>
+            </w:r>
+          </w:p>
+        </w:tc>
+        <w:tc>
+          <w:tcPr/>
+          <w:p>
+            <w:pPr>
+              <w:pStyle w:val="Compact"/>
+            </w:pPr>
+            <w:r>
+              <w:rPr>
+                <w:b/>
+                <w:bCs/>
+              </w:rPr>
+              <w:t xml:space="preserve">0.492</w:t>
+            </w:r>
+          </w:p>
+        </w:tc>
+        <w:tc>
+          <w:tcPr/>
+          <w:p>
+            <w:pPr>
+              <w:pStyle w:val="Compact"/>
+            </w:pPr>
+            <w:r>
+              <w:rPr>
+                <w:b/>
+                <w:bCs/>
+              </w:rPr>
+              <w:t xml:space="preserve">0.95×</w:t>
+            </w:r>
+          </w:p>
+        </w:tc>
+        <w:tc>
+          <w:tcPr/>
+          <w:p>
+            <w:pPr>
+              <w:pStyle w:val="Compact"/>
+            </w:pPr>
+            <w:r>
+              <w:t xml:space="preserve">—</w:t>
+            </w:r>
+          </w:p>
+        </w:tc>
+      </w:tr>
+    </w:tbl>
+    <w:p>
+      <w:pPr>
+        <w:pStyle w:val="BodyText"/>
+      </w:pPr>
+      <w:r>
+        <w:t xml:space="preserve">A depth below 1.0× means the user sees 90% of the expert’s set before scrolling past as many cards as the set contains. Per query, the best configuration reaches parity of 0.85 or higher on ten of the 26 queries (instants that cost 1 mana 1.00, haste creatures 1.00, tutor 0.96, cheap blue counterspells 0.95, extra turns 0.94, counterspells 0.92, fetch lands 0.91, instants that draw cards 0.86, red creatures under 3 mana 0.85) and fails on the rewriter’s known knowledge-gap cases. One</w:t>
+      </w:r>
+      <w:r>
+        <w:t xml:space="preserve"> </w:t>
+      </w:r>
+      <w:r>
+        <w:t xml:space="preserve">“failure”</w:t>
+      </w:r>
+      <w:r>
+        <w:t xml:space="preserve"> </w:t>
+      </w:r>
+      <w:r>
+        <w:t xml:space="preserve">is instructive: for</w:t>
+      </w:r>
+      <w:r>
+        <w:t xml:space="preserve"> </w:t>
+      </w:r>
+      <w:r>
+        <w:rPr>
+          <w:i/>
+          <w:iCs/>
+        </w:rPr>
+        <w:t xml:space="preserve">a card that destroys all creatures</w:t>
+      </w:r>
+      <w:r>
+        <w:t xml:space="preserve"> </w:t>
+      </w:r>
+      <w:r>
+        <w:t xml:space="preserve">the expert wrote</w:t>
+      </w:r>
+      <w:r>
+        <w:t xml:space="preserve"> </w:t>
+      </w:r>
+      <w:r>
+        <w:rPr>
+          <w:rStyle w:val="VerbatimChar"/>
+        </w:rPr>
+        <w:t xml:space="preserve">o:"destroy all creatures"</w:t>
+      </w:r>
+      <w:r>
+        <w:t xml:space="preserve"> </w:t>
+      </w:r>
+      <w:r>
+        <w:t xml:space="preserve">(84 cards) while the cascade retrieved the whole sweeper category (870 cards) — broader than the expert, not wrong.</w:t>
+      </w:r>
+    </w:p>
+    <w:p>
+      <w:pPr>
+        <w:pStyle w:val="BodyText"/>
+      </w:pPr>
+      <w:r>
+        <w:t xml:space="preserve">The comparator is itself imperfect. Against the hand-curated judgments, the tagged expert sets have 11% precision and 90% recall; the untagged sets 17% and 72%. This is the annotation-hole effect of Section 5.4 seen from the other side, and it is why parity with the expert set rather than precision against thirty judged archetypes is the number reported.</w:t>
+      </w:r>
+    </w:p>
+    <w:p>
+      <w:pPr>
+        <w:pStyle w:val="BodyText"/>
+      </w:pPr>
+      <w:r>
+        <w:rPr>
+          <w:b/>
+          <w:bCs/>
+        </w:rPr>
+        <w:t xml:space="preserve">Table 10 — What the user had to type (mean over 26 queries).</w:t>
+      </w:r>
+    </w:p>
+    <w:tbl>
+      <w:tblPr>
+        <w:tblStyle w:val="Table"/>
+        <w:tblW w:type="pct" w:w="5000"/>
+        <w:tblLayout w:type="fixed"/>
+        <w:tblLook w:firstRow="1" w:lastRow="0" w:firstColumn="0" w:lastColumn="0" w:noHBand="0" w:noVBand="0" w:val="0020"/>
+      </w:tblPr>
+      <w:tblGrid>
+        <w:gridCol w:w="1980"/>
+        <w:gridCol w:w="1980"/>
+        <w:gridCol w:w="1980"/>
+        <w:gridCol w:w="1980"/>
+      </w:tblGrid>
+      <w:tr>
+        <w:trPr>
+          <w:tblHeader w:val="on"/>
+        </w:trPr>
+        <w:tc>
+          <w:tcPr/>
+          <w:p>
+            <w:pPr>
+              <w:pStyle w:val="Compact"/>
+            </w:pPr>
+          </w:p>
+        </w:tc>
+        <w:tc>
+          <w:tcPr/>
+          <w:p>
+            <w:pPr>
+              <w:pStyle w:val="Compact"/>
+            </w:pPr>
+            <w:r>
+              <w:t xml:space="preserve">Plain language (this work)</w:t>
+            </w:r>
+          </w:p>
+        </w:tc>
+        <w:tc>
+          <w:tcPr/>
+          <w:p>
+            <w:pPr>
+              <w:pStyle w:val="Compact"/>
+            </w:pPr>
+            <w:r>
+              <w:t xml:space="preserve">Scryfall, tags allowed</w:t>
+            </w:r>
+          </w:p>
+        </w:tc>
+        <w:tc>
+          <w:tcPr/>
+          <w:p>
+            <w:pPr>
+              <w:pStyle w:val="Compact"/>
+            </w:pPr>
+            <w:r>
+              <w:t xml:space="preserve">Scryfall, no tags</w:t>
+            </w:r>
+          </w:p>
+        </w:tc>
+      </w:tr>
+      <w:tr>
+        <w:tc>
+          <w:tcPr/>
+          <w:p>
+            <w:pPr>
+              <w:pStyle w:val="Compact"/>
+            </w:pPr>
+            <w:r>
+              <w:t xml:space="preserve">Length</w:t>
+            </w:r>
+          </w:p>
+        </w:tc>
+        <w:tc>
+          <w:tcPr/>
+          <w:p>
+            <w:pPr>
+              <w:pStyle w:val="Compact"/>
+            </w:pPr>
+            <w:r>
+              <w:t xml:space="preserve">3.8 words</w:t>
+            </w:r>
+          </w:p>
+        </w:tc>
+        <w:tc>
+          <w:tcPr/>
+          <w:p>
+            <w:pPr>
+              <w:pStyle w:val="Compact"/>
+            </w:pPr>
+            <w:r>
+              <w:t xml:space="preserve">20 characters</w:t>
+            </w:r>
+          </w:p>
+        </w:tc>
+        <w:tc>
+          <w:tcPr/>
+          <w:p>
+            <w:pPr>
+              <w:pStyle w:val="Compact"/>
+            </w:pPr>
+            <w:r>
+              <w:t xml:space="preserve">59 characters</w:t>
+            </w:r>
+          </w:p>
+        </w:tc>
+      </w:tr>
+      <w:tr>
+        <w:tc>
+          <w:tcPr/>
+          <w:p>
+            <w:pPr>
+              <w:pStyle w:val="Compact"/>
+            </w:pPr>
+            <w:r>
+              <w:t xml:space="preserve">Operators</w:t>
+            </w:r>
+          </w:p>
+        </w:tc>
+        <w:tc>
+          <w:tcPr/>
+          <w:p>
+            <w:pPr>
+              <w:pStyle w:val="Compact"/>
+            </w:pPr>
+            <w:r>
+              <w:t xml:space="preserve">0</w:t>
+            </w:r>
+          </w:p>
+        </w:tc>
+        <w:tc>
+          <w:tcPr/>
+          <w:p>
+            <w:pPr>
+              <w:pStyle w:val="Compact"/>
+            </w:pPr>
+            <w:r>
+              <w:t xml:space="preserve">1.5</w:t>
+            </w:r>
+          </w:p>
+        </w:tc>
+        <w:tc>
+          <w:tcPr/>
+          <w:p>
+            <w:pPr>
+              <w:pStyle w:val="Compact"/>
+            </w:pPr>
+            <w:r>
+              <w:t xml:space="preserve">3.3</w:t>
+            </w:r>
+          </w:p>
+        </w:tc>
+      </w:tr>
+      <w:tr>
+        <w:tc>
+          <w:tcPr/>
+          <w:p>
+            <w:pPr>
+              <w:pStyle w:val="Compact"/>
+            </w:pPr>
+            <w:r>
+              <w:t xml:space="preserve">Requires</w:t>
+            </w:r>
+            <w:r>
+              <w:t xml:space="preserve"> </w:t>
+            </w:r>
+            <w:r>
+              <w:rPr>
+                <w:rStyle w:val="VerbatimChar"/>
+              </w:rPr>
+              <w:t xml:space="preserve">otag:</w:t>
+            </w:r>
+          </w:p>
+        </w:tc>
+        <w:tc>
+          <w:tcPr/>
+          <w:p>
+            <w:pPr>
+              <w:pStyle w:val="Compact"/>
+            </w:pPr>
+            <w:r>
+              <w:t xml:space="preserve">—</w:t>
+            </w:r>
+          </w:p>
+        </w:tc>
+        <w:tc>
+          <w:tcPr/>
+          <w:p>
+            <w:pPr>
+              <w:pStyle w:val="Compact"/>
+            </w:pPr>
+            <w:r>
+              <w:t xml:space="preserve">every jargon query</w:t>
+            </w:r>
+          </w:p>
+        </w:tc>
+        <w:tc>
+          <w:tcPr/>
+          <w:p>
+            <w:pPr>
+              <w:pStyle w:val="Compact"/>
+            </w:pPr>
+            <w:r>
+              <w:t xml:space="preserve">—</w:t>
+            </w:r>
+          </w:p>
+        </w:tc>
+      </w:tr>
+      <w:tr>
+        <w:tc>
+          <w:tcPr/>
+          <w:p>
+            <w:pPr>
+              <w:pStyle w:val="Compact"/>
+            </w:pPr>
+            <w:r>
+              <w:t xml:space="preserve">Boolean grouping or negation</w:t>
+            </w:r>
+          </w:p>
+        </w:tc>
+        <w:tc>
+          <w:tcPr/>
+          <w:p>
+            <w:pPr>
+              <w:pStyle w:val="Compact"/>
+            </w:pPr>
+            <w:r>
+              <w:t xml:space="preserve">0</w:t>
+            </w:r>
+          </w:p>
+        </w:tc>
+        <w:tc>
+          <w:tcPr/>
+          <w:p>
+            <w:pPr>
+              <w:pStyle w:val="Compact"/>
+            </w:pPr>
+            <w:r>
+              <w:t xml:space="preserve">rare</w:t>
+            </w:r>
+          </w:p>
+        </w:tc>
+        <w:tc>
+          <w:tcPr/>
+          <w:p>
+            <w:pPr>
+              <w:pStyle w:val="Compact"/>
+            </w:pPr>
+            <w:r>
+              <w:t xml:space="preserve">common</w:t>
+            </w:r>
+          </w:p>
+        </w:tc>
+      </w:tr>
+    </w:tbl>
+    <w:p>
+      <w:pPr>
+        <w:pStyle w:val="BodyText"/>
+      </w:pPr>
+      <w:r>
+        <w:t xml:space="preserve">The expert path is short only because community tags exist, and using them requires knowing the tag’s exact slug:</w:t>
+      </w:r>
+      <w:r>
+        <w:t xml:space="preserve"> </w:t>
+      </w:r>
+      <w:r>
+        <w:rPr>
+          <w:rStyle w:val="VerbatimChar"/>
+        </w:rPr>
+        <w:t xml:space="preserve">sweeper</w:t>
+      </w:r>
+      <w:r>
+        <w:t xml:space="preserve">, not</w:t>
+      </w:r>
+      <w:r>
+        <w:t xml:space="preserve"> </w:t>
+      </w:r>
+      <w:r>
+        <w:t xml:space="preserve">“board wipe”</w:t>
+      </w:r>
+      <w:r>
+        <w:t xml:space="preserve">;</w:t>
+      </w:r>
+      <w:r>
+        <w:t xml:space="preserve"> </w:t>
+      </w:r>
+      <w:r>
+        <w:rPr>
+          <w:rStyle w:val="VerbatimChar"/>
+        </w:rPr>
+        <w:t xml:space="preserve">counterspell-free</w:t>
+      </w:r>
+      <w:r>
+        <w:t xml:space="preserve">;</w:t>
+      </w:r>
+      <w:r>
+        <w:t xml:space="preserve"> </w:t>
+      </w:r>
+      <w:r>
+        <w:rPr>
+          <w:rStyle w:val="VerbatimChar"/>
+        </w:rPr>
+        <w:t xml:space="preserve">mana-dork</w:t>
+      </w:r>
+      <w:r>
+        <w:t xml:space="preserve">. Without tags the same intent takes three operators, quoted Oracle phrases, and boolean grouping, and still reaches only 72% recall of the judged cards. The cascade takes the 3.8-word query with no syntax and reaches 0.57 R-precision against the tagged expert’s result set. That is the accessibility claim of Section 1.1 with a measurement attached: not that the system beats Scryfall, but that it reaches most of what an expert reaches without the user learning the grammar.</w:t>
+      </w:r>
+    </w:p>
     <w:p>
       <w:pPr>
         <w:pStyle w:val="BodyText"/>
@@ -6930,9 +7645,9 @@
         </w:pict>
       </w:r>
     </w:p>
-    <w:bookmarkEnd w:id="37"/>
     <w:bookmarkEnd w:id="38"/>
-    <w:bookmarkStart w:id="45" w:name="discussion"/>
+    <w:bookmarkEnd w:id="39"/>
+    <w:bookmarkStart w:id="46" w:name="discussion"/>
     <w:p>
       <w:pPr>
         <w:pStyle w:val="Heading2"/>
@@ -6941,7 +7656,7 @@
         <w:t xml:space="preserve">6. Discussion</w:t>
       </w:r>
     </w:p>
-    <w:bookmarkStart w:id="39" w:name="Xce591a7134eaebe21be78c40822d47fa68684e3"/>
+    <w:bookmarkStart w:id="40" w:name="Xce591a7134eaebe21be78c40822d47fa68684e3"/>
     <w:p>
       <w:pPr>
         <w:pStyle w:val="Heading3"/>
@@ -7066,8 +7781,8 @@
         <w:t xml:space="preserve">are semantically equivalent. The reminder-text corpus augmentation partially addresses the corpus side but does not resolve the query-side asymmetry.</w:t>
       </w:r>
     </w:p>
-    <w:bookmarkEnd w:id="39"/>
-    <w:bookmarkStart w:id="40" w:name="the-selective-strictness-design-decision"/>
+    <w:bookmarkEnd w:id="40"/>
+    <w:bookmarkStart w:id="41" w:name="the-selective-strictness-design-decision"/>
     <w:p>
       <w:pPr>
         <w:pStyle w:val="Heading3"/>
@@ -7112,8 +7827,8 @@
         <w:t xml:space="preserve">Selective strictness offers the best tradeoff for this cascade. It preserves the recall benefit of pre-filtering on genuinely-constrained queries while limiting the blast radius of the model’s inference errors. It also requires distinguishing user-explicit from model-inferred in the pipeline, which is a small structural addition to the HyDE output contract.</w:t>
       </w:r>
     </w:p>
-    <w:bookmarkEnd w:id="40"/>
-    <w:bookmarkStart w:id="41" w:name="the-path-toward-fine-tuning"/>
+    <w:bookmarkEnd w:id="41"/>
+    <w:bookmarkStart w:id="42" w:name="the-path-toward-fine-tuning"/>
     <w:p>
       <w:pPr>
         <w:pStyle w:val="Heading3"/>
@@ -7327,8 +8042,8 @@
         <w:t xml:space="preserve">The order of operations is: tag ingestion first (done); the base-embedder control run through the full cascade second, so every fine-tuning claim has a before-number; embedder fine-tuning third; the v2 prompt fourth; HyDE LoRA only if measurements demand it.</w:t>
       </w:r>
     </w:p>
-    <w:bookmarkEnd w:id="41"/>
-    <w:bookmarkStart w:id="42" w:name="Xc99c7a51214e20f050a67b5431e6bbe9542439f"/>
+    <w:bookmarkEnd w:id="42"/>
+    <w:bookmarkStart w:id="43" w:name="Xc99c7a51214e20f050a67b5431e6bbe9542439f"/>
     <w:p>
       <w:pPr>
         <w:pStyle w:val="Heading3"/>
@@ -7403,8 +8118,8 @@
         <w:t xml:space="preserve">or merely memorised a vocabulary list. The accessibility claim (Section 1.1) and the generalisation claim reinforce each other — parity with expert Scryfall on tagged concepts, plus coverage beyond them.</w:t>
       </w:r>
     </w:p>
-    <w:bookmarkEnd w:id="42"/>
-    <w:bookmarkStart w:id="43" w:name="X0a7ec6647493993060fb580e195ef7c4d3d4e81"/>
+    <w:bookmarkEnd w:id="43"/>
+    <w:bookmarkStart w:id="44" w:name="X0a7ec6647493993060fb580e195ef7c4d3d4e81"/>
     <w:p>
       <w:pPr>
         <w:pStyle w:val="Heading3"/>
@@ -7471,8 +8186,8 @@
         <w:t xml:space="preserve">field can be modified in place before being passed to the search orchestrator without any pipeline change. The pattern reinforces the accessibility framing — non-experts get LLM-driven filter proposals, experts can override and refine.</w:t>
       </w:r>
     </w:p>
-    <w:bookmarkEnd w:id="43"/>
-    <w:bookmarkStart w:id="44" w:name="limitations"/>
+    <w:bookmarkEnd w:id="44"/>
+    <w:bookmarkStart w:id="45" w:name="limitations"/>
     <w:p>
       <w:pPr>
         <w:pStyle w:val="Heading3"/>
@@ -7730,9 +8445,9 @@
         </w:pict>
       </w:r>
     </w:p>
-    <w:bookmarkEnd w:id="44"/>
     <w:bookmarkEnd w:id="45"/>
-    <w:bookmarkStart w:id="48" w:name="conclusion-and-future-work"/>
+    <w:bookmarkEnd w:id="46"/>
+    <w:bookmarkStart w:id="49" w:name="conclusion-and-future-work"/>
     <w:p>
       <w:pPr>
         <w:pStyle w:val="Heading2"/>
@@ -7741,7 +8456,7 @@
         <w:t xml:space="preserve">7. Conclusion and Future Work</w:t>
       </w:r>
     </w:p>
-    <w:bookmarkStart w:id="46" w:name="conclusion"/>
+    <w:bookmarkStart w:id="47" w:name="conclusion"/>
     <w:p>
       <w:pPr>
         <w:pStyle w:val="Heading3"/>
@@ -7770,8 +8485,8 @@
         <w:t xml:space="preserve">This work presents a three-stage retrieval cascade for natural-language semantic search over a bounded consumer catalog, using MTG as the test bed. The cascade combines HyDE-style query rewriting, structured SQL pre-filtering, and dense vector search inside the pre-filtered candidate set. Development surfaced concrete failure modes of the base approach — jargon knowledge gaps, over-narrowing on keyword filters, compositional attention drift — most of which are resolved by moving to a larger base model but persist as evidence that domain-specific fine-tuning is the natural next intervention. The methodological framing (outcome comparison against a domain-standard tool rather than diff against an internal baseline) and the accessibility contribution (bringing expert-level search results to non-expert users) are the paper’s core arguments.</w:t>
       </w:r>
     </w:p>
-    <w:bookmarkEnd w:id="46"/>
-    <w:bookmarkStart w:id="47" w:name="future-work"/>
+    <w:bookmarkEnd w:id="47"/>
+    <w:bookmarkStart w:id="48" w:name="future-work"/>
     <w:p>
       <w:pPr>
         <w:pStyle w:val="Heading3"/>
@@ -7917,9 +8632,9 @@
         </w:pict>
       </w:r>
     </w:p>
-    <w:bookmarkEnd w:id="47"/>
     <w:bookmarkEnd w:id="48"/>
-    <w:bookmarkStart w:id="49" w:name="references"/>
+    <w:bookmarkEnd w:id="49"/>
+    <w:bookmarkStart w:id="50" w:name="references"/>
     <w:p>
       <w:pPr>
         <w:pStyle w:val="Heading2"/>
@@ -8224,8 +8939,8 @@
         </w:pict>
       </w:r>
     </w:p>
-    <w:bookmarkEnd w:id="49"/>
-    <w:bookmarkStart w:id="54" w:name="appendices"/>
+    <w:bookmarkEnd w:id="50"/>
+    <w:bookmarkStart w:id="55" w:name="appendices"/>
     <w:p>
       <w:pPr>
         <w:pStyle w:val="Heading2"/>
@@ -8234,7 +8949,7 @@
         <w:t xml:space="preserve">Appendices</w:t>
       </w:r>
     </w:p>
-    <w:bookmarkStart w:id="50" w:name="appendix-a-hyde-prompt-v1"/>
+    <w:bookmarkStart w:id="51" w:name="appendix-a-hyde-prompt-v1"/>
     <w:p>
       <w:pPr>
         <w:pStyle w:val="Heading3"/>
@@ -8284,8 +8999,8 @@
         <w:t xml:space="preserve">verbatim in the appendix. Full system prompt with schema, rules, few-shot examples.]</w:t>
       </w:r>
     </w:p>
-    <w:bookmarkEnd w:id="50"/>
-    <w:bookmarkStart w:id="51" w:name="appendix-b-evaluation-set"/>
+    <w:bookmarkEnd w:id="51"/>
+    <w:bookmarkStart w:id="52" w:name="appendix-b-evaluation-set"/>
     <w:p>
       <w:pPr>
         <w:pStyle w:val="Heading3"/>
@@ -8335,8 +9050,8 @@
         <w:t xml:space="preserve">— the 26 queries with tri-state relevance judgments.]</w:t>
       </w:r>
     </w:p>
-    <w:bookmarkEnd w:id="51"/>
-    <w:bookmarkStart w:id="52" w:name="appendix-c-per-query-results"/>
+    <w:bookmarkEnd w:id="52"/>
+    <w:bookmarkStart w:id="53" w:name="appendix-c-per-query-results"/>
     <w:p>
       <w:pPr>
         <w:pStyle w:val="Heading3"/>
@@ -8357,8 +9072,8 @@
         <w:t xml:space="preserve">[TODO — populated after M5 measurements land. Full recall@10 and MRR per (query, configuration) pair.]</w:t>
       </w:r>
     </w:p>
-    <w:bookmarkEnd w:id="52"/>
-    <w:bookmarkStart w:id="53" w:name="appendix-d-failure-mode-test-series"/>
+    <w:bookmarkEnd w:id="53"/>
+    <w:bookmarkStart w:id="54" w:name="appendix-d-failure-mode-test-series"/>
     <w:p>
       <w:pPr>
         <w:pStyle w:val="Heading3"/>
@@ -8379,9 +9094,9 @@
         <w:t xml:space="preserve">[The 10 diagnostic test queries used to characterize the base HyDE model’s failure modes (Section 5.1), with full HyDE output for each and side-by-side comparison against the larger model (Section 5.2).]</w:t>
       </w:r>
     </w:p>
-    <w:bookmarkEnd w:id="53"/>
     <w:bookmarkEnd w:id="54"/>
     <w:bookmarkEnd w:id="55"/>
+    <w:bookmarkEnd w:id="56"/>
     <w:sectPr>
       <w:footnotePr>
         <w:numRestart w:val="eachSect"/>

</xml_diff>

<commit_message>
feat(eval): query_plus_concepts ablation (null result) + dashboard review observations in journal 5k / paper 6.6
Co-Authored-By: Claude Fable 5.1 <noreply@anthropic.com>
</commit_message>
<xml_diff>
--- a/docs/thesis/paper-draft.docx
+++ b/docs/thesis/paper-draft.docx
@@ -26,7 +26,7 @@
         <w:t xml:space="preserve">Fall 2026 · CSCI 5953 · CSUSB</w:t>
       </w:r>
     </w:p>
-    <w:bookmarkStart w:id="56" w:name="paper-draft-working-document"/>
+    <w:bookmarkStart w:id="57" w:name="paper-draft-working-document"/>
     <w:p>
       <w:pPr>
         <w:pStyle w:val="Heading1"/>
@@ -7647,7 +7647,7 @@
     </w:p>
     <w:bookmarkEnd w:id="38"/>
     <w:bookmarkEnd w:id="39"/>
-    <w:bookmarkStart w:id="46" w:name="discussion"/>
+    <w:bookmarkStart w:id="47" w:name="discussion"/>
     <w:p>
       <w:pPr>
         <w:pStyle w:val="Heading2"/>
@@ -8187,13 +8187,137 @@
       </w:r>
     </w:p>
     <w:bookmarkEnd w:id="44"/>
-    <w:bookmarkStart w:id="45" w:name="limitations"/>
+    <w:bookmarkStart w:id="45" w:name="what-review-of-the-results-shows"/>
     <w:p>
       <w:pPr>
         <w:pStyle w:val="Heading3"/>
       </w:pPr>
       <w:r>
-        <w:t xml:space="preserve">6.6 Limitations</w:t>
+        <w:t xml:space="preserve">6.6 What review of the results shows</w:t>
+      </w:r>
+    </w:p>
+    <w:p>
+      <w:pPr>
+        <w:pStyle w:val="FirstParagraph"/>
+      </w:pPr>
+      <w:r>
+        <w:rPr>
+          <w:i/>
+          <w:iCs/>
+        </w:rPr>
+        <w:t xml:space="preserve">[YOUR PROSE — 2026-09-22, from the dashboard review; lightly edited]</w:t>
+      </w:r>
+    </w:p>
+    <w:p>
+      <w:pPr>
+        <w:pStyle w:val="BodyText"/>
+      </w:pPr>
+      <w:r>
+        <w:t xml:space="preserve">Reviewing results visually surfaced both sides of the system in two searches. For</w:t>
+      </w:r>
+      <w:r>
+        <w:t xml:space="preserve"> </w:t>
+      </w:r>
+      <w:r>
+        <w:rPr>
+          <w:i/>
+          <w:iCs/>
+        </w:rPr>
+        <w:t xml:space="preserve">“destroy all creatures”</w:t>
+      </w:r>
+      <w:r>
+        <w:t xml:space="preserve"> </w:t>
+      </w:r>
+      <w:r>
+        <w:t xml:space="preserve">the rewriter mapped the query to the sweeper category, which is partially correct but broader than what was asked — Scryfall has no narrower tag either;</w:t>
+      </w:r>
+      <w:r>
+        <w:t xml:space="preserve"> </w:t>
+      </w:r>
+      <w:r>
+        <w:rPr>
+          <w:rStyle w:val="VerbatimChar"/>
+        </w:rPr>
+        <w:t xml:space="preserve">boardwipe</w:t>
+      </w:r>
+      <w:r>
+        <w:t xml:space="preserve"> </w:t>
+      </w:r>
+      <w:r>
+        <w:t xml:space="preserve">and its variants are aliases of</w:t>
+      </w:r>
+      <w:r>
+        <w:t xml:space="preserve"> </w:t>
+      </w:r>
+      <w:r>
+        <w:rPr>
+          <w:rStyle w:val="VerbatimChar"/>
+        </w:rPr>
+        <w:t xml:space="preserve">sweeper</w:t>
+      </w:r>
+      <w:r>
+        <w:t xml:space="preserve"> </w:t>
+      </w:r>
+      <w:r>
+        <w:t xml:space="preserve">— and by review the results are far less useful than Scryfall’s literal</w:t>
+      </w:r>
+      <w:r>
+        <w:t xml:space="preserve"> </w:t>
+      </w:r>
+      <w:r>
+        <w:rPr>
+          <w:rStyle w:val="VerbatimChar"/>
+        </w:rPr>
+        <w:t xml:space="preserve">o:"destroy all creatures"</w:t>
+      </w:r>
+      <w:r>
+        <w:t xml:space="preserve">. Attempting to fix this by embedding the user’s words alongside the concept repaired that query and lost equivalent ground elsewhere (Section 5.6: 0.486 vs 0.510 R-precision), so it is reported as an ablation rather than adopted. It is likely that simple attempts to fix individual failures now make overall results worse, and this drives home the point that while the idea is showing merit, there is still a lot of work needed to make it foolproof as a search tool.</w:t>
+      </w:r>
+    </w:p>
+    <w:p>
+      <w:pPr>
+        <w:pStyle w:val="BodyText"/>
+      </w:pPr>
+      <w:r>
+        <w:t xml:space="preserve">In other cases the results are very good, especially on human-syntax searching. A search for</w:t>
+      </w:r>
+      <w:r>
+        <w:t xml:space="preserve"> </w:t>
+      </w:r>
+      <w:r>
+        <w:rPr>
+          <w:i/>
+          <w:iCs/>
+        </w:rPr>
+        <w:t xml:space="preserve">“is a planeswalker”</w:t>
+      </w:r>
+      <w:r>
+        <w:t xml:space="preserve"> </w:t>
+      </w:r>
+      <w:r>
+        <w:t xml:space="preserve">did exactly what one would expect right away and filtered by type; the same search on Scryfall returns nothing — the user would have to use the advanced interface or know to type</w:t>
+      </w:r>
+      <w:r>
+        <w:t xml:space="preserve"> </w:t>
+      </w:r>
+      <w:r>
+        <w:rPr>
+          <w:rStyle w:val="VerbatimChar"/>
+        </w:rPr>
+        <w:t xml:space="preserve">type:planeswalker</w:t>
+      </w:r>
+      <w:r>
+        <w:t xml:space="preserve">. A relatively simple task either way, but one has no prior-knowledge requirement compared to the other.</w:t>
+      </w:r>
+    </w:p>
+    <w:bookmarkEnd w:id="45"/>
+    <w:bookmarkStart w:id="46" w:name="limitations"/>
+    <w:p>
+      <w:pPr>
+        <w:pStyle w:val="Heading3"/>
+      </w:pPr>
+      <w:r>
+        <w:t xml:space="preserve">6.7 Limitations</w:t>
       </w:r>
     </w:p>
     <w:p>
@@ -8445,9 +8569,9 @@
         </w:pict>
       </w:r>
     </w:p>
-    <w:bookmarkEnd w:id="45"/>
     <w:bookmarkEnd w:id="46"/>
-    <w:bookmarkStart w:id="49" w:name="conclusion-and-future-work"/>
+    <w:bookmarkEnd w:id="47"/>
+    <w:bookmarkStart w:id="50" w:name="conclusion-and-future-work"/>
     <w:p>
       <w:pPr>
         <w:pStyle w:val="Heading2"/>
@@ -8456,7 +8580,7 @@
         <w:t xml:space="preserve">7. Conclusion and Future Work</w:t>
       </w:r>
     </w:p>
-    <w:bookmarkStart w:id="47" w:name="conclusion"/>
+    <w:bookmarkStart w:id="48" w:name="conclusion"/>
     <w:p>
       <w:pPr>
         <w:pStyle w:val="Heading3"/>
@@ -8485,8 +8609,8 @@
         <w:t xml:space="preserve">This work presents a three-stage retrieval cascade for natural-language semantic search over a bounded consumer catalog, using MTG as the test bed. The cascade combines HyDE-style query rewriting, structured SQL pre-filtering, and dense vector search inside the pre-filtered candidate set. Development surfaced concrete failure modes of the base approach — jargon knowledge gaps, over-narrowing on keyword filters, compositional attention drift — most of which are resolved by moving to a larger base model but persist as evidence that domain-specific fine-tuning is the natural next intervention. The methodological framing (outcome comparison against a domain-standard tool rather than diff against an internal baseline) and the accessibility contribution (bringing expert-level search results to non-expert users) are the paper’s core arguments.</w:t>
       </w:r>
     </w:p>
-    <w:bookmarkEnd w:id="47"/>
-    <w:bookmarkStart w:id="48" w:name="future-work"/>
+    <w:bookmarkEnd w:id="48"/>
+    <w:bookmarkStart w:id="49" w:name="future-work"/>
     <w:p>
       <w:pPr>
         <w:pStyle w:val="Heading3"/>
@@ -8632,9 +8756,9 @@
         </w:pict>
       </w:r>
     </w:p>
-    <w:bookmarkEnd w:id="48"/>
     <w:bookmarkEnd w:id="49"/>
-    <w:bookmarkStart w:id="50" w:name="references"/>
+    <w:bookmarkEnd w:id="50"/>
+    <w:bookmarkStart w:id="51" w:name="references"/>
     <w:p>
       <w:pPr>
         <w:pStyle w:val="Heading2"/>
@@ -8939,8 +9063,8 @@
         </w:pict>
       </w:r>
     </w:p>
-    <w:bookmarkEnd w:id="50"/>
-    <w:bookmarkStart w:id="55" w:name="appendices"/>
+    <w:bookmarkEnd w:id="51"/>
+    <w:bookmarkStart w:id="56" w:name="appendices"/>
     <w:p>
       <w:pPr>
         <w:pStyle w:val="Heading2"/>
@@ -8949,7 +9073,7 @@
         <w:t xml:space="preserve">Appendices</w:t>
       </w:r>
     </w:p>
-    <w:bookmarkStart w:id="51" w:name="appendix-a-hyde-prompt-v1"/>
+    <w:bookmarkStart w:id="52" w:name="appendix-a-hyde-prompt-v1"/>
     <w:p>
       <w:pPr>
         <w:pStyle w:val="Heading3"/>
@@ -8999,8 +9123,8 @@
         <w:t xml:space="preserve">verbatim in the appendix. Full system prompt with schema, rules, few-shot examples.]</w:t>
       </w:r>
     </w:p>
-    <w:bookmarkEnd w:id="51"/>
-    <w:bookmarkStart w:id="52" w:name="appendix-b-evaluation-set"/>
+    <w:bookmarkEnd w:id="52"/>
+    <w:bookmarkStart w:id="53" w:name="appendix-b-evaluation-set"/>
     <w:p>
       <w:pPr>
         <w:pStyle w:val="Heading3"/>
@@ -9050,8 +9174,8 @@
         <w:t xml:space="preserve">— the 26 queries with tri-state relevance judgments.]</w:t>
       </w:r>
     </w:p>
-    <w:bookmarkEnd w:id="52"/>
-    <w:bookmarkStart w:id="53" w:name="appendix-c-per-query-results"/>
+    <w:bookmarkEnd w:id="53"/>
+    <w:bookmarkStart w:id="54" w:name="appendix-c-per-query-results"/>
     <w:p>
       <w:pPr>
         <w:pStyle w:val="Heading3"/>
@@ -9072,8 +9196,8 @@
         <w:t xml:space="preserve">[TODO — populated after M5 measurements land. Full recall@10 and MRR per (query, configuration) pair.]</w:t>
       </w:r>
     </w:p>
-    <w:bookmarkEnd w:id="53"/>
-    <w:bookmarkStart w:id="54" w:name="appendix-d-failure-mode-test-series"/>
+    <w:bookmarkEnd w:id="54"/>
+    <w:bookmarkStart w:id="55" w:name="appendix-d-failure-mode-test-series"/>
     <w:p>
       <w:pPr>
         <w:pStyle w:val="Heading3"/>
@@ -9094,9 +9218,9 @@
         <w:t xml:space="preserve">[The 10 diagnostic test queries used to characterize the base HyDE model’s failure modes (Section 5.1), with full HyDE output for each and side-by-side comparison against the larger model (Section 5.2).]</w:t>
       </w:r>
     </w:p>
-    <w:bookmarkEnd w:id="54"/>
     <w:bookmarkEnd w:id="55"/>
     <w:bookmarkEnd w:id="56"/>
+    <w:bookmarkEnd w:id="57"/>
     <w:sectPr>
       <w:footnotePr>
         <w:numRestart w:val="eachSect"/>

</xml_diff>

<commit_message>
docs: future fine-tuning directions — intersection anchors, LLM-refined subtags (journal 5l, paper 7.2)
Co-Authored-By: Claude Fable 5.1 <noreply@anthropic.com>
</commit_message>
<xml_diff>
--- a/docs/thesis/paper-draft.docx
+++ b/docs/thesis/paper-draft.docx
@@ -8703,6 +8703,85 @@
       </w:r>
       <w:r>
         <w:t xml:space="preserve">Replacing the query-complexity proxy with measured novice task success and time-to-result against Scryfall.</w:t>
+      </w:r>
+    </w:p>
+    <w:p>
+      <w:pPr>
+        <w:pStyle w:val="Compact"/>
+        <w:numPr>
+          <w:ilvl w:val="0"/>
+          <w:numId w:val="1006"/>
+        </w:numPr>
+      </w:pPr>
+      <w:r>
+        <w:rPr>
+          <w:b/>
+          <w:bCs/>
+        </w:rPr>
+        <w:t xml:space="preserve">Overlap (intersection) training.</w:t>
+      </w:r>
+      <w:r>
+        <w:t xml:space="preserve"> </w:t>
+      </w:r>
+      <w:r>
+        <w:rPr>
+          <w:i/>
+          <w:iCs/>
+        </w:rPr>
+        <w:t xml:space="preserve">[YOUR PROSE]</w:t>
+      </w:r>
+      <w:r>
+        <w:t xml:space="preserve"> </w:t>
+      </w:r>
+      <w:r>
+        <w:t xml:space="preserve">Right now if a query closely matches one tag it embeds to that tag. If a query matches multiple tags, a multiple-tag search resulting in a more specific subset of cards may give better results: anchors built from tag pairs with positives drawn from the intersection would teach the encoder that a two-concept query sits inside the intersection rather than between the two categories. The co-occurrence data already exists in the tag table.</w:t>
+      </w:r>
+    </w:p>
+    <w:p>
+      <w:pPr>
+        <w:pStyle w:val="Compact"/>
+        <w:numPr>
+          <w:ilvl w:val="0"/>
+          <w:numId w:val="1006"/>
+        </w:numPr>
+      </w:pPr>
+      <w:r>
+        <w:rPr>
+          <w:b/>
+          <w:bCs/>
+        </w:rPr>
+        <w:t xml:space="preserve">LLM-refined subtags.</w:t>
+      </w:r>
+      <w:r>
+        <w:t xml:space="preserve"> </w:t>
+      </w:r>
+      <w:r>
+        <w:rPr>
+          <w:i/>
+          <w:iCs/>
+        </w:rPr>
+        <w:t xml:space="preserve">[YOUR PROSE]</w:t>
+      </w:r>
+      <w:r>
+        <w:t xml:space="preserve"> </w:t>
+      </w:r>
+      <w:r>
+        <w:t xml:space="preserve">An LLM could pre-process the tag pool to make it more specific. The community tags are a good starting point for training data, but some are too generic —</w:t>
+      </w:r>
+      <w:r>
+        <w:t xml:space="preserve"> </w:t>
+      </w:r>
+      <w:r>
+        <w:rPr>
+          <w:rStyle w:val="VerbatimChar"/>
+        </w:rPr>
+        <w:t xml:space="preserve">sweeper</w:t>
+      </w:r>
+      <w:r>
+        <w:t xml:space="preserve"> </w:t>
+      </w:r>
+      <w:r>
+        <w:t xml:space="preserve">covers creature wraths, land destruction, and mass bounce alike — and would need subtags to split such categories into more specific subsets. The LLM would evaluate each tag group for possible splitting and build a new training dataset; a cheap form clusters each large pool with the tuned encoder first and has the LLM name the clusters. Refined subtags are not community-validated, so evaluation must stay on the held-out judgments and the Scryfall parity rows.</w:t>
       </w:r>
     </w:p>
     <w:p>

</xml_diff>

<commit_message>
feat(m7): presentation deck build + notes; dashboard demo links; paper numbers corrected from the report
- docs/thesis/presentation/: build_deck.js (pptxgenjs, shape-drawn charts),
  apply_theme.js, deck_data.json (exported from report CSVs), package.json,
  presentation-notes.md (5/10-min timing, demo script, Q&A, rebuild steps);
  .pptx and screenshots gitignored
- scripts/dashboard.py/.html: ?q=&emb=&k= demo links that run on load
- paper 5.7 + journal: complexity / expert-set / >=0.85 figures corrected to the
  26-query values (earlier draft mixed in 21-query numbers)

Co-Authored-By: Claude Fable 5.1 <noreply@anthropic.com>
</commit_message>
<xml_diff>
--- a/docs/thesis/paper-draft.docx
+++ b/docs/thesis/paper-draft.docx
@@ -6930,7 +6930,7 @@
           <w:i/>
           <w:iCs/>
         </w:rPr>
-        <w:t xml:space="preserve">[DRAFTED — REVIEW; journal §5j, rows 72–79. Expert queries in</w:t>
+        <w:t xml:space="preserve">[DRAFTED — REVIEW; journal §5j; numbers from the generated report</w:t>
       </w:r>
       <w:r>
         <w:rPr>
@@ -6945,6 +6945,35 @@
           <w:i/>
           <w:iCs/>
         </w:rPr>
+        <w:t xml:space="preserve">docs/reports/2026-10-03/</w:t>
+      </w:r>
+      <w:r>
+        <w:rPr>
+          <w:i/>
+          <w:iCs/>
+        </w:rPr>
+        <w:t xml:space="preserve"> </w:t>
+      </w:r>
+      <w:r>
+        <w:rPr>
+          <w:i/>
+          <w:iCs/>
+        </w:rPr>
+        <w:t xml:space="preserve">(grid rows 88–101, comparator rows 102–129). Expert queries in</w:t>
+      </w:r>
+      <w:r>
+        <w:rPr>
+          <w:i/>
+          <w:iCs/>
+        </w:rPr>
+        <w:t xml:space="preserve"> </w:t>
+      </w:r>
+      <w:r>
+        <w:rPr>
+          <w:rStyle w:val="VerbatimChar"/>
+          <w:i/>
+          <w:iCs/>
+        </w:rPr>
         <w:t xml:space="preserve">data/eval/scryfall_expert_queries_v1.yaml</w:t>
       </w:r>
       <w:r>
@@ -6959,7 +6988,7 @@
           <w:i/>
           <w:iCs/>
         </w:rPr>
-        <w:t xml:space="preserve">are LLM-drafted and reviewed by the author; result sets fetched 2026-09-22.]</w:t>
+        <w:t xml:space="preserve">are LLM-drafted and reviewed by the author; result sets fetched 2026-09-22. Corrected 2026-10-03: an earlier draft of this section mixed figures from a 21-query run into tables labelled 26 queries.]</w:t>
       </w:r>
     </w:p>
     <w:p>
@@ -7254,7 +7283,7 @@
         <w:pStyle w:val="BodyText"/>
       </w:pPr>
       <w:r>
-        <w:t xml:space="preserve">A depth below 1.0× means the user sees 90% of the expert’s set before scrolling past as many cards as the set contains. Per query, the best configuration reaches parity of 0.85 or higher on ten of the 26 queries (instants that cost 1 mana 1.00, haste creatures 1.00, tutor 0.96, cheap blue counterspells 0.95, extra turns 0.94, counterspells 0.92, fetch lands 0.91, instants that draw cards 0.86, red creatures under 3 mana 0.85) and fails on the rewriter’s known knowledge-gap cases. One</w:t>
+        <w:t xml:space="preserve">A depth below 1.0× means the user sees 90% of the expert’s set before scrolling past as many cards as the set contains. Per query, the best configuration reaches parity of 0.85 or higher on nine of the 26 queries (instants that cost 1 mana 1.00, haste creatures 1.00, tutor 0.96, cheap blue counterspells 0.95, extra turns 0.94, counterspells 0.92, fetch lands 0.91, instants that draw cards 0.86, red creatures under 3 mana 0.85) and fails on the rewriter’s known knowledge-gap cases. One</w:t>
       </w:r>
       <w:r>
         <w:t xml:space="preserve"> </w:t>
@@ -7305,7 +7334,7 @@
         <w:pStyle w:val="BodyText"/>
       </w:pPr>
       <w:r>
-        <w:t xml:space="preserve">The comparator is itself imperfect. Against the hand-curated judgments, the tagged expert sets have 11% precision and 90% recall; the untagged sets 17% and 72%. This is the annotation-hole effect of Section 5.4 seen from the other side, and it is why parity with the expert set rather than precision against thirty judged archetypes is the number reported.</w:t>
+        <w:t xml:space="preserve">The comparator is itself imperfect. Against the hand-curated judgments, the tagged expert sets have 9% precision and 92% recall; the untagged sets 14% and 77%. This is the annotation-hole effect of Section 5.4 seen from the other side, and it is why parity with the expert set rather than precision against thirty judged archetypes is the number reported.</w:t>
       </w:r>
     </w:p>
     <w:p>
@@ -7317,7 +7346,29 @@
           <w:b/>
           <w:bCs/>
         </w:rPr>
-        <w:t xml:space="preserve">Table 10 — What the user had to type (mean over 26 queries).</w:t>
+        <w:t xml:space="preserve">Table 10 — What the user had to type (mean over 26 queries; from</w:t>
+      </w:r>
+      <w:r>
+        <w:rPr>
+          <w:b/>
+          <w:bCs/>
+        </w:rPr>
+        <w:t xml:space="preserve"> </w:t>
+      </w:r>
+      <w:r>
+        <w:rPr>
+          <w:rStyle w:val="VerbatimChar"/>
+          <w:b/>
+          <w:bCs/>
+        </w:rPr>
+        <w:t xml:space="preserve">docs/reports/2026-10-03/tables/06_query_complexity.csv</w:t>
+      </w:r>
+      <w:r>
+        <w:rPr>
+          <w:b/>
+          <w:bCs/>
+        </w:rPr>
+        <w:t xml:space="preserve">).</w:t>
       </w:r>
     </w:p>
     <w:tbl>
@@ -7398,7 +7449,7 @@
               <w:pStyle w:val="Compact"/>
             </w:pPr>
             <w:r>
-              <w:t xml:space="preserve">3.8 words</w:t>
+              <w:t xml:space="preserve">3.7 words</w:t>
             </w:r>
           </w:p>
         </w:tc>
@@ -7420,7 +7471,7 @@
               <w:pStyle w:val="Compact"/>
             </w:pPr>
             <w:r>
-              <w:t xml:space="preserve">59 characters</w:t>
+              <w:t xml:space="preserve">52 characters</w:t>
             </w:r>
           </w:p>
         </w:tc>
@@ -7455,18 +7506,18 @@
               <w:pStyle w:val="Compact"/>
             </w:pPr>
             <w:r>
-              <w:t xml:space="preserve">1.5</w:t>
-            </w:r>
-          </w:p>
-        </w:tc>
-        <w:tc>
-          <w:tcPr/>
-          <w:p>
-            <w:pPr>
-              <w:pStyle w:val="Compact"/>
-            </w:pPr>
-            <w:r>
-              <w:t xml:space="preserve">3.3</w:t>
+              <w:t xml:space="preserve">1.7</w:t>
+            </w:r>
+          </w:p>
+        </w:tc>
+        <w:tc>
+          <w:tcPr/>
+          <w:p>
+            <w:pPr>
+              <w:pStyle w:val="Compact"/>
+            </w:pPr>
+            <w:r>
+              <w:t xml:space="preserve">3.2</w:t>
             </w:r>
           </w:p>
         </w:tc>
@@ -7510,7 +7561,7 @@
               <w:pStyle w:val="Compact"/>
             </w:pPr>
             <w:r>
-              <w:t xml:space="preserve">every jargon query</w:t>
+              <w:t xml:space="preserve">81% of queries</w:t>
             </w:r>
           </w:p>
         </w:tc>
@@ -7623,7 +7674,7 @@
         <w:t xml:space="preserve">mana-dork</w:t>
       </w:r>
       <w:r>
-        <w:t xml:space="preserve">. Without tags the same intent takes three operators, quoted Oracle phrases, and boolean grouping, and still reaches only 72% recall of the judged cards. The cascade takes the 3.8-word query with no syntax and reaches 0.57 R-precision against the tagged expert’s result set. That is the accessibility claim of Section 1.1 with a measurement attached: not that the system beats Scryfall, but that it reaches most of what an expert reaches without the user learning the grammar.</w:t>
+        <w:t xml:space="preserve">. Without tags the same intent takes three operators, quoted Oracle phrases, and boolean grouping, and still reaches only 77% recall of the judged cards. The cascade takes the 3.7-word query with no syntax and reaches 0.57 R-precision against the tagged expert’s result set. That is the accessibility claim of Section 1.1 with a measurement attached: not that the system beats Scryfall, but that it reaches most of what an expert reaches without the user learning the grammar.</w:t>
       </w:r>
     </w:p>
     <w:p>

</xml_diff>